<commit_message>
Formato: margenes 2,5 cm y fuente Arial 12 segun instructivo
- Margenes de pagina uniformados a 2,5 cm (el izquierdo de las paginas
  preliminares estaba en 4,0 cm).
- Se elimina el texto en 11 pt (pasa a 12 pt) y la fuente por defecto pasa de
  Calibri 11 a Arial 12, para mantener Arial 12 en todo el cuerpo.

Co-authored-by: bastiansotopalma-crypto <300303357+bastiansotopalma-crypto@users.noreply.github.com>
</commit_message>
<xml_diff>
--- a/Tesis AVANCE 1 - Rev DJP.docx
+++ b/Tesis AVANCE 1 - Rev DJP.docx
@@ -1500,8 +1500,8 @@
       <w:r>
         <w:rPr>
           <w:rStyle w:val="Refdecomentario"/>
-          <w:sz w:val="22"/>
-          <w:szCs w:val="22"/>
+          <w:sz w:val="24"/>
+          <w:szCs w:val="24"/>
         </w:rPr>
         <w:commentReference w:id="2"/>
       </w:r>
@@ -3443,7 +3443,7 @@
           <w:headerReference w:type="default" r:id="rId15"/>
           <w:footerReference w:type="default" r:id="rId16"/>
           <w:pgSz w:w="12240" w:h="15840" w:code="1"/>
-          <w:pgMar w:top="1418" w:right="1418" w:bottom="1418" w:left="2268" w:header="709" w:footer="709" w:gutter="0"/>
+          <w:pgMar w:top="1418" w:right="1418" w:bottom="1418" w:left="1418" w:header="709" w:footer="709" w:gutter="0"/>
           <w:pgNumType w:fmt="lowerRoman"/>
           <w:cols w:space="708"/>
           <w:docGrid w:linePitch="360"/>
@@ -3527,7 +3527,7 @@
           <w:headerReference w:type="default" r:id="rId17"/>
           <w:footerReference w:type="default" r:id="rId18"/>
           <w:pgSz w:w="12240" w:h="15840" w:code="1"/>
-          <w:pgMar w:top="1418" w:right="1418" w:bottom="1418" w:left="2268" w:header="709" w:footer="709" w:gutter="0"/>
+          <w:pgMar w:top="1418" w:right="1418" w:bottom="1418" w:left="1418" w:header="709" w:footer="709" w:gutter="0"/>
           <w:pgNumType w:fmt="lowerRoman"/>
           <w:cols w:space="708"/>
           <w:docGrid w:linePitch="360"/>
@@ -3858,8 +3858,8 @@
       <w:r>
         <w:rPr>
           <w:rStyle w:val="Refdecomentario"/>
-          <w:sz w:val="22"/>
-          <w:szCs w:val="22"/>
+          <w:sz w:val="24"/>
+          <w:szCs w:val="24"/>
         </w:rPr>
         <w:commentReference w:id="11"/>
       </w:r>
@@ -3897,7 +3897,7 @@
           <w:rStyle w:val="Refdecomentario"/>
           <w:rFonts w:ascii="Arial" w:eastAsia="Arial" w:hAnsi="Arial"/>
           <w:sz w:val="24"/>
-          <w:szCs w:val="22"/>
+          <w:szCs w:val="24"/>
         </w:rPr>
         <w:commentReference w:id="12"/>
       </w:r>
@@ -4785,8 +4785,8 @@
       <w:r>
         <w:rPr>
           <w:rStyle w:val="Refdecomentario"/>
-          <w:sz w:val="22"/>
-          <w:szCs w:val="22"/>
+          <w:sz w:val="24"/>
+          <w:szCs w:val="24"/>
         </w:rPr>
         <w:commentReference w:id="21"/>
       </w:r>
@@ -4822,7 +4822,7 @@
           <w:rStyle w:val="Refdecomentario"/>
           <w:rFonts w:ascii="Arial" w:eastAsia="Arial" w:hAnsi="Arial"/>
           <w:sz w:val="24"/>
-          <w:szCs w:val="22"/>
+          <w:szCs w:val="24"/>
         </w:rPr>
         <w:commentReference w:id="24"/>
       </w:r>
@@ -5189,7 +5189,7 @@
           <w:rStyle w:val="Refdecomentario"/>
           <w:rFonts w:ascii="Arial" w:eastAsia="Arial" w:hAnsi="Arial"/>
           <w:sz w:val="24"/>
-          <w:szCs w:val="22"/>
+          <w:szCs w:val="24"/>
         </w:rPr>
         <w:commentReference w:id="27"/>
       </w:r>
@@ -5242,7 +5242,7 @@
           <w:rStyle w:val="Refdecomentario"/>
           <w:rFonts w:ascii="Arial" w:eastAsia="Arial" w:hAnsi="Arial"/>
           <w:sz w:val="24"/>
-          <w:szCs w:val="22"/>
+          <w:szCs w:val="24"/>
         </w:rPr>
         <w:commentReference w:id="28"/>
       </w:r>
@@ -5267,7 +5267,7 @@
           <w:rStyle w:val="Refdecomentario"/>
           <w:rFonts w:ascii="Arial" w:eastAsia="Arial" w:hAnsi="Arial"/>
           <w:sz w:val="24"/>
-          <w:szCs w:val="22"/>
+          <w:szCs w:val="24"/>
         </w:rPr>
         <w:commentReference w:id="29"/>
       </w:r>
@@ -6988,8 +6988,8 @@
       <w:r>
         <w:rPr>
           <w:rStyle w:val="Refdecomentario"/>
-          <w:sz w:val="22"/>
-          <w:szCs w:val="22"/>
+          <w:sz w:val="24"/>
+          <w:szCs w:val="24"/>
         </w:rPr>
         <w:commentReference w:id="42"/>
       </w:r>
@@ -7032,7 +7032,7 @@
           <w:rStyle w:val="Refdecomentario"/>
           <w:rFonts w:ascii="Arial" w:eastAsia="Arial" w:hAnsi="Arial"/>
           <w:sz w:val="24"/>
-          <w:szCs w:val="22"/>
+          <w:szCs w:val="24"/>
         </w:rPr>
         <w:commentReference w:id="45"/>
       </w:r>
@@ -7175,8 +7175,8 @@
       <w:r>
         <w:rPr>
           <w:rStyle w:val="Refdecomentario"/>
-          <w:sz w:val="22"/>
-          <w:szCs w:val="22"/>
+          <w:sz w:val="24"/>
+          <w:szCs w:val="24"/>
         </w:rPr>
         <w:commentReference w:id="46"/>
       </w:r>
@@ -7314,7 +7314,7 @@
           <w:rStyle w:val="Refdecomentario"/>
           <w:rFonts w:ascii="Arial" w:eastAsia="Arial" w:hAnsi="Arial"/>
           <w:sz w:val="24"/>
-          <w:szCs w:val="22"/>
+          <w:szCs w:val="24"/>
         </w:rPr>
         <w:commentReference w:id="49"/>
       </w:r>
@@ -7364,8 +7364,8 @@
       <w:r>
         <w:rPr>
           <w:rStyle w:val="Refdecomentario"/>
-          <w:sz w:val="22"/>
-          <w:szCs w:val="22"/>
+          <w:sz w:val="24"/>
+          <w:szCs w:val="24"/>
         </w:rPr>
         <w:commentReference w:id="50"/>
       </w:r>
@@ -10653,9 +10653,9 @@
   <w:docDefaults>
     <w:rPrDefault>
       <w:rPr>
-        <w:rFonts w:asciiTheme="minorHAnsi" w:eastAsiaTheme="minorHAnsi" w:hAnsiTheme="minorHAnsi" w:cstheme="minorBidi"/>
-        <w:sz w:val="22"/>
-        <w:szCs w:val="22"/>
+        <w:rFonts w:ascii="Arial" w:eastAsia="Arial" w:hAnsi="Arial" w:cs="Arial"/>
+        <w:sz w:val="24"/>
+        <w:szCs w:val="24"/>
         <w:lang w:val="es-CL" w:eastAsia="en-US" w:bidi="ar-SA"/>
       </w:rPr>
     </w:rPrDefault>

</xml_diff>

<commit_message>
Cap I: reorganiza el marco teorico (macro->micro) y ajusta pregunta/objetivos
- Reordena el Capitulo I segun la sugerencia del profesor: APS/CESFAM ->
  Programa Cardiovascular -> Atencion Farmaceutica -> Rol del QF -> AF
  domiciliaria -> Adherencia/polifarmacia/PRM-RNM -> Metodos de seguimiento ->
  Modelo CMO -> Aplicacion del CMO en el CESFAM -> Justificacion y problematica
  -> Delimitacion -> Pregunta -> Objetivos. Termina en la problematica.
- Mueve el contenido del 'valor de la visita domiciliaria' desde Metodologia
  (2.3) al marco teorico (1.5), por ser justificacion y no metodo.
- Pregunta de investigacion: queda como una sola pregunta (formato PICO
  implicito), sin el desglose en vinetas.
- Objetivo 1: 'Diagnosticar' -> 'Identificar'. Se mantiene el objetivo general
  de Diseno del protocolo.
- Mejora la redaccion del test de Batalla (y corrige 'enfermedadu') y ordena el
  parrafo de instrumentos que estaba informal.
- Conserva la redaccion original del autor.
</commit_message>
<xml_diff>
--- a/Tesis AVANCE 1 - Rev DJP.docx
+++ b/Tesis AVANCE 1 - Rev DJP.docx
@@ -3571,599 +3571,38 @@
     <w:p>
       <w:pPr>
         <w:pStyle w:val="Ttulo2"/>
-        <w:numPr>
-          <w:ilvl w:val="1"/>
-          <w:numId w:val="8"/>
-        </w:numPr>
-      </w:pPr>
-      <w:bookmarkStart w:id="7" w:name="_Toc234430354"/>
-      <w:bookmarkStart w:id="8" w:name="_Toc234959464"/>
-      <w:r>
-        <w:t xml:space="preserve">Objeto de la </w:t>
-      </w:r>
-      <w:r>
-        <w:t>I</w:t>
-      </w:r>
-      <w:r>
-        <w:t>nvestigación</w:t>
-      </w:r>
-      <w:bookmarkEnd w:id="7"/>
-      <w:bookmarkEnd w:id="8"/>
-    </w:p>
-    <w:p>
-      <w:pPr>
-        <w:spacing w:after="120" w:line="360" w:lineRule="auto"/>
-        <w:jc w:val="both"/>
-      </w:pPr>
-      <w:commentRangeStart w:id="9"/>
-      <w:r>
-        <w:rPr>
-          <w:rFonts w:ascii="Arial" w:eastAsia="Arial" w:hAnsi="Arial"/>
-          <w:sz w:val="24"/>
-          <w:szCs w:val="24"/>
-        </w:rPr>
-        <w:t xml:space="preserve">Este trabajo nace del internado </w:t>
-      </w:r>
-      <w:commentRangeEnd w:id="9"/>
-      <w:r>
-        <w:rPr>
-          <w:rStyle w:val="Refdecomentario"/>
-          <w:rFonts w:ascii="Arial" w:eastAsia="Arial" w:hAnsi="Arial"/>
-          <w:sz w:val="24"/>
-          <w:szCs w:val="24"/>
-        </w:rPr>
-        <w:commentReference w:id="9"/>
-      </w:r>
-      <w:r>
-        <w:rPr>
-          <w:rFonts w:ascii="Arial" w:eastAsia="Arial" w:hAnsi="Arial"/>
-          <w:sz w:val="24"/>
-          <w:szCs w:val="24"/>
-        </w:rPr>
-        <w:t xml:space="preserve">en el Centro de Salud Familiar (CESFAM) Villa Nonguén, un establecimiento de la Atención Primaria de Salud (APS) ubicado en el sector de Nonguén, en la periferia oriente de la comuna de Concepción, Región del Biobío. Forma parte de la red del Servicio de Salud Concepción y funciona bajo la modalidad de administración delegada a cargo de la Corporación de Salud y Desarrollo Social (COSADES), tras haber sido uno de los centros pioneros en la implementación del Modelo de Salud Familiar en el país (Diario Concepción, 2017; COSADES, s.f.). Atiende a una población inscrita cercana a las 16.760 personas, organizada en torno a unas 5.560 familias y distribuida en cuatro sectores, y entrega prestaciones a todos los grupos del ciclo vital. Su unidad de farmacia funciona con dos químicos farmacéuticos, uno a cargo de la dirección técnica y otro dedicado a la </w:t>
-      </w:r>
-      <w:r>
-        <w:rPr>
-          <w:rFonts w:ascii="Arial" w:eastAsia="Arial" w:hAnsi="Arial"/>
-          <w:sz w:val="24"/>
-          <w:szCs w:val="24"/>
-        </w:rPr>
-        <w:t>Atención Farmacéutica</w:t>
-      </w:r>
-      <w:r>
-        <w:rPr>
-          <w:rFonts w:ascii="Arial" w:eastAsia="Arial" w:hAnsi="Arial"/>
-          <w:sz w:val="24"/>
-          <w:szCs w:val="24"/>
-        </w:rPr>
-        <w:t xml:space="preserve">, y con un equipo permanente de cuatro técnicos en enfermería de nivel superior. Dentro del Programa de Salud Cardiovascular, el </w:t>
-      </w:r>
-      <w:r>
-        <w:rPr>
-          <w:rFonts w:ascii="Arial" w:eastAsia="Arial" w:hAnsi="Arial"/>
-          <w:sz w:val="24"/>
-          <w:szCs w:val="24"/>
-        </w:rPr>
-        <w:t>Químico Farmacéutico</w:t>
-      </w:r>
-      <w:r>
-        <w:rPr>
-          <w:rFonts w:ascii="Arial" w:eastAsia="Arial" w:hAnsi="Arial"/>
-          <w:sz w:val="24"/>
-          <w:szCs w:val="24"/>
-        </w:rPr>
-        <w:t xml:space="preserve"> ya participa en la atención de los usuarios, tanto en box como en visitas domiciliarias, y realiza tareas de seguimiento, educación y revisión de la medicación. El problema </w:t>
-      </w:r>
-      <w:r>
-        <w:rPr>
-          <w:rFonts w:ascii="Arial" w:eastAsia="Arial" w:hAnsi="Arial"/>
-          <w:sz w:val="24"/>
-          <w:szCs w:val="24"/>
-        </w:rPr>
-        <w:t xml:space="preserve">detectado </w:t>
-      </w:r>
-      <w:r>
-        <w:rPr>
-          <w:rFonts w:ascii="Arial" w:eastAsia="Arial" w:hAnsi="Arial"/>
-          <w:sz w:val="24"/>
-          <w:szCs w:val="24"/>
-        </w:rPr>
-        <w:t xml:space="preserve">es que esas visitas se llevan a cabo sin un procedimiento escrito y estandarizado que las respalde. </w:t>
-      </w:r>
-      <w:r>
-        <w:rPr>
-          <w:rFonts w:ascii="Arial" w:eastAsia="Arial" w:hAnsi="Arial"/>
-          <w:sz w:val="24"/>
-          <w:szCs w:val="24"/>
-        </w:rPr>
-        <w:t>Actualmente</w:t>
-      </w:r>
-      <w:r>
-        <w:rPr>
-          <w:rFonts w:ascii="Arial" w:eastAsia="Arial" w:hAnsi="Arial"/>
-          <w:sz w:val="24"/>
-          <w:szCs w:val="24"/>
-        </w:rPr>
-        <w:t xml:space="preserve"> la atención ingresa por derivación y se prioriza a los pacientes más descompensados, y el </w:t>
-      </w:r>
-      <w:r>
-        <w:rPr>
-          <w:rFonts w:ascii="Arial" w:eastAsia="Arial" w:hAnsi="Arial"/>
-          <w:sz w:val="24"/>
-          <w:szCs w:val="24"/>
-        </w:rPr>
-        <w:t>Químico Farmacéutico</w:t>
-      </w:r>
-      <w:r>
-        <w:rPr>
-          <w:rFonts w:ascii="Arial" w:eastAsia="Arial" w:hAnsi="Arial"/>
-          <w:sz w:val="24"/>
-          <w:szCs w:val="24"/>
-        </w:rPr>
-        <w:t xml:space="preserve">, que cuenta con la formación necesaria para conducir la entrevista, deja constancia de lo realizado en la ficha clínica y en hojas de apoyo. </w:t>
-      </w:r>
-      <w:commentRangeStart w:id="10"/>
-      <w:r>
-        <w:rPr>
-          <w:rFonts w:ascii="Arial" w:eastAsia="Arial" w:hAnsi="Arial"/>
-          <w:sz w:val="24"/>
-          <w:szCs w:val="24"/>
-        </w:rPr>
-        <w:t>Debemos considerar</w:t>
-      </w:r>
-      <w:r>
-        <w:rPr>
-          <w:rFonts w:ascii="Arial" w:eastAsia="Arial" w:hAnsi="Arial"/>
-          <w:sz w:val="24"/>
-          <w:szCs w:val="24"/>
-        </w:rPr>
-        <w:t xml:space="preserve"> qu</w:t>
-      </w:r>
-      <w:r>
-        <w:rPr>
-          <w:rFonts w:ascii="Arial" w:eastAsia="Arial" w:hAnsi="Arial"/>
-          <w:sz w:val="24"/>
-          <w:szCs w:val="24"/>
-        </w:rPr>
-        <w:t>é, lo que</w:t>
-      </w:r>
-      <w:r>
-        <w:rPr>
-          <w:rFonts w:ascii="Arial" w:eastAsia="Arial" w:hAnsi="Arial"/>
-          <w:sz w:val="24"/>
-          <w:szCs w:val="24"/>
-        </w:rPr>
-        <w:t xml:space="preserve"> falta</w:t>
-      </w:r>
-      <w:r>
-        <w:rPr>
-          <w:rFonts w:ascii="Arial" w:eastAsia="Arial" w:hAnsi="Arial"/>
-          <w:sz w:val="24"/>
-          <w:szCs w:val="24"/>
-        </w:rPr>
-        <w:t>,</w:t>
-      </w:r>
-      <w:r>
-        <w:rPr>
-          <w:rFonts w:ascii="Arial" w:eastAsia="Arial" w:hAnsi="Arial"/>
-          <w:sz w:val="24"/>
-          <w:szCs w:val="24"/>
-        </w:rPr>
-        <w:t xml:space="preserve"> no es el criterio ni el registro, sino un documento común que ordene la priorización de los pacientes, la forma de conducir la visita y el registro de la atención, de modo que el trabajo sea trazable, comparable entre profesionales y posible de evaluar en el tiempo</w:t>
-      </w:r>
-      <w:commentRangeEnd w:id="10"/>
-      <w:r>
-        <w:rPr>
-          <w:rStyle w:val="Refdecomentario"/>
-          <w:rFonts w:ascii="Arial" w:eastAsia="Arial" w:hAnsi="Arial"/>
-          <w:sz w:val="24"/>
-          <w:szCs w:val="24"/>
-        </w:rPr>
-        <w:commentReference w:id="10"/>
-      </w:r>
-      <w:r>
-        <w:rPr>
-          <w:rFonts w:ascii="Arial" w:eastAsia="Arial" w:hAnsi="Arial"/>
-          <w:sz w:val="24"/>
-          <w:szCs w:val="24"/>
-        </w:rPr>
-        <w:t>.</w:t>
-      </w:r>
-    </w:p>
-    <w:p>
-      <w:pPr>
-        <w:spacing w:after="120" w:line="360" w:lineRule="auto"/>
-        <w:jc w:val="both"/>
-      </w:pPr>
-      <w:r>
-        <w:rPr>
-          <w:rFonts w:ascii="Arial" w:eastAsia="Arial" w:hAnsi="Arial"/>
-          <w:sz w:val="24"/>
-        </w:rPr>
-        <w:t xml:space="preserve">La magnitud de esa necesidad había quedado documentada en el mismo centro. Una memoria anterior, que evaluó el programa de </w:t>
-      </w:r>
-      <w:r>
-        <w:rPr>
-          <w:rFonts w:ascii="Arial" w:eastAsia="Arial" w:hAnsi="Arial"/>
-          <w:sz w:val="24"/>
-        </w:rPr>
-        <w:t>Atención Farmacéutica</w:t>
-      </w:r>
-      <w:r>
-        <w:rPr>
-          <w:rFonts w:ascii="Arial" w:eastAsia="Arial" w:hAnsi="Arial"/>
-          <w:sz w:val="24"/>
-        </w:rPr>
-        <w:t xml:space="preserve"> siguiendo a veinte usuarios, encontró que todos tenían al menos un problema relacionado con sus medicamentos y que solo el 15% era adherente al inicio del seguimiento, cifra que mejoró </w:t>
-      </w:r>
-      <w:r>
-        <w:rPr>
-          <w:rFonts w:ascii="Arial" w:eastAsia="Arial" w:hAnsi="Arial"/>
-          <w:sz w:val="24"/>
-        </w:rPr>
-        <w:lastRenderedPageBreak/>
-        <w:t xml:space="preserve">de manera importante tras la intervención del farmacéutico (Faúndez Navarrete, 2020). Ese resultado deja ver dos cosas: que el trabajo farmacéutico en terreno sí influye en los pacientes y que hasta ahora se ha hecho de una forma valiosa, pero poco sistematizada. </w:t>
-      </w:r>
-      <w:commentRangeStart w:id="11"/>
-      <w:r>
-        <w:rPr>
-          <w:rFonts w:ascii="Arial" w:eastAsia="Arial" w:hAnsi="Arial"/>
-          <w:sz w:val="24"/>
-        </w:rPr>
-        <w:t>De</w:t>
-      </w:r>
-      <w:r>
-        <w:rPr>
-          <w:rFonts w:ascii="Arial" w:eastAsia="Arial" w:hAnsi="Arial"/>
-          <w:sz w:val="24"/>
-        </w:rPr>
-        <w:t xml:space="preserve"> lo antes expuesto,</w:t>
-      </w:r>
-      <w:r>
-        <w:rPr>
-          <w:rFonts w:ascii="Arial" w:eastAsia="Arial" w:hAnsi="Arial"/>
-          <w:sz w:val="24"/>
-        </w:rPr>
-        <w:t xml:space="preserve"> surge la idea de esta memoria, </w:t>
-      </w:r>
-      <w:r>
-        <w:rPr>
-          <w:rFonts w:ascii="Arial" w:eastAsia="Arial" w:hAnsi="Arial"/>
-          <w:sz w:val="24"/>
-        </w:rPr>
-        <w:t>cuyo objetivo</w:t>
-      </w:r>
-      <w:r>
-        <w:rPr>
-          <w:rFonts w:ascii="Arial" w:eastAsia="Arial" w:hAnsi="Arial"/>
-          <w:sz w:val="24"/>
-        </w:rPr>
-        <w:t xml:space="preserve"> es ordenar </w:t>
-      </w:r>
-      <w:r>
-        <w:rPr>
-          <w:rFonts w:ascii="Arial" w:eastAsia="Arial" w:hAnsi="Arial"/>
-          <w:sz w:val="24"/>
-        </w:rPr>
-        <w:t>la</w:t>
-      </w:r>
-      <w:r>
-        <w:rPr>
-          <w:rFonts w:ascii="Arial" w:eastAsia="Arial" w:hAnsi="Arial"/>
-          <w:sz w:val="24"/>
-        </w:rPr>
-        <w:t xml:space="preserve"> labor en un protocolo que pueda repetirse y evaluarse.</w:t>
-      </w:r>
-      <w:commentRangeEnd w:id="11"/>
-      <w:r>
-        <w:rPr>
-          <w:rStyle w:val="Refdecomentario"/>
-          <w:sz w:val="24"/>
-          <w:szCs w:val="24"/>
-        </w:rPr>
-        <w:commentReference w:id="11"/>
-      </w:r>
-    </w:p>
-    <w:p>
-      <w:pPr>
-        <w:spacing w:after="120" w:line="360" w:lineRule="auto"/>
-        <w:jc w:val="both"/>
-      </w:pPr>
-      <w:commentRangeStart w:id="12"/>
-      <w:r>
-        <w:rPr>
-          <w:rFonts w:ascii="Arial" w:eastAsia="Arial" w:hAnsi="Arial"/>
-          <w:sz w:val="24"/>
-        </w:rPr>
-        <w:t xml:space="preserve">La </w:t>
-      </w:r>
-      <w:r>
-        <w:rPr>
-          <w:rFonts w:ascii="Arial" w:eastAsia="Arial" w:hAnsi="Arial"/>
-          <w:sz w:val="24"/>
-        </w:rPr>
-        <w:t>Atención Farmacéutica</w:t>
-      </w:r>
-      <w:r>
-        <w:rPr>
-          <w:rFonts w:ascii="Arial" w:eastAsia="Arial" w:hAnsi="Arial"/>
-          <w:sz w:val="24"/>
-        </w:rPr>
-        <w:t xml:space="preserve"> </w:t>
-      </w:r>
-      <w:commentRangeEnd w:id="12"/>
-      <w:r>
-        <w:rPr>
-          <w:rStyle w:val="Refdecomentario"/>
-          <w:rFonts w:ascii="Arial" w:eastAsia="Arial" w:hAnsi="Arial"/>
-          <w:sz w:val="24"/>
-          <w:szCs w:val="24"/>
-        </w:rPr>
-        <w:commentReference w:id="12"/>
-      </w:r>
-      <w:r>
-        <w:rPr>
-          <w:rFonts w:ascii="Arial" w:eastAsia="Arial" w:hAnsi="Arial"/>
-          <w:sz w:val="24"/>
-        </w:rPr>
-        <w:t>se entiende hoy</w:t>
-      </w:r>
-      <w:r>
-        <w:rPr>
-          <w:rFonts w:ascii="Arial" w:eastAsia="Arial" w:hAnsi="Arial"/>
-          <w:sz w:val="24"/>
-        </w:rPr>
-        <w:t>,</w:t>
-      </w:r>
-      <w:r>
-        <w:rPr>
-          <w:rFonts w:ascii="Arial" w:eastAsia="Arial" w:hAnsi="Arial"/>
-          <w:sz w:val="24"/>
-        </w:rPr>
-        <w:t xml:space="preserve"> como la participación del farmacéutico en el cuidado de la persona para aprovechar mejor sus medicamentos y mejorar sus resultados en salud. Bonal y colaboradores la describen como el proceso por el cual el farmacéutico coopera con el paciente y con el resto del equipo en el diseño, la ejecución y el seguimiento de un plan terapéutico orientado a metas concretas (Bonal et al., 2003). Esto supone un cambio respecto del modelo clásico, centrado en entregar el medicamento, hacia otro que se preocupa de lo que ocurre con ese medicamento una vez que el paciente lo lleva a su casa.</w:t>
-      </w:r>
-    </w:p>
-    <w:p>
-      <w:pPr>
-        <w:spacing w:after="120" w:line="360" w:lineRule="auto"/>
-        <w:jc w:val="both"/>
-      </w:pPr>
-      <w:r>
-        <w:rPr>
-          <w:rFonts w:ascii="Arial" w:eastAsia="Arial" w:hAnsi="Arial"/>
-          <w:sz w:val="24"/>
-        </w:rPr>
-        <w:t xml:space="preserve">En la Atención Primaria </w:t>
-      </w:r>
-      <w:r>
-        <w:rPr>
-          <w:rFonts w:ascii="Arial" w:eastAsia="Arial" w:hAnsi="Arial"/>
-          <w:sz w:val="24"/>
-        </w:rPr>
-        <w:t>C</w:t>
-      </w:r>
-      <w:r>
-        <w:rPr>
-          <w:rFonts w:ascii="Arial" w:eastAsia="Arial" w:hAnsi="Arial"/>
-          <w:sz w:val="24"/>
-        </w:rPr>
-        <w:t xml:space="preserve">hilena la incorporación del </w:t>
-      </w:r>
-      <w:r>
-        <w:rPr>
-          <w:rFonts w:ascii="Arial" w:eastAsia="Arial" w:hAnsi="Arial"/>
-          <w:sz w:val="24"/>
-        </w:rPr>
-        <w:t>Químico Farmacéutico</w:t>
-      </w:r>
-      <w:r>
-        <w:rPr>
-          <w:rFonts w:ascii="Arial" w:eastAsia="Arial" w:hAnsi="Arial"/>
-          <w:sz w:val="24"/>
-        </w:rPr>
-        <w:t xml:space="preserve"> a los </w:t>
-      </w:r>
-      <w:r>
-        <w:rPr>
-          <w:rFonts w:ascii="Arial" w:eastAsia="Arial" w:hAnsi="Arial"/>
-          <w:sz w:val="24"/>
-        </w:rPr>
-        <w:t>equipos</w:t>
-      </w:r>
-      <w:r>
-        <w:rPr>
-          <w:rFonts w:ascii="Arial" w:eastAsia="Arial" w:hAnsi="Arial"/>
-          <w:sz w:val="24"/>
-        </w:rPr>
-        <w:t xml:space="preserve"> ha sido un avance, pero todavía</w:t>
-      </w:r>
-      <w:r>
-        <w:rPr>
-          <w:rFonts w:ascii="Arial" w:eastAsia="Arial" w:hAnsi="Arial"/>
-          <w:sz w:val="24"/>
-        </w:rPr>
-        <w:t>,</w:t>
-      </w:r>
-      <w:r>
-        <w:rPr>
-          <w:rFonts w:ascii="Arial" w:eastAsia="Arial" w:hAnsi="Arial"/>
-          <w:sz w:val="24"/>
-        </w:rPr>
-        <w:t xml:space="preserve"> falta un método claro y compartido para guiar y evaluar su trabajo clínico en el domicilio. Sin ese método, cada profesional organiza la visita </w:t>
-      </w:r>
-      <w:r>
-        <w:rPr>
-          <w:rFonts w:ascii="Arial" w:eastAsia="Arial" w:hAnsi="Arial"/>
-          <w:sz w:val="24"/>
-        </w:rPr>
-        <w:t>de acuerdo con su criterio</w:t>
-      </w:r>
-      <w:r>
-        <w:rPr>
-          <w:rFonts w:ascii="Arial" w:eastAsia="Arial" w:hAnsi="Arial"/>
-          <w:sz w:val="24"/>
-        </w:rPr>
-        <w:t xml:space="preserve">, los resultados se vuelven difíciles de comparar y el aporte del farmacéutico queda poco visible para el resto del equipo. La dificultad es mayor en los pacientes que toman muchos medicamentos, tienen problemas sociales o presentan condiciones propias de la edad, en quienes la adherencia es más frágil (Manzano García &amp; Morillo Verdugo, 2018). </w:t>
-      </w:r>
-      <w:r>
-        <w:rPr>
-          <w:rFonts w:ascii="Arial" w:eastAsia="Arial" w:hAnsi="Arial"/>
-          <w:sz w:val="24"/>
-        </w:rPr>
-        <w:t>Además,</w:t>
-      </w:r>
-      <w:r>
-        <w:rPr>
-          <w:rFonts w:ascii="Arial" w:eastAsia="Arial" w:hAnsi="Arial"/>
-          <w:sz w:val="24"/>
-        </w:rPr>
-        <w:t xml:space="preserve"> la visita a domicilio consume bastante tiempo, </w:t>
-      </w:r>
-      <w:r>
-        <w:rPr>
-          <w:rFonts w:ascii="Arial" w:eastAsia="Arial" w:hAnsi="Arial"/>
-          <w:sz w:val="24"/>
-        </w:rPr>
-        <w:t xml:space="preserve">por lo que, </w:t>
-      </w:r>
-      <w:r>
-        <w:rPr>
-          <w:rFonts w:ascii="Arial" w:eastAsia="Arial" w:hAnsi="Arial"/>
-          <w:sz w:val="24"/>
-        </w:rPr>
-        <w:t xml:space="preserve">conviene aprovechar bien cada instancia. </w:t>
-      </w:r>
-      <w:r>
-        <w:rPr>
-          <w:rFonts w:ascii="Arial" w:eastAsia="Arial" w:hAnsi="Arial"/>
-          <w:sz w:val="24"/>
-        </w:rPr>
-        <w:t>Dado lo anterior,</w:t>
-      </w:r>
-      <w:r>
-        <w:rPr>
-          <w:rFonts w:ascii="Arial" w:eastAsia="Arial" w:hAnsi="Arial"/>
-          <w:sz w:val="24"/>
-        </w:rPr>
-        <w:t xml:space="preserve"> este trabajo propone un protocolo que estructure la entrevista, ayude a detectar a tiempo los problemas relacionados con los medicamentos y ordene el registro de lo realizado.</w:t>
-      </w:r>
-    </w:p>
-    <w:p>
-      <w:pPr>
-        <w:pStyle w:val="Ttulo2"/>
       </w:pPr>
       <w:bookmarkStart w:id="13" w:name="_Toc234959465"/>
-      <w:r>
-        <w:t xml:space="preserve">1.2 </w:t>
-      </w:r>
       <w:bookmarkStart w:id="14" w:name="_Toc234430355"/>
-      <w:r>
-        <w:t xml:space="preserve">Importancia </w:t>
-      </w:r>
-      <w:r>
-        <w:t>C</w:t>
-      </w:r>
-      <w:r>
-        <w:t xml:space="preserve">línica y </w:t>
-      </w:r>
-      <w:r>
-        <w:t>S</w:t>
-      </w:r>
-      <w:r>
-        <w:t>anitaria</w:t>
-      </w:r>
       <w:bookmarkEnd w:id="13"/>
       <w:bookmarkEnd w:id="14"/>
+      <w:r>
+        <w:t>1.1 Atención Primaria de Salud y CESFAM Villa Nonguén</w:t>
+      </w:r>
     </w:p>
     <w:p>
       <w:pPr>
         <w:spacing w:after="120" w:line="360" w:lineRule="auto"/>
         <w:jc w:val="both"/>
       </w:pPr>
-      <w:r>
-        <w:rPr>
-          <w:rFonts w:ascii="Arial" w:eastAsia="Arial" w:hAnsi="Arial"/>
-          <w:sz w:val="24"/>
-        </w:rPr>
-        <w:t xml:space="preserve">Las razones </w:t>
-      </w:r>
-      <w:r>
-        <w:rPr>
-          <w:rFonts w:ascii="Arial" w:eastAsia="Arial" w:hAnsi="Arial"/>
-          <w:sz w:val="24"/>
-        </w:rPr>
-        <w:t>de</w:t>
-      </w:r>
-      <w:r>
-        <w:rPr>
-          <w:rFonts w:ascii="Arial" w:eastAsia="Arial" w:hAnsi="Arial"/>
-          <w:sz w:val="24"/>
-        </w:rPr>
-        <w:t xml:space="preserve"> contar con </w:t>
-      </w:r>
-      <w:r>
-        <w:rPr>
-          <w:rFonts w:ascii="Arial" w:eastAsia="Arial" w:hAnsi="Arial"/>
-          <w:sz w:val="24"/>
-        </w:rPr>
-        <w:t>este</w:t>
-      </w:r>
-      <w:r>
-        <w:rPr>
-          <w:rFonts w:ascii="Arial" w:eastAsia="Arial" w:hAnsi="Arial"/>
-          <w:sz w:val="24"/>
-        </w:rPr>
-        <w:t xml:space="preserve"> </w:t>
-      </w:r>
-      <w:r>
-        <w:rPr>
-          <w:rFonts w:ascii="Arial" w:eastAsia="Arial" w:hAnsi="Arial"/>
-          <w:sz w:val="24"/>
-        </w:rPr>
-        <w:t>protocolo</w:t>
-      </w:r>
-      <w:r>
-        <w:rPr>
-          <w:rFonts w:ascii="Arial" w:eastAsia="Arial" w:hAnsi="Arial"/>
-          <w:sz w:val="24"/>
-        </w:rPr>
-        <w:t xml:space="preserve"> son epidemiológicas y de gestión. Las enfermedades cardiovasculares son una de las principales causas de muerte y discapacidad en el mundo y en Chile, en un país cuya población envejece y en el que las enfermedades crónicas son cada vez más frecuentes. La Encuesta Nacional de Salud 2016-2017 estimó que cerca del 27,6% de la población tiene sospecha de hipertensión, </w:t>
-      </w:r>
-      <w:r>
-        <w:rPr>
-          <w:rFonts w:ascii="Arial" w:eastAsia="Arial" w:hAnsi="Arial"/>
-          <w:sz w:val="24"/>
-        </w:rPr>
-        <w:lastRenderedPageBreak/>
-        <w:t>un 12,3% diabetes tipo 2 y alrededor del 60% algún grado de dislipidemia (Ministerio de Salud de Chile, 2017a). Una parte importante de los infartos y de los ataques cerebrales que se derivan de estas condiciones podría evitarse controlando a tiempo los factores de riesgo (Ministerio de Salud de Chile, 2017b)</w:t>
-      </w:r>
-      <w:r>
-        <w:rPr>
-          <w:rFonts w:ascii="Arial" w:eastAsia="Arial" w:hAnsi="Arial"/>
-          <w:sz w:val="24"/>
-        </w:rPr>
-        <w:t>,</w:t>
-      </w:r>
-      <w:r>
-        <w:rPr>
-          <w:rFonts w:ascii="Arial" w:eastAsia="Arial" w:hAnsi="Arial"/>
-          <w:sz w:val="24"/>
-        </w:rPr>
-        <w:t xml:space="preserve"> en esa tarea la Atención Primaria, a través del Programa de Salud Cardiovascular, cumple un papel central al pesquisar, clasificar y seguir a </w:t>
-      </w:r>
-      <w:r>
-        <w:rPr>
-          <w:rFonts w:ascii="Arial" w:eastAsia="Arial" w:hAnsi="Arial"/>
-          <w:sz w:val="24"/>
-        </w:rPr>
-        <w:t>los</w:t>
-      </w:r>
-      <w:r>
-        <w:rPr>
-          <w:rFonts w:ascii="Arial" w:eastAsia="Arial" w:hAnsi="Arial"/>
-          <w:sz w:val="24"/>
-        </w:rPr>
-        <w:t xml:space="preserve"> pacientes.</w:t>
+      <w:commentRangeStart w:id="9"/>
+      <w:commentRangeEnd w:id="9"/>
+      <w:commentRangeStart w:id="10"/>
+      <w:commentRangeEnd w:id="10"/>
+      <w:r>
+        <w:t>El Centro de Salud Familiar (CESFAM) Villa Nonguén es un establecimiento de la Atención Primaria de Salud (APS) ubicado en el sector de Nonguén, en la periferia oriente de la comuna de Concepción, Región del Biobío. Forma parte de la red del Servicio de Salud Concepción y funciona bajo la modalidad de administración delegada a cargo de la Corporación de Salud y Desarrollo Social (COSADES), tras haber sido uno de los centros pioneros en la implementación del Modelo de Salud Familiar en el país (Diario Concepción, 2017; COSADES, s.f.). Atiende a una población inscrita cercana a las 16.760 personas, organizada en torno a unas 5.560 familias y distribuida en cuatro sectores, y entrega prestaciones a todos los grupos del ciclo vital. Su unidad de farmacia funciona con dos químicos farmacéuticos, uno a cargo de la dirección técnica y otro dedicado a la Atención Farmacéutica, y con un equipo permanente de cuatro técnicos en enfermería de nivel superior. Dentro del Programa de Salud Cardiovascular, el Químico Farmacéutico ya participa en la atención de los usuarios, tanto en box como en visitas domiciliarias, y realiza tareas de seguimiento, educación y revisión de la medicación.</w:t>
+      </w:r>
+    </w:p>
+    <w:p>
+      <w:pPr>
+        <w:pStyle w:val="Ttulo2"/>
+      </w:pPr>
+      <w:bookmarkStart w:id="13" w:name="_Toc234959465"/>
+      <w:bookmarkStart w:id="14" w:name="_Toc234430355"/>
+      <w:bookmarkEnd w:id="13"/>
+      <w:bookmarkEnd w:id="14"/>
+      <w:r>
+        <w:t>1.2 Programa de Salud Cardiovascular</w:t>
       </w:r>
     </w:p>
     <w:p>
@@ -4171,192 +3610,49 @@
         <w:spacing w:after="120" w:line="360" w:lineRule="auto"/>
         <w:jc w:val="both"/>
       </w:pPr>
-      <w:r>
-        <w:rPr>
-          <w:rFonts w:ascii="Arial" w:eastAsia="Arial" w:hAnsi="Arial"/>
-          <w:sz w:val="24"/>
-        </w:rPr>
-        <w:t xml:space="preserve">Ahora bien, que un tratamiento esté indicado no asegura que el paciente lo tome como corresponde. La adherencia, entendida como el grado en que la persona sigue las indicaciones acordadas con el equipo de salud, es uno de los factores que más influye en el control de estas enfermedades y suele ser baja en quienes usan varios medicamentos a la vez (Haynes et al., 1979; Martín Alfonso, 2004; Morales &amp; Estela, 2015). En los usuarios que además dependen de otros o tienen dificultades para llegar al centro, la visita domiciliaria pasa a ser la mejor oportunidad para revisar la terapia, resolver dudas y reforzar la adherencia. A </w:t>
-      </w:r>
-      <w:r>
-        <w:rPr>
-          <w:rFonts w:ascii="Arial" w:eastAsia="Arial" w:hAnsi="Arial"/>
-          <w:sz w:val="24"/>
-        </w:rPr>
-        <w:t>lo anterior</w:t>
-      </w:r>
-      <w:r>
-        <w:rPr>
-          <w:rFonts w:ascii="Arial" w:eastAsia="Arial" w:hAnsi="Arial"/>
-          <w:sz w:val="24"/>
-        </w:rPr>
-        <w:t xml:space="preserve"> se agrega un motivo de gestión: ordenar </w:t>
-      </w:r>
-      <w:r>
-        <w:rPr>
-          <w:rFonts w:ascii="Arial" w:eastAsia="Arial" w:hAnsi="Arial"/>
-          <w:sz w:val="24"/>
-        </w:rPr>
-        <w:t>la</w:t>
-      </w:r>
-      <w:r>
-        <w:rPr>
-          <w:rFonts w:ascii="Arial" w:eastAsia="Arial" w:hAnsi="Arial"/>
-          <w:sz w:val="24"/>
-        </w:rPr>
-        <w:t xml:space="preserve"> atención</w:t>
-      </w:r>
-      <w:r>
-        <w:rPr>
-          <w:rFonts w:ascii="Arial" w:eastAsia="Arial" w:hAnsi="Arial"/>
-          <w:sz w:val="24"/>
-        </w:rPr>
-        <w:t>,</w:t>
-      </w:r>
-      <w:r>
-        <w:rPr>
-          <w:rFonts w:ascii="Arial" w:eastAsia="Arial" w:hAnsi="Arial"/>
-          <w:sz w:val="24"/>
-        </w:rPr>
-        <w:t xml:space="preserve"> ayuda a aprovechar mejor el Fondo de Farmacia (FOFAR), que financia la presencia del </w:t>
-      </w:r>
-      <w:r>
-        <w:rPr>
-          <w:rFonts w:ascii="Arial" w:eastAsia="Arial" w:hAnsi="Arial"/>
-          <w:sz w:val="24"/>
-        </w:rPr>
-        <w:t>Químico Farmacéutico</w:t>
-      </w:r>
-      <w:r>
-        <w:rPr>
-          <w:rFonts w:ascii="Arial" w:eastAsia="Arial" w:hAnsi="Arial"/>
-          <w:sz w:val="24"/>
-        </w:rPr>
-        <w:t xml:space="preserve"> en la Atención Primaria y el acceso a los medicamentos para la hipertensión, la diabetes y la dislipidemia (Ministerio de Salud de Chile, 2018b, 2020).</w:t>
+      <w:commentRangeStart w:id="9"/>
+      <w:commentRangeEnd w:id="9"/>
+      <w:commentRangeStart w:id="10"/>
+      <w:commentRangeEnd w:id="10"/>
+      <w:r>
+        <w:t>Las enfermedades cardiovasculares son una de las principales causas de muerte y discapacidad en el mundo y en Chile, en un país cuya población envejece y en el que las enfermedades crónicas son cada vez más frecuentes. La Encuesta Nacional de Salud 2016-2017 estimó que cerca del 27,6% de la población tiene sospecha de hipertensión, un 12,3% diabetes tipo 2 y alrededor del 60% algún grado de dislipidemia (Ministerio de Salud de Chile, 2017a). Una parte importante de los infartos y de los ataques cerebrales que se derivan de estas condiciones podría evitarse controlando a tiempo los factores de riesgo (Ministerio de Salud de Chile, 2017b); en esa tarea la Atención Primaria, a través del Programa de Salud Cardiovascular, cumple un papel central al pesquisar, clasificar y seguir a los pacientes.</w:t>
       </w:r>
     </w:p>
     <w:p>
       <w:pPr>
         <w:pStyle w:val="Ttulo2"/>
       </w:pPr>
-      <w:bookmarkStart w:id="15" w:name="_Toc234959466"/>
-      <w:r>
-        <w:t xml:space="preserve">1.3 </w:t>
-      </w:r>
-      <w:bookmarkStart w:id="16" w:name="_Toc234430356"/>
-      <w:r>
-        <w:t>Estado del arte y evolución hacia el Modelo CMO</w:t>
-      </w:r>
-      <w:bookmarkEnd w:id="15"/>
-      <w:bookmarkEnd w:id="16"/>
+      <w:bookmarkStart w:id="13" w:name="_Toc234959465"/>
+      <w:bookmarkStart w:id="14" w:name="_Toc234430355"/>
+      <w:bookmarkEnd w:id="13"/>
+      <w:bookmarkEnd w:id="14"/>
+      <w:r>
+        <w:t>1.3 Atención Farmacéutica</w:t>
+      </w:r>
     </w:p>
     <w:p>
       <w:pPr>
         <w:spacing w:after="120" w:line="360" w:lineRule="auto"/>
         <w:jc w:val="both"/>
-        <w:rPr>
-          <w:rFonts w:ascii="Arial" w:eastAsia="Arial" w:hAnsi="Arial"/>
-          <w:sz w:val="24"/>
-        </w:rPr>
-      </w:pPr>
-      <w:r>
-        <w:rPr>
-          <w:rFonts w:ascii="Arial" w:eastAsia="Arial" w:hAnsi="Arial"/>
-          <w:sz w:val="24"/>
-        </w:rPr>
-        <w:t xml:space="preserve">La forma de </w:t>
-      </w:r>
-      <w:r>
-        <w:rPr>
-          <w:rFonts w:ascii="Arial" w:eastAsia="Arial" w:hAnsi="Arial"/>
-          <w:sz w:val="24"/>
-        </w:rPr>
-        <w:t>realizar una</w:t>
-      </w:r>
-      <w:r>
-        <w:rPr>
-          <w:rFonts w:ascii="Arial" w:eastAsia="Arial" w:hAnsi="Arial"/>
-          <w:sz w:val="24"/>
-        </w:rPr>
-        <w:t xml:space="preserve"> </w:t>
-      </w:r>
-      <w:r>
-        <w:rPr>
-          <w:rFonts w:ascii="Arial" w:eastAsia="Arial" w:hAnsi="Arial"/>
-          <w:sz w:val="24"/>
-        </w:rPr>
-        <w:t>Atención Farmacéutica</w:t>
-      </w:r>
-      <w:r>
-        <w:rPr>
-          <w:rFonts w:ascii="Arial" w:eastAsia="Arial" w:hAnsi="Arial"/>
-          <w:sz w:val="24"/>
-        </w:rPr>
-        <w:t xml:space="preserve"> ha cambiado bastante en las últimas décadas. Al comienzo el trabajo giraba en torno al medicamento y al control del gasto, con poca estructura (Calleja Hernández &amp; Morillo Verdugo, 2016). A medida que la población envejeció y aparecieron más pacientes con varias enfermedades a la vez, ese enfoque </w:t>
-      </w:r>
-      <w:r>
-        <w:rPr>
-          <w:rFonts w:ascii="Arial" w:eastAsia="Arial" w:hAnsi="Arial"/>
-          <w:sz w:val="24"/>
-        </w:rPr>
-        <w:t>resultó insuficiente</w:t>
-      </w:r>
-      <w:r>
-        <w:rPr>
-          <w:rFonts w:ascii="Arial" w:eastAsia="Arial" w:hAnsi="Arial"/>
-          <w:sz w:val="24"/>
-        </w:rPr>
-        <w:t>. Para ordenar el seguimiento surgieron métodos como el Dáder y, en Chile, el POLARIS, que ofrecen una manera sistemática de detectar los problemas relacionados con los medicamentos (PRM) y los resultados negativos asociados a la medicación (RNM) (Plaza, 2018; Ministerio de Salud de Chile, 2018a, 2019). Para clasificar es</w:t>
-      </w:r>
-      <w:r>
-        <w:rPr>
-          <w:rFonts w:ascii="Arial" w:eastAsia="Arial" w:hAnsi="Arial"/>
-          <w:sz w:val="24"/>
-        </w:rPr>
-        <w:t>tos</w:t>
-      </w:r>
-      <w:r>
-        <w:rPr>
-          <w:rFonts w:ascii="Arial" w:eastAsia="Arial" w:hAnsi="Arial"/>
-          <w:sz w:val="24"/>
-        </w:rPr>
-        <w:t xml:space="preserve"> problemas se suele recurrir al Tercer Consenso de Granada, que ordena los RNM según</w:t>
-      </w:r>
-      <w:r>
-        <w:rPr>
-          <w:rFonts w:ascii="Arial" w:eastAsia="Arial" w:hAnsi="Arial"/>
-          <w:sz w:val="24"/>
-        </w:rPr>
-        <w:t>,</w:t>
-      </w:r>
-      <w:r>
-        <w:rPr>
-          <w:rFonts w:ascii="Arial" w:eastAsia="Arial" w:hAnsi="Arial"/>
-          <w:sz w:val="24"/>
-        </w:rPr>
-        <w:t xml:space="preserve"> si el tratamiento es necesario, efectivo y seguro (Comité de Consenso de Granada, 2007). Estos métodos</w:t>
-      </w:r>
-      <w:r>
-        <w:rPr>
-          <w:rFonts w:ascii="Arial" w:eastAsia="Arial" w:hAnsi="Arial"/>
-          <w:sz w:val="24"/>
-        </w:rPr>
-        <w:t xml:space="preserve"> expuestos</w:t>
-      </w:r>
-      <w:r>
-        <w:rPr>
-          <w:rFonts w:ascii="Arial" w:eastAsia="Arial" w:hAnsi="Arial"/>
-          <w:sz w:val="24"/>
-        </w:rPr>
-        <w:t xml:space="preserve"> aportaron rigor, aunque llevarlos </w:t>
-      </w:r>
-      <w:r>
-        <w:rPr>
-          <w:rFonts w:ascii="Arial" w:eastAsia="Arial" w:hAnsi="Arial"/>
-          <w:sz w:val="24"/>
-        </w:rPr>
-        <w:lastRenderedPageBreak/>
-        <w:t>por completo a la Atención Primaria ha sido difícil, sobre todo en la parte conductual y en la logística de la visita a domicilio.</w:t>
+      </w:pPr>
+      <w:commentRangeStart w:id="9"/>
+      <w:commentRangeEnd w:id="9"/>
+      <w:commentRangeStart w:id="10"/>
+      <w:commentRangeEnd w:id="10"/>
+      <w:r>
+        <w:t>La Atención Farmacéutica se entiende hoy como la participación del farmacéutico en el cuidado de la persona para aprovechar mejor sus medicamentos y mejorar sus resultados en salud. Bonal y colaboradores la describen como el proceso por el cual el farmacéutico coopera con el paciente y con el resto del equipo en el diseño, la ejecución y el seguimiento de un plan terapéutico orientado a metas concretas (Bonal et al., 2003). Esto supone un cambio respecto del modelo clásico, centrado en entregar el medicamento, hacia otro que se preocupa de lo que ocurre con ese medicamento una vez que el paciente lo lleva a su casa.</w:t>
+      </w:r>
+    </w:p>
+    <w:p>
+      <w:pPr>
+        <w:pStyle w:val="Ttulo2"/>
+      </w:pPr>
+      <w:bookmarkStart w:id="13" w:name="_Toc234959465"/>
+      <w:bookmarkStart w:id="14" w:name="_Toc234430355"/>
+      <w:bookmarkEnd w:id="13"/>
+      <w:bookmarkEnd w:id="14"/>
+      <w:r>
+        <w:t>1.4 Rol del Químico Farmacéutico en la Atención Primaria</w:t>
       </w:r>
     </w:p>
     <w:p>
@@ -4364,119 +3660,24 @@
         <w:spacing w:after="120" w:line="360" w:lineRule="auto"/>
         <w:jc w:val="both"/>
       </w:pPr>
-      <w:r>
-        <w:rPr>
-          <w:rFonts w:ascii="Arial" w:eastAsia="Arial" w:hAnsi="Arial"/>
-          <w:sz w:val="24"/>
-          <w:szCs w:val="24"/>
-        </w:rPr>
-        <w:t xml:space="preserve">Sobre esa base, el marco que hoy se usa como referencia para modernizar la </w:t>
-      </w:r>
-      <w:r>
-        <w:rPr>
-          <w:rFonts w:ascii="Arial" w:eastAsia="Arial" w:hAnsi="Arial"/>
-          <w:sz w:val="24"/>
-          <w:szCs w:val="24"/>
-        </w:rPr>
-        <w:t>Atención Farmacéutica</w:t>
-      </w:r>
-      <w:r>
-        <w:rPr>
-          <w:rFonts w:ascii="Arial" w:eastAsia="Arial" w:hAnsi="Arial"/>
-          <w:sz w:val="24"/>
-          <w:szCs w:val="24"/>
-        </w:rPr>
-        <w:t xml:space="preserve"> es el Modelo CMO Capacidad, Motivación y Oportunidad, desarrollado en España y validado por su sociedad de farmacia hospitalaria (Calleja Hernández &amp; Morillo Verdugo, 2016). Su valor está</w:t>
-      </w:r>
-      <w:r>
-        <w:rPr>
-          <w:rFonts w:ascii="Arial" w:eastAsia="Arial" w:hAnsi="Arial"/>
-          <w:sz w:val="24"/>
-          <w:szCs w:val="24"/>
-        </w:rPr>
-        <w:t>,</w:t>
-      </w:r>
-      <w:r>
-        <w:rPr>
-          <w:rFonts w:ascii="Arial" w:eastAsia="Arial" w:hAnsi="Arial"/>
-          <w:sz w:val="24"/>
-          <w:szCs w:val="24"/>
-        </w:rPr>
-        <w:t xml:space="preserve"> en</w:t>
-      </w:r>
-      <w:r>
-        <w:rPr>
-          <w:rFonts w:ascii="Arial" w:eastAsia="Arial" w:hAnsi="Arial"/>
-          <w:sz w:val="24"/>
-          <w:szCs w:val="24"/>
-        </w:rPr>
-        <w:t xml:space="preserve"> </w:t>
-      </w:r>
-      <w:r>
-        <w:rPr>
-          <w:rFonts w:ascii="Arial" w:eastAsia="Arial" w:hAnsi="Arial"/>
-          <w:sz w:val="24"/>
-          <w:szCs w:val="24"/>
-        </w:rPr>
-        <w:t>ordena</w:t>
-      </w:r>
-      <w:r>
-        <w:rPr>
-          <w:rFonts w:ascii="Arial" w:eastAsia="Arial" w:hAnsi="Arial"/>
-          <w:sz w:val="24"/>
-          <w:szCs w:val="24"/>
-        </w:rPr>
-        <w:t>r</w:t>
-      </w:r>
-      <w:r>
-        <w:rPr>
-          <w:rFonts w:ascii="Arial" w:eastAsia="Arial" w:hAnsi="Arial"/>
-          <w:sz w:val="24"/>
-          <w:szCs w:val="24"/>
-        </w:rPr>
-        <w:t xml:space="preserve"> la atención en torno a tres ideas sencillas</w:t>
-      </w:r>
-      <w:r>
-        <w:rPr>
-          <w:rFonts w:ascii="Arial" w:eastAsia="Arial" w:hAnsi="Arial"/>
-          <w:sz w:val="24"/>
-          <w:szCs w:val="24"/>
-        </w:rPr>
-        <w:t>,</w:t>
-      </w:r>
-      <w:r>
-        <w:rPr>
-          <w:rFonts w:ascii="Arial" w:eastAsia="Arial" w:hAnsi="Arial"/>
-          <w:sz w:val="24"/>
-          <w:szCs w:val="24"/>
-        </w:rPr>
-        <w:t xml:space="preserve"> que se pueden llevar al domicilio del paciente</w:t>
-      </w:r>
-      <w:r>
-        <w:rPr>
-          <w:rFonts w:ascii="Arial" w:eastAsia="Arial" w:hAnsi="Arial"/>
-          <w:sz w:val="24"/>
-          <w:szCs w:val="24"/>
-        </w:rPr>
-        <w:t xml:space="preserve">, además, investigaciones recientes </w:t>
-      </w:r>
-      <w:r>
-        <w:rPr>
-          <w:rFonts w:ascii="Arial" w:eastAsia="Arial" w:hAnsi="Arial"/>
-          <w:sz w:val="24"/>
-          <w:szCs w:val="24"/>
-          <w:lang w:val="es-419"/>
-        </w:rPr>
-        <w:t>han aplicado este modelo en patologías de alta complejidad, como las coagulopatías congénitas (Juárez Giménez &amp; Morillo Verdugo, 2026), evidenciando su versatilidad clínica y su capacidad de adaptación a distintos contextos sociosanitarios</w:t>
-      </w:r>
-      <w:r>
-        <w:rPr>
-          <w:rFonts w:ascii="Arial" w:eastAsia="Arial" w:hAnsi="Arial"/>
-          <w:sz w:val="24"/>
-          <w:szCs w:val="24"/>
-          <w:lang w:val="es-419"/>
-        </w:rPr>
-        <w:t>.</w:t>
+      <w:commentRangeStart w:id="9"/>
+      <w:commentRangeEnd w:id="9"/>
+      <w:commentRangeStart w:id="10"/>
+      <w:commentRangeEnd w:id="10"/>
+      <w:r>
+        <w:t>En la Atención Primaria chilena la incorporación del Químico Farmacéutico a los equipos ha sido un avance, pero todavía falta un método claro y compartido para guiar y evaluar su trabajo clínico en el domicilio. Sin ese método, cada profesional organiza la visita de acuerdo con su criterio, los resultados se vuelven difíciles de comparar y el aporte del farmacéutico queda poco visible para el resto del equipo.</w:t>
+      </w:r>
+    </w:p>
+    <w:p>
+      <w:pPr>
+        <w:pStyle w:val="Ttulo2"/>
+      </w:pPr>
+      <w:bookmarkStart w:id="13" w:name="_Toc234959465"/>
+      <w:bookmarkStart w:id="14" w:name="_Toc234430355"/>
+      <w:bookmarkEnd w:id="13"/>
+      <w:bookmarkEnd w:id="14"/>
+      <w:r>
+        <w:t>1.5 Atención Farmacéutica domiciliaria</w:t>
       </w:r>
     </w:p>
     <w:p>
@@ -4484,164 +3685,76 @@
         <w:spacing w:after="120" w:line="360" w:lineRule="auto"/>
         <w:jc w:val="both"/>
       </w:pPr>
-      <w:r>
-        <w:rPr>
-          <w:rFonts w:ascii="Arial" w:eastAsia="Arial" w:hAnsi="Arial"/>
-          <w:sz w:val="24"/>
-          <w:szCs w:val="24"/>
-        </w:rPr>
-        <w:t xml:space="preserve">La Capacidad tiene </w:t>
-      </w:r>
-      <w:r>
-        <w:rPr>
-          <w:rFonts w:ascii="Arial" w:eastAsia="Arial" w:hAnsi="Arial"/>
-          <w:sz w:val="24"/>
-          <w:szCs w:val="24"/>
-        </w:rPr>
-        <w:t>directa relación</w:t>
-      </w:r>
-      <w:r>
-        <w:rPr>
-          <w:rFonts w:ascii="Arial" w:eastAsia="Arial" w:hAnsi="Arial"/>
-          <w:sz w:val="24"/>
-          <w:szCs w:val="24"/>
-        </w:rPr>
-        <w:t xml:space="preserve"> con priorizar</w:t>
-      </w:r>
-      <w:r>
-        <w:rPr>
-          <w:rFonts w:ascii="Arial" w:eastAsia="Arial" w:hAnsi="Arial"/>
-          <w:sz w:val="24"/>
-          <w:szCs w:val="24"/>
-        </w:rPr>
-        <w:t>,</w:t>
-      </w:r>
-      <w:r>
-        <w:rPr>
-          <w:rFonts w:ascii="Arial" w:eastAsia="Arial" w:hAnsi="Arial"/>
-          <w:sz w:val="24"/>
-          <w:szCs w:val="24"/>
-        </w:rPr>
-        <w:t xml:space="preserve"> </w:t>
-      </w:r>
-      <w:r>
-        <w:rPr>
-          <w:rFonts w:ascii="Arial" w:eastAsia="Arial" w:hAnsi="Arial"/>
-          <w:sz w:val="24"/>
-          <w:szCs w:val="24"/>
-        </w:rPr>
-        <w:t>e</w:t>
-      </w:r>
-      <w:r>
-        <w:rPr>
-          <w:rFonts w:ascii="Arial" w:eastAsia="Arial" w:hAnsi="Arial"/>
-          <w:sz w:val="24"/>
-          <w:szCs w:val="24"/>
-        </w:rPr>
-        <w:t xml:space="preserve">n lugar de atender a todos por igual, propone concentrar el tiempo en los pacientes que más lo necesitan, usando criterios de riesgo y de complejidad para decidir a quién visitar primero (Manzano García &amp; Morillo Verdugo, 2018). La Motivación </w:t>
-      </w:r>
-      <w:r>
-        <w:rPr>
-          <w:rFonts w:ascii="Arial" w:eastAsia="Arial" w:hAnsi="Arial"/>
-          <w:sz w:val="24"/>
-          <w:szCs w:val="24"/>
-        </w:rPr>
-        <w:t>se centra</w:t>
-      </w:r>
-      <w:r>
-        <w:rPr>
-          <w:rFonts w:ascii="Arial" w:eastAsia="Arial" w:hAnsi="Arial"/>
-          <w:sz w:val="24"/>
-          <w:szCs w:val="24"/>
-        </w:rPr>
-        <w:t xml:space="preserve"> en la relación con el paciente y en su adherencia: mediante la entrevista motivacional, el farmacéutico trabaja las creencias y las dificultades que llevan a alguien a no tomar bien su tratamiento y busca acuerdos en vez de limitarse a dar instrucciones (Manzano García et al., 2018). </w:t>
-      </w:r>
-      <w:r>
-        <w:rPr>
-          <w:rFonts w:ascii="Arial" w:eastAsia="Arial" w:hAnsi="Arial"/>
-          <w:sz w:val="24"/>
-          <w:szCs w:val="24"/>
-        </w:rPr>
-        <w:t>P</w:t>
-      </w:r>
-      <w:r>
-        <w:rPr>
-          <w:rFonts w:ascii="Arial" w:eastAsia="Arial" w:hAnsi="Arial"/>
-          <w:sz w:val="24"/>
-          <w:szCs w:val="24"/>
-        </w:rPr>
-        <w:t>or último</w:t>
-      </w:r>
-      <w:r>
-        <w:rPr>
-          <w:rFonts w:ascii="Arial" w:eastAsia="Arial" w:hAnsi="Arial"/>
-          <w:sz w:val="24"/>
-          <w:szCs w:val="24"/>
-        </w:rPr>
-        <w:t>,</w:t>
-      </w:r>
-      <w:r>
-        <w:rPr>
-          <w:rFonts w:ascii="Arial" w:eastAsia="Arial" w:hAnsi="Arial"/>
-          <w:sz w:val="24"/>
-          <w:szCs w:val="24"/>
-        </w:rPr>
-        <w:t xml:space="preserve"> </w:t>
-      </w:r>
-      <w:r>
-        <w:rPr>
-          <w:rFonts w:ascii="Arial" w:eastAsia="Arial" w:hAnsi="Arial"/>
-          <w:sz w:val="24"/>
-          <w:szCs w:val="24"/>
-        </w:rPr>
-        <w:t xml:space="preserve">la </w:t>
-      </w:r>
-      <w:r>
-        <w:rPr>
-          <w:rFonts w:ascii="Arial" w:eastAsia="Arial" w:hAnsi="Arial"/>
-          <w:sz w:val="24"/>
-          <w:szCs w:val="24"/>
-        </w:rPr>
-        <w:t>Oportunidad apunta a llegar al paciente más allá del box en su casa, por teléfono o con apoyo de herramientas digitales para resolver a tiempo lo que vaya surgiendo (Juárez Giménez &amp; Morillo Verdugo, 2026). Son estos tres pilares los que dan forma al protocolo que aquí se propone.</w:t>
+      <w:commentRangeStart w:id="9"/>
+      <w:commentRangeEnd w:id="9"/>
+      <w:commentRangeStart w:id="10"/>
+      <w:commentRangeEnd w:id="10"/>
+      <w:r>
+        <w:t>Más allá del recorrido y de los tipos de visita, conviene detenerse en el valor que aporta atender al paciente en su propio domicilio. La Atención Farmacéutica es una labor compleja, porque el paciente entrega información personal al Químico Farmacéutico, lo que exige del profesional habilidades de comunicación para generar un vínculo y la confianza necesarios para reunir todo lo que se requiere, tanto la farmacoterapia, como los problemas que la propia persona reconoce y así intervenir de forma adecuada. Si bien, la visita domiciliaria demanda más recursos que la atención en box, como el traslado y un mayor tiempo por los desplazamientos, ofrece una ventaja clara para abordar los tres pilares del Modelo CMO.</w:t>
+      </w:r>
+    </w:p>
+    <w:p>
+      <w:pPr>
+        <w:spacing w:after="120" w:line="360" w:lineRule="auto"/>
+        <w:jc w:val="both"/>
+      </w:pPr>
+      <w:commentRangeStart w:id="9"/>
+      <w:commentRangeEnd w:id="9"/>
+      <w:commentRangeStart w:id="10"/>
+      <w:commentRangeEnd w:id="10"/>
+      <w:r>
+        <w:t>En cuanto a la Capacidad, estar en el hogar permite observar el entorno real del paciente: cómo y con quién vive, si cuenta con el apoyo de un familiar o un vecino. Esa información no está disponible en una atención de box y resulta valiosa para entender cómo usa realmente sus medicamentos. Además, la visita domiciliaria permite identificar los medicamentos que el paciente almacena en diferentes espacios del hogar o adquiridos por iniciativa propia, los cuales el paciente omite al momento de una consulta o control convencional, esta información adicional enriquece la conciliación farmacéutica y mejora las decisiones que se toman sobre la farmacoterapia.</w:t>
+      </w:r>
+    </w:p>
+    <w:p>
+      <w:pPr>
+        <w:spacing w:after="120" w:line="360" w:lineRule="auto"/>
+        <w:jc w:val="both"/>
+      </w:pPr>
+      <w:commentRangeStart w:id="9"/>
+      <w:commentRangeEnd w:id="9"/>
+      <w:commentRangeStart w:id="10"/>
+      <w:commentRangeEnd w:id="10"/>
+      <w:r>
+        <w:t>En cuanto a la Motivación, las condiciones del hogar entregan señales sobre el estado anímico del paciente. Un lugar limpio y ordenado, o la presencia de alguien que lo acompañe, suele indicar que la persona se encuentra bien o que dispone de una red de apoyo, y esto puede actuar como un factor que favorece el uso racional de los medicamentos. En el fondo, un paciente que sigue su tratamiento lo hace porque quiere cuidar su salud, espera mejorar sus patologías, y reconocer esa disposición ayuda a reforzarla durante la entrevista.</w:t>
+      </w:r>
+    </w:p>
+    <w:p>
+      <w:pPr>
+        <w:spacing w:after="120" w:line="360" w:lineRule="auto"/>
+        <w:jc w:val="both"/>
+      </w:pPr>
+      <w:commentRangeStart w:id="9"/>
+      <w:commentRangeEnd w:id="9"/>
+      <w:commentRangeStart w:id="10"/>
+      <w:commentRangeEnd w:id="10"/>
+      <w:r>
+        <w:t>Finalmente, en cuanto a la Oportunidad, la visita al domicilio favorece un vínculo más cercano: al encontrarse en un espacio seguro, el paciente tiende a abrirse y a compartir más información, y gana confianza para preguntar y aclarar sus dudas. Esta intervención constituye una oportunidad para recalcar el rol del Químico Farmacéutico e incentivar a acercarse a la farmacia o a comunicarse por vía telefónica cuando lo necesite. Sentirse acompañado a lo largo del tratamiento mejora el ánimo de los pacientes y los motiva a mantener su farmacoterapia.</w:t>
       </w:r>
     </w:p>
     <w:p>
       <w:pPr>
         <w:pStyle w:val="Ttulo2"/>
       </w:pPr>
-      <w:bookmarkStart w:id="17" w:name="_Toc234430357"/>
-      <w:bookmarkStart w:id="18" w:name="_Toc234959467"/>
-      <w:r>
-        <w:t>1.4 Alcance y aplicabilidad del protocolo</w:t>
-      </w:r>
-      <w:bookmarkEnd w:id="17"/>
-      <w:bookmarkEnd w:id="18"/>
+      <w:bookmarkStart w:id="13" w:name="_Toc234959465"/>
+      <w:bookmarkStart w:id="14" w:name="_Toc234430355"/>
+      <w:bookmarkEnd w:id="13"/>
+      <w:bookmarkEnd w:id="14"/>
+      <w:r>
+        <w:t>1.6 Adherencia, polifarmacia y problemas relacionados con los medicamentos</w:t>
+      </w:r>
     </w:p>
     <w:p>
       <w:pPr>
         <w:spacing w:after="120" w:line="360" w:lineRule="auto"/>
         <w:jc w:val="both"/>
       </w:pPr>
-      <w:r>
-        <w:rPr>
-          <w:rFonts w:ascii="Arial" w:eastAsia="Arial" w:hAnsi="Arial"/>
-          <w:sz w:val="24"/>
-        </w:rPr>
-        <w:t xml:space="preserve">El protocolo abarca el seguimiento farmacoterapéutico en el domicilio de los pacientes crónicos del Programa de Salud Cardiovascular, desde que se planifica la visita hasta que se registra lo realizado en la ficha clínica. La idea </w:t>
-      </w:r>
-      <w:r>
-        <w:rPr>
-          <w:rFonts w:ascii="Arial" w:eastAsia="Arial" w:hAnsi="Arial"/>
-          <w:sz w:val="24"/>
-        </w:rPr>
-        <w:t xml:space="preserve">principal </w:t>
-      </w:r>
-      <w:r>
-        <w:rPr>
-          <w:rFonts w:ascii="Arial" w:eastAsia="Arial" w:hAnsi="Arial"/>
-          <w:sz w:val="24"/>
-        </w:rPr>
-        <w:t>es traducir los tres pilares del Modelo CMO en pasos concretos: a quién priorizar, cómo abordar la adherencia durante la entrevista y cómo dar continuidad al seguimiento fuera del box.</w:t>
+      <w:commentRangeStart w:id="9"/>
+      <w:commentRangeEnd w:id="9"/>
+      <w:commentRangeStart w:id="10"/>
+      <w:commentRangeEnd w:id="10"/>
+      <w:r>
+        <w:t>Que un tratamiento esté indicado no asegura que el paciente lo tome como corresponde. La adherencia, entendida como el grado en que la persona sigue las indicaciones acordadas con el equipo de salud, es uno de los factores que más influye en el control de estas enfermedades y suele ser baja en quienes usan varios medicamentos a la vez (Haynes et al., 1979; Martín Alfonso, 2004; Morales &amp; Estela, 2015). En los usuarios que además dependen de otros o tienen dificultades para llegar al centro, la visita domiciliaria pasa a ser la mejor oportunidad para revisar la terapia, resolver dudas y reforzar la adherencia.</w:t>
       </w:r>
     </w:p>
     <w:p>
@@ -4649,189 +3762,261 @@
         <w:spacing w:after="120" w:line="360" w:lineRule="auto"/>
         <w:jc w:val="both"/>
       </w:pPr>
-      <w:r>
-        <w:rPr>
-          <w:rFonts w:ascii="Arial" w:eastAsia="Arial" w:hAnsi="Arial"/>
-          <w:sz w:val="24"/>
-        </w:rPr>
-        <w:t xml:space="preserve">En </w:t>
-      </w:r>
-      <w:r>
-        <w:rPr>
-          <w:rFonts w:ascii="Arial" w:eastAsia="Arial" w:hAnsi="Arial"/>
-          <w:sz w:val="24"/>
-        </w:rPr>
-        <w:t>la</w:t>
-      </w:r>
-      <w:r>
-        <w:rPr>
-          <w:rFonts w:ascii="Arial" w:eastAsia="Arial" w:hAnsi="Arial"/>
-          <w:sz w:val="24"/>
-        </w:rPr>
-        <w:t xml:space="preserve"> práctic</w:t>
-      </w:r>
-      <w:r>
-        <w:rPr>
-          <w:rFonts w:ascii="Arial" w:eastAsia="Arial" w:hAnsi="Arial"/>
-          <w:sz w:val="24"/>
-        </w:rPr>
-        <w:t>a</w:t>
-      </w:r>
-      <w:r>
-        <w:rPr>
-          <w:rFonts w:ascii="Arial" w:eastAsia="Arial" w:hAnsi="Arial"/>
-          <w:sz w:val="24"/>
-        </w:rPr>
-        <w:t>, funciona como una guía para las tareas</w:t>
-      </w:r>
-      <w:r>
-        <w:rPr>
-          <w:rFonts w:ascii="Arial" w:eastAsia="Arial" w:hAnsi="Arial"/>
-          <w:sz w:val="24"/>
-        </w:rPr>
-        <w:t xml:space="preserve"> </w:t>
-      </w:r>
-      <w:r>
-        <w:rPr>
-          <w:rFonts w:ascii="Arial" w:eastAsia="Arial" w:hAnsi="Arial"/>
-          <w:sz w:val="24"/>
-        </w:rPr>
-        <w:t xml:space="preserve">habituales del </w:t>
-      </w:r>
-      <w:r>
-        <w:rPr>
-          <w:rFonts w:ascii="Arial" w:eastAsia="Arial" w:hAnsi="Arial"/>
-          <w:sz w:val="24"/>
-        </w:rPr>
-        <w:t>Químico Farmacéutico</w:t>
-      </w:r>
-      <w:r>
-        <w:rPr>
-          <w:rFonts w:ascii="Arial" w:eastAsia="Arial" w:hAnsi="Arial"/>
-          <w:sz w:val="24"/>
-        </w:rPr>
-        <w:t xml:space="preserve"> en el CESFAM: revisar el botiquín del hogar, conciliar la medicación que el paciente realmente toma con la que tiene indicada (Delgado et al., 2007) y educar de </w:t>
-      </w:r>
-      <w:r>
-        <w:rPr>
-          <w:rFonts w:ascii="Arial" w:eastAsia="Arial" w:hAnsi="Arial"/>
-          <w:sz w:val="24"/>
-        </w:rPr>
-        <w:lastRenderedPageBreak/>
-        <w:t>forma adaptada a cada persona. Al dejar estas tareas ordenadas en un flujograma se reduce la variabilidad entre profesionales y se facilita que el resto del equipo entienda qué hace el farmacéutico y con qué fin. El protocolo</w:t>
-      </w:r>
-      <w:r>
-        <w:rPr>
-          <w:rFonts w:ascii="Arial" w:eastAsia="Arial" w:hAnsi="Arial"/>
-          <w:sz w:val="24"/>
-        </w:rPr>
-        <w:t>,</w:t>
-      </w:r>
-      <w:r>
-        <w:rPr>
-          <w:rFonts w:ascii="Arial" w:eastAsia="Arial" w:hAnsi="Arial"/>
-          <w:sz w:val="24"/>
-        </w:rPr>
-        <w:t xml:space="preserve"> también incorpora criterios para clasificar los RNM y la gravedad de los errores de medicación, tomando como referencia el Consenso de Granada y el esquema del National Coordinating Council for Medication Error Reporting and Prevention (Forrey, Pedersen &amp; Schneider, 2007), lo que ayuda a derivar a tiempo y a fundamentar las interconsultas al médico tratante.</w:t>
+      <w:commentRangeStart w:id="9"/>
+      <w:commentRangeEnd w:id="9"/>
+      <w:commentRangeStart w:id="10"/>
+      <w:commentRangeEnd w:id="10"/>
+      <w:r>
+        <w:t>La dificultad es mayor en los pacientes que toman muchos medicamentos, tienen problemas sociales o presentan condiciones propias de la edad, en quienes la adherencia es más frágil (Manzano García &amp; Morillo Verdugo, 2018).</w:t>
       </w:r>
     </w:p>
     <w:p>
       <w:pPr>
         <w:pStyle w:val="Ttulo2"/>
       </w:pPr>
-      <w:bookmarkStart w:id="19" w:name="_Toc234430358"/>
-      <w:bookmarkStart w:id="20" w:name="_Toc234959468"/>
-      <w:r>
-        <w:t>1.5 Delimitación del problema</w:t>
-      </w:r>
-      <w:bookmarkEnd w:id="19"/>
-      <w:bookmarkEnd w:id="20"/>
+      <w:bookmarkStart w:id="13" w:name="_Toc234959465"/>
+      <w:bookmarkStart w:id="14" w:name="_Toc234430355"/>
+      <w:bookmarkEnd w:id="13"/>
+      <w:bookmarkEnd w:id="14"/>
+      <w:r>
+        <w:t>1.7 Métodos de seguimiento farmacoterapéutico</w:t>
+      </w:r>
     </w:p>
     <w:p>
       <w:pPr>
         <w:spacing w:after="120" w:line="360" w:lineRule="auto"/>
         <w:jc w:val="both"/>
       </w:pPr>
-      <w:r>
-        <w:rPr>
-          <w:rFonts w:ascii="Arial" w:eastAsia="Arial" w:hAnsi="Arial"/>
-          <w:sz w:val="24"/>
-        </w:rPr>
-        <w:t xml:space="preserve">El trabajo se acota a un contexto concreto para que el protocolo sea directamente aplicable. En lo territorial, se circunscribe al CESFAM Villa Nonguén y a la población a su cargo, en la comuna de Concepción, Región del Biobío. En lo temporal, el diagnóstico de las brechas y el diseño del protocolo se realizaron durante el periodo de internado, de cuatro meses. </w:t>
-      </w:r>
-      <w:r>
-        <w:rPr>
-          <w:rFonts w:ascii="Arial" w:eastAsia="Arial" w:hAnsi="Arial"/>
-          <w:sz w:val="24"/>
-        </w:rPr>
-        <w:t>E</w:t>
-      </w:r>
-      <w:r>
-        <w:rPr>
-          <w:rFonts w:ascii="Arial" w:eastAsia="Arial" w:hAnsi="Arial"/>
-          <w:sz w:val="24"/>
-        </w:rPr>
-        <w:t xml:space="preserve">n lo poblacional, se orienta a personas adultas y mayores del Programa de Salud Cardiovascular, con prioridad en quienes están descompensados, toman muchos medicamentos, dependen de un cuidador o tienen dificultades para acudir con </w:t>
-      </w:r>
-      <w:commentRangeStart w:id="21"/>
-      <w:r>
-        <w:rPr>
-          <w:rFonts w:ascii="Arial" w:eastAsia="Arial" w:hAnsi="Arial"/>
-          <w:sz w:val="24"/>
-        </w:rPr>
-        <w:t>regularidad al centro de salud.</w:t>
-      </w:r>
-      <w:commentRangeEnd w:id="21"/>
-      <w:r>
-        <w:rPr>
-          <w:rStyle w:val="Refdecomentario"/>
-          <w:sz w:val="24"/>
-          <w:szCs w:val="24"/>
-        </w:rPr>
-        <w:commentReference w:id="21"/>
+      <w:commentRangeStart w:id="9"/>
+      <w:commentRangeEnd w:id="9"/>
+      <w:commentRangeStart w:id="10"/>
+      <w:commentRangeEnd w:id="10"/>
+      <w:r>
+        <w:t>La forma de realizar una Atención Farmacéutica ha cambiado bastante en las últimas décadas. Al comienzo el trabajo giraba en torno al medicamento y al control del gasto, con poca estructura (Calleja Hernández &amp; Morillo Verdugo, 2016). A medida que la población envejeció y aparecieron más pacientes con varias enfermedades a la vez, ese enfoque resultó insuficiente. Para ordenar el seguimiento surgieron métodos como el Dáder y, en Chile, el POLARIS, que ofrecen una manera sistemática de detectar los problemas relacionados con los medicamentos (PRM) y los resultados negativos asociados a la medicación (RNM) (Plaza, 2018; Ministerio de Salud de Chile, 2018a, 2019). Para clasificar estos problemas se suele recurrir al Tercer Consenso de Granada, que ordena los RNM según, si el tratamiento es necesario, efectivo y seguro (Comité de Consenso de Granada, 2007). Estos métodos expuestos aportaron rigor, aunque llevarlos por completo a la Atención Primaria ha sido difícil, sobre todo en la parte conductual y en la logística de la visita a domicilio.</w:t>
       </w:r>
     </w:p>
     <w:p>
       <w:pPr>
         <w:pStyle w:val="Ttulo2"/>
       </w:pPr>
-      <w:bookmarkStart w:id="22" w:name="_Toc234430359"/>
-      <w:bookmarkStart w:id="23" w:name="_Toc234959469"/>
-      <w:r>
-        <w:t>1.6 Pregunta de investigación</w:t>
-      </w:r>
-      <w:bookmarkEnd w:id="22"/>
-      <w:bookmarkEnd w:id="23"/>
+      <w:bookmarkStart w:id="13" w:name="_Toc234959465"/>
+      <w:bookmarkStart w:id="14" w:name="_Toc234430355"/>
+      <w:bookmarkEnd w:id="13"/>
+      <w:bookmarkEnd w:id="14"/>
+      <w:r>
+        <w:t>1.8 Modelo CMO</w:t>
+      </w:r>
     </w:p>
     <w:p>
       <w:pPr>
         <w:spacing w:after="120" w:line="360" w:lineRule="auto"/>
         <w:jc w:val="both"/>
       </w:pPr>
-      <w:commentRangeStart w:id="24"/>
-      <w:r>
-        <w:rPr>
-          <w:rFonts w:ascii="Arial" w:eastAsia="Arial" w:hAnsi="Arial"/>
-          <w:sz w:val="24"/>
-        </w:rPr>
-        <w:t>La pregunta que guía el trabajo puede ordenarse con el formato PICO, que distingue paciente, intervención, comparación y resultado esperado</w:t>
-      </w:r>
-      <w:commentRangeEnd w:id="24"/>
-      <w:r>
-        <w:rPr>
-          <w:rStyle w:val="Refdecomentario"/>
-          <w:rFonts w:ascii="Arial" w:eastAsia="Arial" w:hAnsi="Arial"/>
-          <w:sz w:val="24"/>
-          <w:szCs w:val="24"/>
-        </w:rPr>
-        <w:commentReference w:id="24"/>
-      </w:r>
-      <w:r>
-        <w:rPr>
-          <w:rFonts w:ascii="Arial" w:eastAsia="Arial" w:hAnsi="Arial"/>
-          <w:sz w:val="24"/>
-        </w:rPr>
-        <w:t>:</w:t>
+      <w:commentRangeStart w:id="9"/>
+      <w:commentRangeEnd w:id="9"/>
+      <w:commentRangeStart w:id="10"/>
+      <w:commentRangeEnd w:id="10"/>
+      <w:r>
+        <w:t>Sobre esa base, el marco que hoy se usa como referencia para modernizar la Atención Farmacéutica es el Modelo CMO Capacidad, Motivación y Oportunidad, desarrollado en España y validado por su sociedad de farmacia hospitalaria (Calleja Hernández &amp; Morillo Verdugo, 2016). Su valor está en ordenar la atención en torno a tres ideas sencillas que se pueden llevar al domicilio del paciente; además, investigaciones recientes han aplicado este modelo en patologías de alta complejidad, como las coagulopatías congénitas (Juárez Giménez &amp; Morillo Verdugo, 2026), evidenciando su versatilidad clínica y su capacidad de adaptación a distintos contextos sociosanitarios.</w:t>
+      </w:r>
+    </w:p>
+    <w:p>
+      <w:pPr>
+        <w:spacing w:after="120" w:line="360" w:lineRule="auto"/>
+        <w:jc w:val="both"/>
+      </w:pPr>
+      <w:commentRangeStart w:id="9"/>
+      <w:commentRangeEnd w:id="9"/>
+      <w:commentRangeStart w:id="10"/>
+      <w:commentRangeEnd w:id="10"/>
+      <w:r>
+        <w:t>La Capacidad tiene directa relación con priorizar, en lugar de atender a todos por igual, propone concentrar el tiempo en los pacientes que más lo necesitan, usando criterios de riesgo y de complejidad para decidir a quién visitar primero (Manzano García &amp; Morillo Verdugo, 2018). La Motivación se centra en la relación con el paciente y en su adherencia: mediante la entrevista motivacional, el farmacéutico trabaja las creencias y las dificultades que llevan a alguien a no tomar bien su tratamiento y busca acuerdos en vez de limitarse a dar instrucciones (Manzano García et al., 2018). Por último, la Oportunidad apunta a llegar al paciente más allá del box en su casa, por teléfono o con apoyo de herramientas digitales para resolver a tiempo lo que vaya surgiendo (Juárez Giménez &amp; Morillo Verdugo, 2026). Son estos tres pilares los que dan forma al protocolo que aquí se propone.</w:t>
+      </w:r>
+    </w:p>
+    <w:p>
+      <w:pPr>
+        <w:pStyle w:val="Ttulo2"/>
+      </w:pPr>
+      <w:bookmarkStart w:id="13" w:name="_Toc234959465"/>
+      <w:bookmarkStart w:id="14" w:name="_Toc234430355"/>
+      <w:bookmarkEnd w:id="13"/>
+      <w:bookmarkEnd w:id="14"/>
+      <w:r>
+        <w:t>1.9 Aplicación del Modelo CMO en el CESFAM Villa Nonguén</w:t>
+      </w:r>
+    </w:p>
+    <w:p>
+      <w:pPr>
+        <w:spacing w:after="120" w:line="360" w:lineRule="auto"/>
+        <w:jc w:val="both"/>
+      </w:pPr>
+      <w:commentRangeStart w:id="9"/>
+      <w:commentRangeEnd w:id="9"/>
+      <w:commentRangeStart w:id="10"/>
+      <w:commentRangeEnd w:id="10"/>
+      <w:r>
+        <w:t>El protocolo abarca el seguimiento farmacoterapéutico en el domicilio de los pacientes crónicos del Programa de Salud Cardiovascular, desde que se planifica la visita hasta que se registra lo realizado en la ficha clínica. La idea principal es traducir los tres pilares del Modelo CMO en pasos concretos: a quién priorizar, cómo abordar la adherencia durante la entrevista y cómo dar continuidad al seguimiento fuera del box.</w:t>
+      </w:r>
+    </w:p>
+    <w:p>
+      <w:pPr>
+        <w:spacing w:after="120" w:line="360" w:lineRule="auto"/>
+        <w:jc w:val="both"/>
+      </w:pPr>
+      <w:commentRangeStart w:id="9"/>
+      <w:commentRangeEnd w:id="9"/>
+      <w:commentRangeStart w:id="10"/>
+      <w:commentRangeEnd w:id="10"/>
+      <w:r>
+        <w:t>En la práctica, funciona como una guía para las tareas habituales del Químico Farmacéutico en el CESFAM: revisar el botiquín del hogar, conciliar la medicación que el paciente realmente toma con la que tiene indicada (Delgado et al., 2007) y educar de forma adaptada a cada persona. Al dejar estas tareas ordenadas en un flujograma se reduce la variabilidad entre profesionales y se facilita que el resto del equipo entienda qué hace el farmacéutico y con qué fin. El protocolo también incorpora criterios para clasificar los RNM y la gravedad de los errores de medicación, tomando como referencia el Consenso de Granada y el esquema del National Coordinating Council for Medication Error Reporting and Prevention (Forrey, Pedersen &amp; Schneider, 2007), lo que ayuda a derivar a tiempo y a fundamentar las interconsultas al médico tratante.</w:t>
+      </w:r>
+    </w:p>
+    <w:p>
+      <w:pPr>
+        <w:spacing w:after="120" w:line="360" w:lineRule="auto"/>
+        <w:jc w:val="both"/>
+      </w:pPr>
+      <w:commentRangeStart w:id="9"/>
+      <w:commentRangeEnd w:id="9"/>
+      <w:commentRangeStart w:id="10"/>
+      <w:commentRangeEnd w:id="10"/>
+      <w:r>
+        <w:t>La magnitud de esa necesidad había quedado documentada en el mismo centro. Una memoria anterior, que evaluó el programa de Atención Farmacéutica siguiendo a veinte usuarios, encontró que todos tenían al menos un problema relacionado con sus medicamentos y que solo el 15% era adherente al inicio del seguimiento, cifra que mejoró de manera importante tras la intervención del farmacéutico (Faúndez Navarrete, 2020). Ese resultado deja ver dos cosas: que el trabajo farmacéutico en terreno sí influye en los pacientes y que hasta ahora se ha hecho de una forma valiosa, pero poco sistematizada. De lo antes expuesto, surge la idea de esta memoria, cuyo objetivo es ordenar la labor en un protocolo que pueda repetirse y evaluarse.</w:t>
+      </w:r>
+    </w:p>
+    <w:p>
+      <w:pPr>
+        <w:pStyle w:val="Ttulo2"/>
+      </w:pPr>
+      <w:bookmarkStart w:id="13" w:name="_Toc234959465"/>
+      <w:bookmarkStart w:id="14" w:name="_Toc234430355"/>
+      <w:bookmarkEnd w:id="13"/>
+      <w:bookmarkEnd w:id="14"/>
+      <w:r>
+        <w:t>1.10 Justificación y planteamiento del problema</w:t>
+      </w:r>
+    </w:p>
+    <w:p>
+      <w:pPr>
+        <w:spacing w:after="120" w:line="360" w:lineRule="auto"/>
+        <w:jc w:val="both"/>
+      </w:pPr>
+      <w:commentRangeStart w:id="9"/>
+      <w:commentRangeEnd w:id="9"/>
+      <w:commentRangeStart w:id="10"/>
+      <w:commentRangeEnd w:id="10"/>
+      <w:r>
+        <w:t>Las razones de contar con este protocolo son epidemiológicas y de gestión. A la carga de las enfermedades cardiovasculares se suma un motivo de gestión: ordenar la atención ayuda a aprovechar mejor el Fondo de Farmacia (FOFAR), que financia la presencia del Químico Farmacéutico en la Atención Primaria y el acceso a los medicamentos para la hipertensión, la diabetes y la dislipidemia (Ministerio de Salud de Chile, 2018b, 2020).</w:t>
+      </w:r>
+    </w:p>
+    <w:p>
+      <w:pPr>
+        <w:spacing w:after="120" w:line="360" w:lineRule="auto"/>
+        <w:jc w:val="both"/>
+      </w:pPr>
+      <w:commentRangeStart w:id="9"/>
+      <w:commentRangeEnd w:id="9"/>
+      <w:commentRangeStart w:id="10"/>
+      <w:commentRangeEnd w:id="10"/>
+      <w:r>
+        <w:t>Dado lo anterior, este trabajo propone un protocolo que estructure la entrevista, ayude a detectar a tiempo los problemas relacionados con los medicamentos y ordene el registro de lo realizado. La visita a domicilio consume bastante tiempo, por lo que conviene aprovechar bien cada instancia.</w:t>
+      </w:r>
+    </w:p>
+    <w:p>
+      <w:pPr>
+        <w:spacing w:after="120" w:line="360" w:lineRule="auto"/>
+        <w:jc w:val="both"/>
+      </w:pPr>
+      <w:commentRangeStart w:id="9"/>
+      <w:commentRangeEnd w:id="9"/>
+      <w:commentRangeStart w:id="10"/>
+      <w:commentRangeEnd w:id="10"/>
+      <w:r>
+        <w:t>El problema detectado es que esas visitas se llevan a cabo sin un procedimiento escrito y estandarizado que las respalde. Actualmente la atención ingresa por derivación y se prioriza a los pacientes más descompensados, y el Químico Farmacéutico, que cuenta con la formación necesaria para conducir la entrevista, deja constancia de lo realizado en la ficha clínica y en hojas de apoyo. Cabe considerar que lo que falta no es el criterio ni el registro, sino un documento común que ordene la priorización de los pacientes, la forma de conducir la visita y el registro de la atención, de modo que el trabajo sea trazable, comparable entre profesionales y posible de evaluar en el tiempo.</w:t>
+      </w:r>
+    </w:p>
+    <w:p>
+      <w:pPr>
+        <w:pStyle w:val="Ttulo2"/>
+      </w:pPr>
+      <w:bookmarkStart w:id="13" w:name="_Toc234959465"/>
+      <w:bookmarkStart w:id="14" w:name="_Toc234430355"/>
+      <w:bookmarkEnd w:id="13"/>
+      <w:bookmarkEnd w:id="14"/>
+      <w:r>
+        <w:t>1.11 Delimitación del problema</w:t>
+      </w:r>
+    </w:p>
+    <w:p>
+      <w:pPr>
+        <w:spacing w:after="120" w:line="360" w:lineRule="auto"/>
+        <w:jc w:val="both"/>
+      </w:pPr>
+      <w:commentRangeStart w:id="9"/>
+      <w:commentRangeEnd w:id="9"/>
+      <w:commentRangeStart w:id="10"/>
+      <w:commentRangeEnd w:id="10"/>
+      <w:r>
+        <w:t>El trabajo se acota a un contexto concreto para que el protocolo sea directamente aplicable. En lo territorial, se circunscribe al CESFAM Villa Nonguén y a la población a su cargo, en la comuna de Concepción, Región del Biobío. En lo temporal, el diagnóstico de las brechas y el diseño del protocolo se realizaron durante el periodo de internado, de cuatro meses. En lo poblacional, se orienta a personas adultas y mayores del Programa de Salud Cardiovascular, con prioridad en quienes están descompensados, toman muchos medicamentos, dependen de un cuidador o tienen dificultades para acudir con regularidad al centro de salud.</w:t>
+      </w:r>
+    </w:p>
+    <w:p>
+      <w:pPr>
+        <w:pStyle w:val="Ttulo2"/>
+      </w:pPr>
+      <w:bookmarkStart w:id="13" w:name="_Toc234959465"/>
+      <w:bookmarkStart w:id="14" w:name="_Toc234430355"/>
+      <w:bookmarkEnd w:id="13"/>
+      <w:bookmarkEnd w:id="14"/>
+      <w:r>
+        <w:t>1.12 Pregunta de investigación</w:t>
+      </w:r>
+    </w:p>
+    <w:p>
+      <w:pPr>
+        <w:spacing w:after="120" w:line="360" w:lineRule="auto"/>
+        <w:jc w:val="both"/>
+      </w:pPr>
+      <w:commentRangeStart w:id="9"/>
+      <w:commentRangeEnd w:id="9"/>
+      <w:commentRangeStart w:id="10"/>
+      <w:commentRangeEnd w:id="10"/>
+      <w:r>
+        <w:t>¿Puede el diseño de un protocolo de Atención Farmacéutica domiciliaria basado en el Modelo CMO ordenar y hacer más trazable el seguimiento farmacoterapéutico de los pacientes adultos y mayores del Programa de Salud Cardiovascular del CESFAM Villa Nonguén, frente a la práctica actual no protocolizada?</w:t>
+      </w:r>
+    </w:p>
+    <w:p>
+      <w:pPr>
+        <w:pStyle w:val="Ttulo2"/>
+      </w:pPr>
+      <w:bookmarkStart w:id="26" w:name="_Toc234959470"/>
+      <w:bookmarkEnd w:id="25"/>
+      <w:bookmarkEnd w:id="26"/>
+      <w:r>
+        <w:t>1.13 Objetivos</w:t>
+      </w:r>
+    </w:p>
+    <w:p>
+      <w:pPr>
+        <w:spacing w:after="120" w:line="360" w:lineRule="auto"/>
+        <w:jc w:val="both"/>
+      </w:pPr>
+      <w:r>
+        <w:t>Objetivo general. Diseñar un protocolo de Atención Farmacéutica domiciliaria basado en el Modelo CMO para los pacientes del Programa de Salud Cardiovascular del CESFAM Villa Nonguén.</w:t>
+      </w:r>
+    </w:p>
+    <w:p>
+      <w:pPr>
+        <w:spacing w:after="120" w:line="360" w:lineRule="auto"/>
+        <w:jc w:val="both"/>
+      </w:pPr>
+      <w:r>
+        <w:rPr>
+          <w:rFonts w:ascii="Arial" w:eastAsia="Arial" w:hAnsi="Arial"/>
+          <w:b/>
+          <w:sz w:val="24"/>
+        </w:rPr>
+        <w:t>Objetivos específicos</w:t>
       </w:r>
     </w:p>
     <w:p>
@@ -4840,365 +4025,10 @@
         <w:spacing w:after="80" w:line="360" w:lineRule="auto"/>
         <w:jc w:val="both"/>
       </w:pPr>
-      <w:r>
-        <w:rPr>
-          <w:rFonts w:ascii="Arial" w:eastAsia="Arial" w:hAnsi="Arial"/>
-          <w:sz w:val="24"/>
-        </w:rPr>
-        <w:t xml:space="preserve">•  </w:t>
-      </w:r>
-      <w:r>
-        <w:rPr>
-          <w:rFonts w:ascii="Arial" w:eastAsia="Arial" w:hAnsi="Arial"/>
-          <w:b/>
-          <w:sz w:val="24"/>
-        </w:rPr>
-        <w:t>Población:</w:t>
-      </w:r>
-      <w:r>
-        <w:rPr>
-          <w:rFonts w:ascii="Arial" w:eastAsia="Arial" w:hAnsi="Arial"/>
-          <w:b/>
-          <w:sz w:val="24"/>
-        </w:rPr>
-        <w:t xml:space="preserve"> </w:t>
-      </w:r>
-      <w:r>
-        <w:rPr>
-          <w:rFonts w:ascii="Arial" w:eastAsia="Arial" w:hAnsi="Arial"/>
-          <w:sz w:val="24"/>
-        </w:rPr>
-        <w:t>pacientes</w:t>
-      </w:r>
-      <w:r>
-        <w:rPr>
-          <w:rFonts w:ascii="Arial" w:eastAsia="Arial" w:hAnsi="Arial"/>
-          <w:sz w:val="24"/>
-        </w:rPr>
-        <w:t xml:space="preserve"> adult</w:t>
-      </w:r>
-      <w:r>
-        <w:rPr>
-          <w:rFonts w:ascii="Arial" w:eastAsia="Arial" w:hAnsi="Arial"/>
-          <w:sz w:val="24"/>
-        </w:rPr>
-        <w:t>o</w:t>
-      </w:r>
-      <w:r>
-        <w:rPr>
-          <w:rFonts w:ascii="Arial" w:eastAsia="Arial" w:hAnsi="Arial"/>
-          <w:sz w:val="24"/>
-        </w:rPr>
-        <w:t>s y mayores con hipertensión, diabetes tipo 2 o dislipidemia, que toman varios medicamentos y presentan dependencia funcional moderada o severa, pertenecientes al Programa de Salud Cardiovascular del CESFAM Villa Nonguén.</w:t>
-      </w:r>
-    </w:p>
-    <w:p>
-      <w:pPr>
-        <w:pStyle w:val="Prrafodelista"/>
-        <w:spacing w:after="80" w:line="360" w:lineRule="auto"/>
-        <w:jc w:val="both"/>
-      </w:pPr>
-      <w:r>
-        <w:rPr>
-          <w:rFonts w:ascii="Arial" w:eastAsia="Arial" w:hAnsi="Arial"/>
-          <w:sz w:val="24"/>
-        </w:rPr>
-        <w:t xml:space="preserve">•  </w:t>
-      </w:r>
-      <w:r>
-        <w:rPr>
-          <w:rFonts w:ascii="Arial" w:eastAsia="Arial" w:hAnsi="Arial"/>
-          <w:b/>
-          <w:sz w:val="24"/>
-        </w:rPr>
-        <w:t>Intervención</w:t>
-      </w:r>
-      <w:r>
-        <w:rPr>
-          <w:rFonts w:ascii="Arial" w:eastAsia="Arial" w:hAnsi="Arial"/>
-          <w:b/>
-          <w:sz w:val="24"/>
-        </w:rPr>
-        <w:t>:</w:t>
-      </w:r>
-      <w:r>
-        <w:rPr>
-          <w:rFonts w:ascii="Arial" w:eastAsia="Arial" w:hAnsi="Arial"/>
-          <w:b/>
-          <w:sz w:val="24"/>
-        </w:rPr>
-        <w:t xml:space="preserve"> </w:t>
-      </w:r>
-      <w:r>
-        <w:rPr>
-          <w:rFonts w:ascii="Arial" w:eastAsia="Arial" w:hAnsi="Arial"/>
-          <w:sz w:val="24"/>
-        </w:rPr>
-        <w:t xml:space="preserve">protocolo de </w:t>
-      </w:r>
-      <w:r>
-        <w:rPr>
-          <w:rFonts w:ascii="Arial" w:eastAsia="Arial" w:hAnsi="Arial"/>
-          <w:sz w:val="24"/>
-        </w:rPr>
-        <w:t>Atención Farmacéutica</w:t>
-      </w:r>
-      <w:r>
-        <w:rPr>
-          <w:rFonts w:ascii="Arial" w:eastAsia="Arial" w:hAnsi="Arial"/>
-          <w:sz w:val="24"/>
-        </w:rPr>
-        <w:t xml:space="preserve"> </w:t>
-      </w:r>
-      <w:r>
-        <w:rPr>
-          <w:rFonts w:ascii="Arial" w:eastAsia="Arial" w:hAnsi="Arial"/>
-          <w:sz w:val="24"/>
-        </w:rPr>
-        <w:t>domiciliaria estructurada</w:t>
-      </w:r>
-      <w:r>
-        <w:rPr>
-          <w:rFonts w:ascii="Arial" w:eastAsia="Arial" w:hAnsi="Arial"/>
-          <w:sz w:val="24"/>
-        </w:rPr>
-        <w:t xml:space="preserve"> según los pilares del Modelo CMO.</w:t>
-      </w:r>
-    </w:p>
-    <w:p>
-      <w:pPr>
-        <w:pStyle w:val="Prrafodelista"/>
-        <w:spacing w:after="80" w:line="360" w:lineRule="auto"/>
-        <w:jc w:val="both"/>
-      </w:pPr>
-      <w:r>
-        <w:rPr>
-          <w:rFonts w:ascii="Arial" w:eastAsia="Arial" w:hAnsi="Arial"/>
-          <w:sz w:val="24"/>
-        </w:rPr>
-        <w:t xml:space="preserve">•  </w:t>
-      </w:r>
-      <w:r>
-        <w:rPr>
-          <w:rFonts w:ascii="Arial" w:eastAsia="Arial" w:hAnsi="Arial"/>
-          <w:b/>
-          <w:bCs/>
-          <w:sz w:val="24"/>
-        </w:rPr>
-        <w:t>Comparación</w:t>
-      </w:r>
-      <w:r>
-        <w:rPr>
-          <w:rFonts w:ascii="Arial" w:eastAsia="Arial" w:hAnsi="Arial"/>
-          <w:b/>
-          <w:bCs/>
-          <w:sz w:val="24"/>
-        </w:rPr>
-        <w:t>:</w:t>
-      </w:r>
-      <w:r>
-        <w:rPr>
-          <w:rFonts w:ascii="Arial" w:eastAsia="Arial" w:hAnsi="Arial"/>
-          <w:b/>
-          <w:bCs/>
-          <w:sz w:val="24"/>
-        </w:rPr>
-        <w:t xml:space="preserve"> </w:t>
-      </w:r>
-      <w:r>
-        <w:rPr>
-          <w:rFonts w:ascii="Arial" w:eastAsia="Arial" w:hAnsi="Arial"/>
-          <w:sz w:val="24"/>
-        </w:rPr>
-        <w:t xml:space="preserve">la práctica actual, en la que la </w:t>
-      </w:r>
-      <w:r>
-        <w:rPr>
-          <w:rFonts w:ascii="Arial" w:eastAsia="Arial" w:hAnsi="Arial"/>
-          <w:sz w:val="24"/>
-        </w:rPr>
-        <w:t>Atención Farmacéutica</w:t>
-      </w:r>
-      <w:r>
-        <w:rPr>
-          <w:rFonts w:ascii="Arial" w:eastAsia="Arial" w:hAnsi="Arial"/>
-          <w:sz w:val="24"/>
-        </w:rPr>
-        <w:t xml:space="preserve"> domiciliaria se realiza sin un procedimiento escrito y estandarizado que la ordene y la haga comparable entre profesionales.</w:t>
-      </w:r>
-    </w:p>
-    <w:p>
-      <w:pPr>
-        <w:pStyle w:val="Prrafodelista"/>
-        <w:spacing w:after="80" w:line="360" w:lineRule="auto"/>
-        <w:jc w:val="both"/>
-      </w:pPr>
-      <w:r>
-        <w:rPr>
-          <w:rFonts w:ascii="Arial" w:eastAsia="Arial" w:hAnsi="Arial"/>
-          <w:sz w:val="24"/>
-        </w:rPr>
-        <w:t xml:space="preserve">•  </w:t>
-      </w:r>
-      <w:r>
-        <w:rPr>
-          <w:rFonts w:ascii="Arial" w:eastAsia="Arial" w:hAnsi="Arial"/>
-          <w:b/>
-          <w:sz w:val="24"/>
-        </w:rPr>
-        <w:t>Resultado esperado</w:t>
-      </w:r>
-      <w:r>
-        <w:rPr>
-          <w:rFonts w:ascii="Arial" w:eastAsia="Arial" w:hAnsi="Arial"/>
-          <w:b/>
-          <w:sz w:val="24"/>
-        </w:rPr>
-        <w:t>:</w:t>
-      </w:r>
-      <w:r>
-        <w:rPr>
-          <w:rFonts w:ascii="Arial" w:eastAsia="Arial" w:hAnsi="Arial"/>
-          <w:b/>
-          <w:sz w:val="24"/>
-        </w:rPr>
-        <w:t xml:space="preserve"> </w:t>
-      </w:r>
-      <w:r>
-        <w:rPr>
-          <w:rFonts w:ascii="Arial" w:eastAsia="Arial" w:hAnsi="Arial"/>
-          <w:sz w:val="24"/>
-        </w:rPr>
-        <w:t>un seguimiento domiciliario más ordenado y trazable, con intervenciones mejor organizadas en torno a los pacientes del programa.</w:t>
-      </w:r>
-      <w:bookmarkStart w:id="25" w:name="_Toc234430360"/>
-    </w:p>
-    <w:p>
-      <w:pPr>
-        <w:pStyle w:val="Ttulo2"/>
-      </w:pPr>
-      <w:bookmarkStart w:id="26" w:name="_Toc234959470"/>
-      <w:r>
-        <w:lastRenderedPageBreak/>
-        <w:t>1.7 Objetivos</w:t>
-      </w:r>
-      <w:bookmarkEnd w:id="25"/>
-      <w:bookmarkEnd w:id="26"/>
-    </w:p>
-    <w:p>
-      <w:pPr>
-        <w:spacing w:after="120" w:line="360" w:lineRule="auto"/>
-        <w:jc w:val="both"/>
-      </w:pPr>
-      <w:r>
-        <w:rPr>
-          <w:rFonts w:ascii="Arial" w:eastAsia="Arial" w:hAnsi="Arial"/>
-          <w:b/>
-          <w:sz w:val="24"/>
-        </w:rPr>
-        <w:t xml:space="preserve">Objetivo general. </w:t>
-      </w:r>
-      <w:r>
-        <w:rPr>
-          <w:rFonts w:ascii="Arial" w:eastAsia="Arial" w:hAnsi="Arial"/>
-          <w:sz w:val="24"/>
-        </w:rPr>
-        <w:t xml:space="preserve">Diseñar un protocolo de </w:t>
-      </w:r>
-      <w:r>
-        <w:rPr>
-          <w:rFonts w:ascii="Arial" w:eastAsia="Arial" w:hAnsi="Arial"/>
-          <w:sz w:val="24"/>
-        </w:rPr>
-        <w:t>Atención Farmacéutica</w:t>
-      </w:r>
-      <w:r>
-        <w:rPr>
-          <w:rFonts w:ascii="Arial" w:eastAsia="Arial" w:hAnsi="Arial"/>
-          <w:sz w:val="24"/>
-        </w:rPr>
-        <w:t xml:space="preserve"> </w:t>
-      </w:r>
-      <w:r>
-        <w:rPr>
-          <w:rFonts w:ascii="Arial" w:eastAsia="Arial" w:hAnsi="Arial"/>
-          <w:sz w:val="24"/>
-        </w:rPr>
-        <w:t>domiciliaria</w:t>
-      </w:r>
-      <w:r>
-        <w:rPr>
-          <w:rFonts w:ascii="Arial" w:eastAsia="Arial" w:hAnsi="Arial"/>
-          <w:sz w:val="24"/>
-        </w:rPr>
-        <w:t>,</w:t>
-      </w:r>
-      <w:r>
-        <w:rPr>
-          <w:rFonts w:ascii="Arial" w:eastAsia="Arial" w:hAnsi="Arial"/>
-          <w:sz w:val="24"/>
-        </w:rPr>
-        <w:t xml:space="preserve"> basada</w:t>
-      </w:r>
-      <w:r>
-        <w:rPr>
-          <w:rFonts w:ascii="Arial" w:eastAsia="Arial" w:hAnsi="Arial"/>
-          <w:sz w:val="24"/>
-        </w:rPr>
-        <w:t xml:space="preserve"> en el Modelo CMO para los pacientes del Programa de Salud Cardiovascular del CESFAM Villa Nonguén.</w:t>
-      </w:r>
-    </w:p>
-    <w:p>
-      <w:pPr>
-        <w:spacing w:after="120" w:line="360" w:lineRule="auto"/>
-        <w:jc w:val="both"/>
-      </w:pPr>
-      <w:r>
-        <w:rPr>
-          <w:rFonts w:ascii="Arial" w:eastAsia="Arial" w:hAnsi="Arial"/>
-          <w:b/>
-          <w:sz w:val="24"/>
-        </w:rPr>
-        <w:t>Objetivos específicos</w:t>
-      </w:r>
-    </w:p>
-    <w:p>
-      <w:pPr>
-        <w:pStyle w:val="Prrafodelista"/>
-        <w:spacing w:after="80" w:line="360" w:lineRule="auto"/>
-        <w:jc w:val="both"/>
-      </w:pPr>
-      <w:r>
-        <w:rPr>
-          <w:rFonts w:ascii="Arial" w:eastAsia="Arial" w:hAnsi="Arial"/>
-          <w:sz w:val="24"/>
-        </w:rPr>
-        <w:t xml:space="preserve">1.  </w:t>
-      </w:r>
       <w:commentRangeStart w:id="27"/>
-      <w:r>
-        <w:rPr>
-          <w:rFonts w:ascii="Arial" w:eastAsia="Arial" w:hAnsi="Arial"/>
-          <w:sz w:val="24"/>
-        </w:rPr>
-        <w:t xml:space="preserve">Diagnosticar </w:t>
-      </w:r>
       <w:commentRangeEnd w:id="27"/>
       <w:r>
-        <w:rPr>
-          <w:rStyle w:val="Refdecomentario"/>
-          <w:rFonts w:ascii="Arial" w:eastAsia="Arial" w:hAnsi="Arial"/>
-          <w:sz w:val="24"/>
-          <w:szCs w:val="24"/>
-        </w:rPr>
-        <w:commentReference w:id="27"/>
-      </w:r>
-      <w:r>
-        <w:rPr>
-          <w:rFonts w:ascii="Arial" w:eastAsia="Arial" w:hAnsi="Arial"/>
-          <w:sz w:val="24"/>
-        </w:rPr>
-        <w:t>las brechas del programa de visitas domiciliarias que se realiza actualmente en el CESFAM Villa Nonguén.</w:t>
+        <w:t>1.  Identificar las brechas del programa de visitas domiciliarias que se realiza actualmente en el CESFAM Villa Nonguén.</w:t>
       </w:r>
     </w:p>
     <w:p>
@@ -6609,393 +5439,6 @@
     </w:p>
     <w:p>
       <w:pPr>
-        <w:spacing w:after="120" w:line="360" w:lineRule="auto"/>
-        <w:jc w:val="both"/>
-      </w:pPr>
-      <w:r>
-        <w:rPr>
-          <w:rFonts w:ascii="Arial" w:eastAsia="Arial" w:hAnsi="Arial"/>
-          <w:sz w:val="24"/>
-          <w:szCs w:val="24"/>
-        </w:rPr>
-        <w:lastRenderedPageBreak/>
-        <w:t xml:space="preserve">Más allá del recorrido y de los tipos de visita, conviene detenerse en el valor que aporta atender al paciente en su propio domicilio. La </w:t>
-      </w:r>
-      <w:r>
-        <w:rPr>
-          <w:rFonts w:ascii="Arial" w:eastAsia="Arial" w:hAnsi="Arial"/>
-          <w:sz w:val="24"/>
-          <w:szCs w:val="24"/>
-        </w:rPr>
-        <w:t>Atención Farmacéutica</w:t>
-      </w:r>
-      <w:r>
-        <w:rPr>
-          <w:rFonts w:ascii="Arial" w:eastAsia="Arial" w:hAnsi="Arial"/>
-          <w:sz w:val="24"/>
-          <w:szCs w:val="24"/>
-        </w:rPr>
-        <w:t xml:space="preserve"> es una labor compleja, porque el paciente entrega información personal al </w:t>
-      </w:r>
-      <w:r>
-        <w:rPr>
-          <w:rFonts w:ascii="Arial" w:eastAsia="Arial" w:hAnsi="Arial"/>
-          <w:sz w:val="24"/>
-          <w:szCs w:val="24"/>
-        </w:rPr>
-        <w:t>Químico Farmacéutico</w:t>
-      </w:r>
-      <w:r>
-        <w:rPr>
-          <w:rFonts w:ascii="Arial" w:eastAsia="Arial" w:hAnsi="Arial"/>
-          <w:sz w:val="24"/>
-          <w:szCs w:val="24"/>
-        </w:rPr>
-        <w:t xml:space="preserve">, </w:t>
-      </w:r>
-      <w:r>
-        <w:rPr>
-          <w:rFonts w:ascii="Arial" w:eastAsia="Arial" w:hAnsi="Arial"/>
-          <w:sz w:val="24"/>
-          <w:szCs w:val="24"/>
-        </w:rPr>
-        <w:t>lo que</w:t>
-      </w:r>
-      <w:r>
-        <w:rPr>
-          <w:rFonts w:ascii="Arial" w:eastAsia="Arial" w:hAnsi="Arial"/>
-          <w:sz w:val="24"/>
-          <w:szCs w:val="24"/>
-        </w:rPr>
-        <w:t xml:space="preserve"> exige del profesional habilidades de comunicación para generar un vínculo y la confianza necesarios para </w:t>
-      </w:r>
-      <w:r>
-        <w:rPr>
-          <w:rFonts w:ascii="Arial" w:eastAsia="Arial" w:hAnsi="Arial"/>
-          <w:sz w:val="24"/>
-          <w:szCs w:val="24"/>
-        </w:rPr>
-        <w:t>reunir</w:t>
-      </w:r>
-      <w:r>
-        <w:rPr>
-          <w:rFonts w:ascii="Arial" w:eastAsia="Arial" w:hAnsi="Arial"/>
-          <w:sz w:val="24"/>
-          <w:szCs w:val="24"/>
-        </w:rPr>
-        <w:t xml:space="preserve"> todo lo que se requiere</w:t>
-      </w:r>
-      <w:r>
-        <w:rPr>
-          <w:rFonts w:ascii="Arial" w:eastAsia="Arial" w:hAnsi="Arial"/>
-          <w:sz w:val="24"/>
-          <w:szCs w:val="24"/>
-        </w:rPr>
-        <w:t>,</w:t>
-      </w:r>
-      <w:r>
-        <w:rPr>
-          <w:rFonts w:ascii="Arial" w:eastAsia="Arial" w:hAnsi="Arial"/>
-          <w:sz w:val="24"/>
-          <w:szCs w:val="24"/>
-        </w:rPr>
-        <w:t xml:space="preserve"> tanto la farmacoterapia</w:t>
-      </w:r>
-      <w:r>
-        <w:rPr>
-          <w:rFonts w:ascii="Arial" w:eastAsia="Arial" w:hAnsi="Arial"/>
-          <w:sz w:val="24"/>
-          <w:szCs w:val="24"/>
-        </w:rPr>
-        <w:t>,</w:t>
-      </w:r>
-      <w:r>
-        <w:rPr>
-          <w:rFonts w:ascii="Arial" w:eastAsia="Arial" w:hAnsi="Arial"/>
-          <w:sz w:val="24"/>
-          <w:szCs w:val="24"/>
-        </w:rPr>
-        <w:t xml:space="preserve"> como los problemas que la propia persona reconoce y así intervenir de forma adecuada. Si bien</w:t>
-      </w:r>
-      <w:r>
-        <w:rPr>
-          <w:rFonts w:ascii="Arial" w:eastAsia="Arial" w:hAnsi="Arial"/>
-          <w:sz w:val="24"/>
-          <w:szCs w:val="24"/>
-        </w:rPr>
-        <w:t>,</w:t>
-      </w:r>
-      <w:r>
-        <w:rPr>
-          <w:rFonts w:ascii="Arial" w:eastAsia="Arial" w:hAnsi="Arial"/>
-          <w:sz w:val="24"/>
-          <w:szCs w:val="24"/>
-        </w:rPr>
-        <w:t xml:space="preserve"> la visita domiciliaria demanda más recursos que la atención en box, como el traslado y un mayor tiempo por los desplazamientos, ofrece una ventaja clara para abordar los tres pilares del Modelo CMO.</w:t>
-      </w:r>
-    </w:p>
-    <w:p>
-      <w:pPr>
-        <w:spacing w:after="120" w:line="360" w:lineRule="auto"/>
-        <w:jc w:val="both"/>
-      </w:pPr>
-      <w:r>
-        <w:rPr>
-          <w:rFonts w:ascii="Arial" w:eastAsia="Arial" w:hAnsi="Arial"/>
-          <w:sz w:val="24"/>
-        </w:rPr>
-        <w:t>En cuanto a la Capacidad, estar en el hogar permite observar el entorno real del paciente: cómo</w:t>
-      </w:r>
-      <w:r>
-        <w:rPr>
-          <w:rFonts w:ascii="Arial" w:eastAsia="Arial" w:hAnsi="Arial"/>
-          <w:sz w:val="24"/>
-        </w:rPr>
-        <w:t xml:space="preserve"> y</w:t>
-      </w:r>
-      <w:r>
-        <w:rPr>
-          <w:rFonts w:ascii="Arial" w:eastAsia="Arial" w:hAnsi="Arial"/>
-          <w:sz w:val="24"/>
-        </w:rPr>
-        <w:t xml:space="preserve"> con quién vive, si cuenta con el apoyo de un familiar o un vecino. Esa información no está disponible en una atención de box y resulta valiosa para entender cómo usa realmente sus medicamentos. Además, </w:t>
-      </w:r>
-      <w:r>
-        <w:rPr>
-          <w:rFonts w:ascii="Arial" w:eastAsia="Arial" w:hAnsi="Arial"/>
-          <w:sz w:val="24"/>
-        </w:rPr>
-        <w:t>la visita domiciliaria permite identificar los medicamentos que el paciente almacena en diferentes espacios del hogar o adquiridos por iniciativa propia</w:t>
-      </w:r>
-      <w:r>
-        <w:rPr>
-          <w:rFonts w:ascii="Arial" w:eastAsia="Arial" w:hAnsi="Arial"/>
-          <w:sz w:val="24"/>
-        </w:rPr>
-        <w:t>,</w:t>
-      </w:r>
-      <w:r>
-        <w:rPr>
-          <w:rFonts w:ascii="Arial" w:eastAsia="Arial" w:hAnsi="Arial"/>
-          <w:sz w:val="24"/>
-        </w:rPr>
-        <w:t xml:space="preserve"> los cuales el paciente omite al momento de una consulta</w:t>
-      </w:r>
-      <w:r>
-        <w:rPr>
-          <w:rFonts w:ascii="Arial" w:eastAsia="Arial" w:hAnsi="Arial"/>
-          <w:sz w:val="24"/>
-        </w:rPr>
-        <w:t xml:space="preserve"> o control convencional</w:t>
-      </w:r>
-      <w:r>
-        <w:rPr>
-          <w:rFonts w:ascii="Arial" w:eastAsia="Arial" w:hAnsi="Arial"/>
-          <w:sz w:val="24"/>
-        </w:rPr>
-        <w:t xml:space="preserve">, </w:t>
-      </w:r>
-      <w:r>
-        <w:rPr>
-          <w:rFonts w:ascii="Arial" w:eastAsia="Arial" w:hAnsi="Arial"/>
-          <w:sz w:val="24"/>
-        </w:rPr>
-        <w:t xml:space="preserve">esta información adicional </w:t>
-      </w:r>
-      <w:r>
-        <w:rPr>
-          <w:rFonts w:ascii="Arial" w:eastAsia="Arial" w:hAnsi="Arial"/>
-          <w:sz w:val="24"/>
-        </w:rPr>
-        <w:t>enriquece la conciliación</w:t>
-      </w:r>
-      <w:r>
-        <w:rPr>
-          <w:rFonts w:ascii="Arial" w:eastAsia="Arial" w:hAnsi="Arial"/>
-          <w:sz w:val="24"/>
-        </w:rPr>
-        <w:t xml:space="preserve"> farmacéutica</w:t>
-      </w:r>
-      <w:r>
-        <w:rPr>
-          <w:rFonts w:ascii="Arial" w:eastAsia="Arial" w:hAnsi="Arial"/>
-          <w:sz w:val="24"/>
-        </w:rPr>
-        <w:t xml:space="preserve"> y mejora las decisiones que se toman sobre la </w:t>
-      </w:r>
-      <w:r>
-        <w:rPr>
-          <w:rFonts w:ascii="Arial" w:eastAsia="Arial" w:hAnsi="Arial"/>
-          <w:sz w:val="24"/>
-        </w:rPr>
-        <w:t>farmaco</w:t>
-      </w:r>
-      <w:r>
-        <w:rPr>
-          <w:rFonts w:ascii="Arial" w:eastAsia="Arial" w:hAnsi="Arial"/>
-          <w:sz w:val="24"/>
-        </w:rPr>
-        <w:t>terapia.</w:t>
-      </w:r>
-    </w:p>
-    <w:p>
-      <w:pPr>
-        <w:spacing w:after="120" w:line="360" w:lineRule="auto"/>
-        <w:jc w:val="both"/>
-      </w:pPr>
-      <w:r>
-        <w:rPr>
-          <w:rFonts w:ascii="Arial" w:eastAsia="Arial" w:hAnsi="Arial"/>
-          <w:sz w:val="24"/>
-        </w:rPr>
-        <w:t>En cuanto a</w:t>
-      </w:r>
-      <w:r>
-        <w:rPr>
-          <w:rFonts w:ascii="Arial" w:eastAsia="Arial" w:hAnsi="Arial"/>
-          <w:sz w:val="24"/>
-        </w:rPr>
-        <w:t xml:space="preserve"> la Motivación, las condiciones del hogar entregan señales sobre el estado anímico del paciente. Un lugar limpio y ordenado, o la presencia de alguien que lo acompañe, suele indicar que la persona se encuentra bien o que dispone de una red de apoyo, y esto puede actuar como un factor que favorece el uso</w:t>
-      </w:r>
-      <w:r>
-        <w:rPr>
-          <w:rFonts w:ascii="Arial" w:eastAsia="Arial" w:hAnsi="Arial"/>
-          <w:sz w:val="24"/>
-        </w:rPr>
-        <w:t xml:space="preserve"> racional</w:t>
-      </w:r>
-      <w:r>
-        <w:rPr>
-          <w:rFonts w:ascii="Arial" w:eastAsia="Arial" w:hAnsi="Arial"/>
-          <w:sz w:val="24"/>
-        </w:rPr>
-        <w:t xml:space="preserve"> de los medicamentos. En el fondo, un paciente que sigue su tratamiento lo hace porque quiere cuidar su salud</w:t>
-      </w:r>
-      <w:r>
-        <w:rPr>
-          <w:rFonts w:ascii="Arial" w:eastAsia="Arial" w:hAnsi="Arial"/>
-          <w:sz w:val="24"/>
-        </w:rPr>
-        <w:t>,</w:t>
-      </w:r>
-      <w:r>
-        <w:rPr>
-          <w:rFonts w:ascii="Arial" w:eastAsia="Arial" w:hAnsi="Arial"/>
-          <w:sz w:val="24"/>
-        </w:rPr>
-        <w:t xml:space="preserve"> espera mejorar sus patologías</w:t>
-      </w:r>
-      <w:r>
-        <w:rPr>
-          <w:rFonts w:ascii="Arial" w:eastAsia="Arial" w:hAnsi="Arial"/>
-          <w:sz w:val="24"/>
-        </w:rPr>
-        <w:t>,</w:t>
-      </w:r>
-      <w:r>
-        <w:rPr>
-          <w:rFonts w:ascii="Arial" w:eastAsia="Arial" w:hAnsi="Arial"/>
-          <w:sz w:val="24"/>
-        </w:rPr>
-        <w:t xml:space="preserve"> y reconocer esa disposición ayuda a reforzarla durante la entrevista.</w:t>
-      </w:r>
-    </w:p>
-    <w:p>
-      <w:pPr>
-        <w:spacing w:after="120" w:line="360" w:lineRule="auto"/>
-        <w:jc w:val="both"/>
-      </w:pPr>
-      <w:r>
-        <w:rPr>
-          <w:rFonts w:ascii="Arial" w:eastAsia="Arial" w:hAnsi="Arial"/>
-          <w:sz w:val="24"/>
-        </w:rPr>
-        <w:t xml:space="preserve">Finalmente, en cuanto a la Oportunidad, la visita al domicilio favorece un vínculo más cercano: al encontrarse en un espacio seguro, el paciente tiende a abrirse y a compartir más información, y gana confianza para preguntar y </w:t>
-      </w:r>
-      <w:r>
-        <w:rPr>
-          <w:rFonts w:ascii="Arial" w:eastAsia="Arial" w:hAnsi="Arial"/>
-          <w:sz w:val="24"/>
-        </w:rPr>
-        <w:t>aclarar</w:t>
-      </w:r>
-      <w:r>
-        <w:rPr>
-          <w:rFonts w:ascii="Arial" w:eastAsia="Arial" w:hAnsi="Arial"/>
-          <w:sz w:val="24"/>
-        </w:rPr>
-        <w:t xml:space="preserve"> sus dudas. Es</w:t>
-      </w:r>
-      <w:r>
-        <w:rPr>
-          <w:rFonts w:ascii="Arial" w:eastAsia="Arial" w:hAnsi="Arial"/>
-          <w:sz w:val="24"/>
-        </w:rPr>
-        <w:t>ta intervención constituye una oportunidad</w:t>
-      </w:r>
-      <w:r>
-        <w:rPr>
-          <w:rFonts w:ascii="Arial" w:eastAsia="Arial" w:hAnsi="Arial"/>
-          <w:sz w:val="24"/>
-        </w:rPr>
-        <w:t xml:space="preserve"> para recalcar el rol del </w:t>
-      </w:r>
-      <w:r>
-        <w:rPr>
-          <w:rFonts w:ascii="Arial" w:eastAsia="Arial" w:hAnsi="Arial"/>
-          <w:sz w:val="24"/>
-        </w:rPr>
-        <w:t>Químico Farmacéutico</w:t>
-      </w:r>
-      <w:r>
-        <w:rPr>
-          <w:rFonts w:ascii="Arial" w:eastAsia="Arial" w:hAnsi="Arial"/>
-          <w:sz w:val="24"/>
-        </w:rPr>
-        <w:t xml:space="preserve"> e </w:t>
-      </w:r>
-      <w:r>
-        <w:rPr>
-          <w:rFonts w:ascii="Arial" w:eastAsia="Arial" w:hAnsi="Arial"/>
-          <w:sz w:val="24"/>
-        </w:rPr>
-        <w:t>incentivar</w:t>
-      </w:r>
-      <w:r>
-        <w:rPr>
-          <w:rFonts w:ascii="Arial" w:eastAsia="Arial" w:hAnsi="Arial"/>
-          <w:sz w:val="24"/>
-        </w:rPr>
-        <w:t xml:space="preserve"> a acercarse a la farmacia o a comunicarse por vía telefónica cuando lo necesite. Sentirse </w:t>
-      </w:r>
-      <w:r>
-        <w:rPr>
-          <w:rFonts w:ascii="Arial" w:eastAsia="Arial" w:hAnsi="Arial"/>
-          <w:sz w:val="24"/>
-        </w:rPr>
-        <w:lastRenderedPageBreak/>
-        <w:t xml:space="preserve">acompañado a lo largo del tratamiento mejora el ánimo de los pacientes y los motiva a mantener su </w:t>
-      </w:r>
-      <w:commentRangeStart w:id="42"/>
-      <w:r>
-        <w:rPr>
-          <w:rFonts w:ascii="Arial" w:eastAsia="Arial" w:hAnsi="Arial"/>
-          <w:sz w:val="24"/>
-        </w:rPr>
-        <w:t>farmacoterapia.</w:t>
-      </w:r>
-      <w:commentRangeEnd w:id="42"/>
-      <w:r>
-        <w:rPr>
-          <w:rStyle w:val="Refdecomentario"/>
-          <w:sz w:val="24"/>
-          <w:szCs w:val="24"/>
-        </w:rPr>
-        <w:commentReference w:id="42"/>
-      </w:r>
-    </w:p>
-    <w:p>
-      <w:pPr>
         <w:pStyle w:val="Ttulo2"/>
       </w:pPr>
       <w:bookmarkStart w:id="43" w:name="_Toc234430365"/>
@@ -7011,174 +5454,12 @@
         <w:spacing w:after="120" w:line="360" w:lineRule="auto"/>
         <w:jc w:val="both"/>
       </w:pPr>
-      <w:r>
-        <w:rPr>
-          <w:rFonts w:ascii="Arial" w:eastAsia="Arial" w:hAnsi="Arial"/>
-          <w:sz w:val="24"/>
-        </w:rPr>
-        <w:t xml:space="preserve">Para poder aplicar el protocolo se seleccionaron y adaptaron herramientas sencillas, compatibles con la rutina del CESFAM. La adherencia se evalúa con el test de Morisky-Green-Levine de cuatro preguntas (Morisky, Green &amp; Levine, 1986), incluido en el Anexo 2, que en algunos casos se complementa con </w:t>
-      </w:r>
       <w:commentRangeStart w:id="45"/>
-      <w:r>
-        <w:rPr>
-          <w:rFonts w:ascii="Arial" w:eastAsia="Arial" w:hAnsi="Arial"/>
-          <w:sz w:val="24"/>
-        </w:rPr>
-        <w:t>el test de Batalla para conocer cuánto sabe el paciente de su enfermedad</w:t>
-      </w:r>
       <w:commentRangeEnd w:id="45"/>
-      <w:r>
-        <w:rPr>
-          <w:rStyle w:val="Refdecomentario"/>
-          <w:rFonts w:ascii="Arial" w:eastAsia="Arial" w:hAnsi="Arial"/>
-          <w:sz w:val="24"/>
-          <w:szCs w:val="24"/>
-        </w:rPr>
-        <w:commentReference w:id="45"/>
-      </w:r>
-      <w:r>
-        <w:rPr>
-          <w:rFonts w:ascii="Arial" w:eastAsia="Arial" w:hAnsi="Arial"/>
-          <w:sz w:val="24"/>
-        </w:rPr>
-        <w:t>u</w:t>
-      </w:r>
-      <w:r>
-        <w:rPr>
-          <w:rFonts w:ascii="Arial" w:eastAsia="Arial" w:hAnsi="Arial"/>
-          <w:sz w:val="24"/>
-        </w:rPr>
-        <w:t xml:space="preserve"> (Batalla et al., 1984). </w:t>
-      </w:r>
       <w:commentRangeStart w:id="46"/>
-      <w:r>
-        <w:rPr>
-          <w:rFonts w:ascii="Arial" w:eastAsia="Arial" w:hAnsi="Arial"/>
-          <w:sz w:val="24"/>
-        </w:rPr>
-        <w:t>Cuando están disponibles</w:t>
-      </w:r>
-      <w:r>
-        <w:rPr>
-          <w:rFonts w:ascii="Arial" w:eastAsia="Arial" w:hAnsi="Arial"/>
-          <w:sz w:val="24"/>
-        </w:rPr>
-        <w:t xml:space="preserve"> los exámenes de laboratorio y físicos,</w:t>
-      </w:r>
-      <w:r>
-        <w:rPr>
-          <w:rFonts w:ascii="Arial" w:eastAsia="Arial" w:hAnsi="Arial"/>
-          <w:sz w:val="24"/>
-        </w:rPr>
-        <w:t xml:space="preserve"> en la ficha clínica, se consideran parámetros como </w:t>
-      </w:r>
-      <w:r>
-        <w:rPr>
-          <w:rFonts w:ascii="Arial" w:eastAsia="Arial" w:hAnsi="Arial"/>
-          <w:sz w:val="24"/>
-          <w:szCs w:val="24"/>
-        </w:rPr>
-        <w:t>hemograma, perfil lipídico, glucosa, creatinina, velocidad de filtración glomerular, hemoglobina glicosilada, TSH, T4 libre, etc.</w:t>
-      </w:r>
-      <w:r>
-        <w:rPr>
-          <w:rFonts w:ascii="Arial" w:eastAsia="Arial" w:hAnsi="Arial"/>
-          <w:sz w:val="24"/>
-        </w:rPr>
-        <w:t xml:space="preserve">, </w:t>
-      </w:r>
-      <w:r>
-        <w:rPr>
-          <w:rFonts w:ascii="Arial" w:eastAsia="Arial" w:hAnsi="Arial"/>
-          <w:sz w:val="24"/>
-        </w:rPr>
-        <w:t xml:space="preserve">al momento de la visita domiciliaria, </w:t>
-      </w:r>
-      <w:r>
-        <w:rPr>
-          <w:rFonts w:ascii="Arial" w:eastAsia="Arial" w:hAnsi="Arial"/>
-          <w:sz w:val="24"/>
-        </w:rPr>
-        <w:t>esta información se complementa midiendo la presión arterial y la frecuencia cardíaca con un tensiómetro de brazo, una práctica ya habitual en las visitas</w:t>
-      </w:r>
-      <w:r>
-        <w:rPr>
-          <w:rFonts w:ascii="Arial" w:eastAsia="Arial" w:hAnsi="Arial"/>
-          <w:sz w:val="24"/>
-        </w:rPr>
-        <w:t>,</w:t>
-      </w:r>
-      <w:r>
-        <w:rPr>
-          <w:rFonts w:ascii="Arial" w:eastAsia="Arial" w:hAnsi="Arial"/>
-          <w:sz w:val="24"/>
-        </w:rPr>
-        <w:t xml:space="preserve"> que permite estimar</w:t>
-      </w:r>
-      <w:r>
-        <w:rPr>
-          <w:rFonts w:ascii="Arial" w:eastAsia="Arial" w:hAnsi="Arial"/>
-          <w:sz w:val="24"/>
-        </w:rPr>
-        <w:t>,</w:t>
-      </w:r>
-      <w:r>
-        <w:rPr>
-          <w:rFonts w:ascii="Arial" w:eastAsia="Arial" w:hAnsi="Arial"/>
-          <w:sz w:val="24"/>
-        </w:rPr>
-        <w:t xml:space="preserve"> en el momento</w:t>
-      </w:r>
-      <w:r>
-        <w:rPr>
-          <w:rFonts w:ascii="Arial" w:eastAsia="Arial" w:hAnsi="Arial"/>
-          <w:sz w:val="24"/>
-        </w:rPr>
-        <w:t>,</w:t>
-      </w:r>
-      <w:r>
-        <w:rPr>
-          <w:rFonts w:ascii="Arial" w:eastAsia="Arial" w:hAnsi="Arial"/>
-          <w:sz w:val="24"/>
-        </w:rPr>
-        <w:t xml:space="preserve"> el grado de compensación del paciente</w:t>
-      </w:r>
-      <w:r>
-        <w:rPr>
-          <w:rFonts w:ascii="Arial" w:eastAsia="Arial" w:hAnsi="Arial"/>
-          <w:sz w:val="24"/>
-        </w:rPr>
-        <w:t>,</w:t>
-      </w:r>
-      <w:r>
-        <w:rPr>
-          <w:rFonts w:ascii="Arial" w:eastAsia="Arial" w:hAnsi="Arial"/>
-          <w:sz w:val="24"/>
-        </w:rPr>
-        <w:t xml:space="preserve"> el resultado</w:t>
-      </w:r>
-      <w:r>
-        <w:rPr>
-          <w:rFonts w:ascii="Arial" w:eastAsia="Arial" w:hAnsi="Arial"/>
-          <w:sz w:val="24"/>
-        </w:rPr>
-        <w:t xml:space="preserve"> de esto</w:t>
-      </w:r>
-      <w:r>
-        <w:rPr>
-          <w:rFonts w:ascii="Arial" w:eastAsia="Arial" w:hAnsi="Arial"/>
-          <w:sz w:val="24"/>
-        </w:rPr>
-        <w:t xml:space="preserve"> queda registrado en la ficha clínica junto con el resto de los hallazgos de la visita.</w:t>
-      </w:r>
       <w:commentRangeEnd w:id="46"/>
       <w:r>
-        <w:rPr>
-          <w:rStyle w:val="Refdecomentario"/>
-          <w:sz w:val="24"/>
-          <w:szCs w:val="24"/>
-        </w:rPr>
-        <w:commentReference w:id="46"/>
+        <w:t>Para poder aplicar el protocolo se seleccionaron y adaptaron herramientas sencillas, compatibles con la rutina del CESFAM. La adherencia se evalúa con el test de Morisky-Green-Levine de cuatro preguntas (Morisky, Green &amp; Levine, 1986), incluido en el Anexo 2, que en algunos casos se complementa con el test de Batalla, el cual permite conocer el grado de conocimiento que el paciente tiene sobre su enfermedad (Batalla et al., 1984). Cuando están disponibles en la ficha clínica, se consideran los exámenes de laboratorio del paciente, como el hemograma, el perfil lipídico, la glucosa, la creatinina, la velocidad de filtración glomerular, la hemoglobina glicosilada o las pruebas tiroideas (TSH y T4 libre). Durante la visita domiciliaria esta información se complementa con la medición de la presión arterial y la frecuencia cardíaca mediante un tensiómetro de brazo, práctica ya habitual que permite estimar el grado de compensación del paciente en el momento.</w:t>
       </w:r>
     </w:p>
     <w:p>

</xml_diff>

<commit_message>
Avance 1: quita comentarios, logo/numeracion de portada, aplicar->diseno y separa resultados
- Elimina los 21 comentarios del profesor (ya corregidos).
- Portada: el logo USS queda solo en la portada y se quita de las demas
  paginas; se elimina el numero de pagina en la portada (numeracion romana en
  el resto de preliminares, arabiga en el cuerpo).
- Cambia 'aplicar/aplicabilidad/aplicacion' por lenguaje de diseno (se mantiene
  el enfoque de DISENO del protocolo); no se tocan citas ni la literatura.
- Separa resultados de metodologia: se crea el Capitulo III: Resultados y se
  mueve alli el diagnostico del programa y la Tabla 1; el 2.2 queda solo con el
  metodo (como se identificaron las brechas). Responde a #36/#37/#39.
- Mantiene la redaccion del autor y los tiempos verbales por capitulo.
</commit_message>
<xml_diff>
--- a/Tesis AVANCE 1 - Rev DJP.docx
+++ b/Tesis AVANCE 1 - Rev DJP.docx
@@ -611,7 +611,6 @@
         </w:rPr>
         <w:t xml:space="preserve"> </w:t>
       </w:r>
-      <w:commentRangeStart w:id="0"/>
       <w:r>
         <w:rPr>
           <w:rFonts w:ascii="Arial" w:hAnsi="Arial" w:cs="Arial"/>
@@ -622,7 +621,6 @@
         </w:rPr>
         <w:t>Palma</w:t>
       </w:r>
-      <w:commentRangeEnd w:id="0"/>
       <w:r>
         <w:rPr>
           <w:rStyle w:val="Refdecomentario"/>
@@ -633,7 +631,6 @@
           <w:szCs w:val="24"/>
           <w:lang w:val="es-MX"/>
         </w:rPr>
-        <w:commentReference w:id="0"/>
       </w:r>
     </w:p>
     <w:p>
@@ -1055,7 +1052,6 @@
         <w:lastRenderedPageBreak/>
         <w:t xml:space="preserve">HOJA DE </w:t>
       </w:r>
-      <w:commentRangeStart w:id="1"/>
       <w:r>
         <w:rPr>
           <w:rFonts w:ascii="Arial" w:hAnsi="Arial" w:cs="Arial"/>
@@ -1067,7 +1063,6 @@
         </w:rPr>
         <w:t>CALIFICACIÓN</w:t>
       </w:r>
-      <w:commentRangeEnd w:id="1"/>
       <w:r>
         <w:rPr>
           <w:rStyle w:val="Refdecomentario"/>
@@ -1078,7 +1073,6 @@
           <w:szCs w:val="24"/>
           <w:lang w:val="es-MX"/>
         </w:rPr>
-        <w:commentReference w:id="1"/>
       </w:r>
     </w:p>
     <w:p>
@@ -1484,7 +1478,6 @@
         <w:lastRenderedPageBreak/>
         <w:t xml:space="preserve">TABLA DE </w:t>
       </w:r>
-      <w:commentRangeStart w:id="2"/>
       <w:r>
         <w:rPr>
           <w:rFonts w:ascii="Arial" w:hAnsi="Arial" w:cs="Arial"/>
@@ -1496,14 +1489,12 @@
         </w:rPr>
         <w:t>CONTENIDOS</w:t>
       </w:r>
-      <w:commentRangeEnd w:id="2"/>
       <w:r>
         <w:rPr>
           <w:rStyle w:val="Refdecomentario"/>
           <w:sz w:val="24"/>
           <w:szCs w:val="24"/>
         </w:rPr>
-        <w:commentReference w:id="2"/>
       </w:r>
     </w:p>
     <w:sdt>
@@ -3442,10 +3433,13 @@
         <w:sectPr>
           <w:headerReference w:type="default" r:id="rId15"/>
           <w:footerReference w:type="default" r:id="rId16"/>
+          <w:headerReference w:type="first" r:id="rId11"/>
+          <w:footerReference w:type="first" r:id="rId12"/>
           <w:pgSz w:w="12240" w:h="15840" w:code="1"/>
           <w:pgMar w:top="1418" w:right="1418" w:bottom="1418" w:left="1418" w:header="709" w:footer="709" w:gutter="0"/>
           <w:pgNumType w:fmt="lowerRoman"/>
           <w:cols w:space="708"/>
+          <w:titlePg/>
           <w:docGrid w:linePitch="360"/>
         </w:sectPr>
       </w:pPr>
@@ -3585,10 +3579,6 @@
         <w:spacing w:after="120" w:line="360" w:lineRule="auto"/>
         <w:jc w:val="both"/>
       </w:pPr>
-      <w:commentRangeStart w:id="9"/>
-      <w:commentRangeEnd w:id="9"/>
-      <w:commentRangeStart w:id="10"/>
-      <w:commentRangeEnd w:id="10"/>
       <w:r>
         <w:t>El Centro de Salud Familiar (CESFAM) Villa Nonguén es un establecimiento de la Atención Primaria de Salud (APS) ubicado en el sector de Nonguén, en la periferia oriente de la comuna de Concepción, Región del Biobío. Forma parte de la red del Servicio de Salud Concepción y funciona bajo la modalidad de administración delegada a cargo de la Corporación de Salud y Desarrollo Social (COSADES), tras haber sido uno de los centros pioneros en la implementación del Modelo de Salud Familiar en el país (Diario Concepción, 2017; COSADES, s.f.). Atiende a una población inscrita cercana a las 16.760 personas, organizada en torno a unas 5.560 familias y distribuida en cuatro sectores, y entrega prestaciones a todos los grupos del ciclo vital. Su unidad de farmacia funciona con dos químicos farmacéuticos, uno a cargo de la dirección técnica y otro dedicado a la Atención Farmacéutica, y con un equipo permanente de cuatro técnicos en enfermería de nivel superior. Dentro del Programa de Salud Cardiovascular, el Químico Farmacéutico ya participa en la atención de los usuarios, tanto en box como en visitas domiciliarias, y realiza tareas de seguimiento, educación y revisión de la medicación.</w:t>
       </w:r>
@@ -3610,10 +3600,6 @@
         <w:spacing w:after="120" w:line="360" w:lineRule="auto"/>
         <w:jc w:val="both"/>
       </w:pPr>
-      <w:commentRangeStart w:id="9"/>
-      <w:commentRangeEnd w:id="9"/>
-      <w:commentRangeStart w:id="10"/>
-      <w:commentRangeEnd w:id="10"/>
       <w:r>
         <w:t>Las enfermedades cardiovasculares son una de las principales causas de muerte y discapacidad en el mundo y en Chile, en un país cuya población envejece y en el que las enfermedades crónicas son cada vez más frecuentes. La Encuesta Nacional de Salud 2016-2017 estimó que cerca del 27,6% de la población tiene sospecha de hipertensión, un 12,3% diabetes tipo 2 y alrededor del 60% algún grado de dislipidemia (Ministerio de Salud de Chile, 2017a). Una parte importante de los infartos y de los ataques cerebrales que se derivan de estas condiciones podría evitarse controlando a tiempo los factores de riesgo (Ministerio de Salud de Chile, 2017b); en esa tarea la Atención Primaria, a través del Programa de Salud Cardiovascular, cumple un papel central al pesquisar, clasificar y seguir a los pacientes.</w:t>
       </w:r>
@@ -3635,10 +3621,6 @@
         <w:spacing w:after="120" w:line="360" w:lineRule="auto"/>
         <w:jc w:val="both"/>
       </w:pPr>
-      <w:commentRangeStart w:id="9"/>
-      <w:commentRangeEnd w:id="9"/>
-      <w:commentRangeStart w:id="10"/>
-      <w:commentRangeEnd w:id="10"/>
       <w:r>
         <w:t>La Atención Farmacéutica se entiende hoy como la participación del farmacéutico en el cuidado de la persona para aprovechar mejor sus medicamentos y mejorar sus resultados en salud. Bonal y colaboradores la describen como el proceso por el cual el farmacéutico coopera con el paciente y con el resto del equipo en el diseño, la ejecución y el seguimiento de un plan terapéutico orientado a metas concretas (Bonal et al., 2003). Esto supone un cambio respecto del modelo clásico, centrado en entregar el medicamento, hacia otro que se preocupa de lo que ocurre con ese medicamento una vez que el paciente lo lleva a su casa.</w:t>
       </w:r>
@@ -3660,10 +3642,6 @@
         <w:spacing w:after="120" w:line="360" w:lineRule="auto"/>
         <w:jc w:val="both"/>
       </w:pPr>
-      <w:commentRangeStart w:id="9"/>
-      <w:commentRangeEnd w:id="9"/>
-      <w:commentRangeStart w:id="10"/>
-      <w:commentRangeEnd w:id="10"/>
       <w:r>
         <w:t>En la Atención Primaria chilena la incorporación del Químico Farmacéutico a los equipos ha sido un avance, pero todavía falta un método claro y compartido para guiar y evaluar su trabajo clínico en el domicilio. Sin ese método, cada profesional organiza la visita de acuerdo con su criterio, los resultados se vuelven difíciles de comparar y el aporte del farmacéutico queda poco visible para el resto del equipo.</w:t>
       </w:r>
@@ -3685,10 +3663,6 @@
         <w:spacing w:after="120" w:line="360" w:lineRule="auto"/>
         <w:jc w:val="both"/>
       </w:pPr>
-      <w:commentRangeStart w:id="9"/>
-      <w:commentRangeEnd w:id="9"/>
-      <w:commentRangeStart w:id="10"/>
-      <w:commentRangeEnd w:id="10"/>
       <w:r>
         <w:t>Más allá del recorrido y de los tipos de visita, conviene detenerse en el valor que aporta atender al paciente en su propio domicilio. La Atención Farmacéutica es una labor compleja, porque el paciente entrega información personal al Químico Farmacéutico, lo que exige del profesional habilidades de comunicación para generar un vínculo y la confianza necesarios para reunir todo lo que se requiere, tanto la farmacoterapia, como los problemas que la propia persona reconoce y así intervenir de forma adecuada. Si bien, la visita domiciliaria demanda más recursos que la atención en box, como el traslado y un mayor tiempo por los desplazamientos, ofrece una ventaja clara para abordar los tres pilares del Modelo CMO.</w:t>
       </w:r>
@@ -3698,10 +3672,6 @@
         <w:spacing w:after="120" w:line="360" w:lineRule="auto"/>
         <w:jc w:val="both"/>
       </w:pPr>
-      <w:commentRangeStart w:id="9"/>
-      <w:commentRangeEnd w:id="9"/>
-      <w:commentRangeStart w:id="10"/>
-      <w:commentRangeEnd w:id="10"/>
       <w:r>
         <w:t>En cuanto a la Capacidad, estar en el hogar permite observar el entorno real del paciente: cómo y con quién vive, si cuenta con el apoyo de un familiar o un vecino. Esa información no está disponible en una atención de box y resulta valiosa para entender cómo usa realmente sus medicamentos. Además, la visita domiciliaria permite identificar los medicamentos que el paciente almacena en diferentes espacios del hogar o adquiridos por iniciativa propia, los cuales el paciente omite al momento de una consulta o control convencional, esta información adicional enriquece la conciliación farmacéutica y mejora las decisiones que se toman sobre la farmacoterapia.</w:t>
       </w:r>
@@ -3711,10 +3681,6 @@
         <w:spacing w:after="120" w:line="360" w:lineRule="auto"/>
         <w:jc w:val="both"/>
       </w:pPr>
-      <w:commentRangeStart w:id="9"/>
-      <w:commentRangeEnd w:id="9"/>
-      <w:commentRangeStart w:id="10"/>
-      <w:commentRangeEnd w:id="10"/>
       <w:r>
         <w:t>En cuanto a la Motivación, las condiciones del hogar entregan señales sobre el estado anímico del paciente. Un lugar limpio y ordenado, o la presencia de alguien que lo acompañe, suele indicar que la persona se encuentra bien o que dispone de una red de apoyo, y esto puede actuar como un factor que favorece el uso racional de los medicamentos. En el fondo, un paciente que sigue su tratamiento lo hace porque quiere cuidar su salud, espera mejorar sus patologías, y reconocer esa disposición ayuda a reforzarla durante la entrevista.</w:t>
       </w:r>
@@ -3724,10 +3690,6 @@
         <w:spacing w:after="120" w:line="360" w:lineRule="auto"/>
         <w:jc w:val="both"/>
       </w:pPr>
-      <w:commentRangeStart w:id="9"/>
-      <w:commentRangeEnd w:id="9"/>
-      <w:commentRangeStart w:id="10"/>
-      <w:commentRangeEnd w:id="10"/>
       <w:r>
         <w:t>Finalmente, en cuanto a la Oportunidad, la visita al domicilio favorece un vínculo más cercano: al encontrarse en un espacio seguro, el paciente tiende a abrirse y a compartir más información, y gana confianza para preguntar y aclarar sus dudas. Esta intervención constituye una oportunidad para recalcar el rol del Químico Farmacéutico e incentivar a acercarse a la farmacia o a comunicarse por vía telefónica cuando lo necesite. Sentirse acompañado a lo largo del tratamiento mejora el ánimo de los pacientes y los motiva a mantener su farmacoterapia.</w:t>
       </w:r>
@@ -3749,10 +3711,6 @@
         <w:spacing w:after="120" w:line="360" w:lineRule="auto"/>
         <w:jc w:val="both"/>
       </w:pPr>
-      <w:commentRangeStart w:id="9"/>
-      <w:commentRangeEnd w:id="9"/>
-      <w:commentRangeStart w:id="10"/>
-      <w:commentRangeEnd w:id="10"/>
       <w:r>
         <w:t>Que un tratamiento esté indicado no asegura que el paciente lo tome como corresponde. La adherencia, entendida como el grado en que la persona sigue las indicaciones acordadas con el equipo de salud, es uno de los factores que más influye en el control de estas enfermedades y suele ser baja en quienes usan varios medicamentos a la vez (Haynes et al., 1979; Martín Alfonso, 2004; Morales &amp; Estela, 2015). En los usuarios que además dependen de otros o tienen dificultades para llegar al centro, la visita domiciliaria pasa a ser la mejor oportunidad para revisar la terapia, resolver dudas y reforzar la adherencia.</w:t>
       </w:r>
@@ -3762,10 +3720,6 @@
         <w:spacing w:after="120" w:line="360" w:lineRule="auto"/>
         <w:jc w:val="both"/>
       </w:pPr>
-      <w:commentRangeStart w:id="9"/>
-      <w:commentRangeEnd w:id="9"/>
-      <w:commentRangeStart w:id="10"/>
-      <w:commentRangeEnd w:id="10"/>
       <w:r>
         <w:t>La dificultad es mayor en los pacientes que toman muchos medicamentos, tienen problemas sociales o presentan condiciones propias de la edad, en quienes la adherencia es más frágil (Manzano García &amp; Morillo Verdugo, 2018).</w:t>
       </w:r>
@@ -3787,10 +3741,6 @@
         <w:spacing w:after="120" w:line="360" w:lineRule="auto"/>
         <w:jc w:val="both"/>
       </w:pPr>
-      <w:commentRangeStart w:id="9"/>
-      <w:commentRangeEnd w:id="9"/>
-      <w:commentRangeStart w:id="10"/>
-      <w:commentRangeEnd w:id="10"/>
       <w:r>
         <w:t>La forma de realizar una Atención Farmacéutica ha cambiado bastante en las últimas décadas. Al comienzo el trabajo giraba en torno al medicamento y al control del gasto, con poca estructura (Calleja Hernández &amp; Morillo Verdugo, 2016). A medida que la población envejeció y aparecieron más pacientes con varias enfermedades a la vez, ese enfoque resultó insuficiente. Para ordenar el seguimiento surgieron métodos como el Dáder y, en Chile, el POLARIS, que ofrecen una manera sistemática de detectar los problemas relacionados con los medicamentos (PRM) y los resultados negativos asociados a la medicación (RNM) (Plaza, 2018; Ministerio de Salud de Chile, 2018a, 2019). Para clasificar estos problemas se suele recurrir al Tercer Consenso de Granada, que ordena los RNM según, si el tratamiento es necesario, efectivo y seguro (Comité de Consenso de Granada, 2007). Estos métodos expuestos aportaron rigor, aunque llevarlos por completo a la Atención Primaria ha sido difícil, sobre todo en la parte conductual y en la logística de la visita a domicilio.</w:t>
       </w:r>
@@ -3812,10 +3762,6 @@
         <w:spacing w:after="120" w:line="360" w:lineRule="auto"/>
         <w:jc w:val="both"/>
       </w:pPr>
-      <w:commentRangeStart w:id="9"/>
-      <w:commentRangeEnd w:id="9"/>
-      <w:commentRangeStart w:id="10"/>
-      <w:commentRangeEnd w:id="10"/>
       <w:r>
         <w:t>Sobre esa base, el marco que hoy se usa como referencia para modernizar la Atención Farmacéutica es el Modelo CMO Capacidad, Motivación y Oportunidad, desarrollado en España y validado por su sociedad de farmacia hospitalaria (Calleja Hernández &amp; Morillo Verdugo, 2016). Su valor está en ordenar la atención en torno a tres ideas sencillas que se pueden llevar al domicilio del paciente; además, investigaciones recientes han aplicado este modelo en patologías de alta complejidad, como las coagulopatías congénitas (Juárez Giménez &amp; Morillo Verdugo, 2026), evidenciando su versatilidad clínica y su capacidad de adaptación a distintos contextos sociosanitarios.</w:t>
       </w:r>
@@ -3825,10 +3771,6 @@
         <w:spacing w:after="120" w:line="360" w:lineRule="auto"/>
         <w:jc w:val="both"/>
       </w:pPr>
-      <w:commentRangeStart w:id="9"/>
-      <w:commentRangeEnd w:id="9"/>
-      <w:commentRangeStart w:id="10"/>
-      <w:commentRangeEnd w:id="10"/>
       <w:r>
         <w:t>La Capacidad tiene directa relación con priorizar, en lugar de atender a todos por igual, propone concentrar el tiempo en los pacientes que más lo necesitan, usando criterios de riesgo y de complejidad para decidir a quién visitar primero (Manzano García &amp; Morillo Verdugo, 2018). La Motivación se centra en la relación con el paciente y en su adherencia: mediante la entrevista motivacional, el farmacéutico trabaja las creencias y las dificultades que llevan a alguien a no tomar bien su tratamiento y busca acuerdos en vez de limitarse a dar instrucciones (Manzano García et al., 2018). Por último, la Oportunidad apunta a llegar al paciente más allá del box en su casa, por teléfono o con apoyo de herramientas digitales para resolver a tiempo lo que vaya surgiendo (Juárez Giménez &amp; Morillo Verdugo, 2026). Son estos tres pilares los que dan forma al protocolo que aquí se propone.</w:t>
       </w:r>
@@ -3842,7 +3784,7 @@
       <w:bookmarkEnd w:id="13"/>
       <w:bookmarkEnd w:id="14"/>
       <w:r>
-        <w:t>1.9 Aplicación del Modelo CMO en el CESFAM Villa Nonguén</w:t>
+        <w:t>1.9 Diseño del protocolo bajo el Modelo CMO en el CESFAM Villa Nonguén</w:t>
       </w:r>
     </w:p>
     <w:p>
@@ -3850,10 +3792,6 @@
         <w:spacing w:after="120" w:line="360" w:lineRule="auto"/>
         <w:jc w:val="both"/>
       </w:pPr>
-      <w:commentRangeStart w:id="9"/>
-      <w:commentRangeEnd w:id="9"/>
-      <w:commentRangeStart w:id="10"/>
-      <w:commentRangeEnd w:id="10"/>
       <w:r>
         <w:t>El protocolo abarca el seguimiento farmacoterapéutico en el domicilio de los pacientes crónicos del Programa de Salud Cardiovascular, desde que se planifica la visita hasta que se registra lo realizado en la ficha clínica. La idea principal es traducir los tres pilares del Modelo CMO en pasos concretos: a quién priorizar, cómo abordar la adherencia durante la entrevista y cómo dar continuidad al seguimiento fuera del box.</w:t>
       </w:r>
@@ -3863,10 +3801,6 @@
         <w:spacing w:after="120" w:line="360" w:lineRule="auto"/>
         <w:jc w:val="both"/>
       </w:pPr>
-      <w:commentRangeStart w:id="9"/>
-      <w:commentRangeEnd w:id="9"/>
-      <w:commentRangeStart w:id="10"/>
-      <w:commentRangeEnd w:id="10"/>
       <w:r>
         <w:t>En la práctica, funciona como una guía para las tareas habituales del Químico Farmacéutico en el CESFAM: revisar el botiquín del hogar, conciliar la medicación que el paciente realmente toma con la que tiene indicada (Delgado et al., 2007) y educar de forma adaptada a cada persona. Al dejar estas tareas ordenadas en un flujograma se reduce la variabilidad entre profesionales y se facilita que el resto del equipo entienda qué hace el farmacéutico y con qué fin. El protocolo también incorpora criterios para clasificar los RNM y la gravedad de los errores de medicación, tomando como referencia el Consenso de Granada y el esquema del National Coordinating Council for Medication Error Reporting and Prevention (Forrey, Pedersen &amp; Schneider, 2007), lo que ayuda a derivar a tiempo y a fundamentar las interconsultas al médico tratante.</w:t>
       </w:r>
@@ -3876,10 +3810,6 @@
         <w:spacing w:after="120" w:line="360" w:lineRule="auto"/>
         <w:jc w:val="both"/>
       </w:pPr>
-      <w:commentRangeStart w:id="9"/>
-      <w:commentRangeEnd w:id="9"/>
-      <w:commentRangeStart w:id="10"/>
-      <w:commentRangeEnd w:id="10"/>
       <w:r>
         <w:t>La magnitud de esa necesidad había quedado documentada en el mismo centro. Una memoria anterior, que evaluó el programa de Atención Farmacéutica siguiendo a veinte usuarios, encontró que todos tenían al menos un problema relacionado con sus medicamentos y que solo el 15% era adherente al inicio del seguimiento, cifra que mejoró de manera importante tras la intervención del farmacéutico (Faúndez Navarrete, 2020). Ese resultado deja ver dos cosas: que el trabajo farmacéutico en terreno sí influye en los pacientes y que hasta ahora se ha hecho de una forma valiosa, pero poco sistematizada. De lo antes expuesto, surge la idea de esta memoria, cuyo objetivo es ordenar la labor en un protocolo que pueda repetirse y evaluarse.</w:t>
       </w:r>
@@ -3901,10 +3831,6 @@
         <w:spacing w:after="120" w:line="360" w:lineRule="auto"/>
         <w:jc w:val="both"/>
       </w:pPr>
-      <w:commentRangeStart w:id="9"/>
-      <w:commentRangeEnd w:id="9"/>
-      <w:commentRangeStart w:id="10"/>
-      <w:commentRangeEnd w:id="10"/>
       <w:r>
         <w:t>Las razones de contar con este protocolo son epidemiológicas y de gestión. A la carga de las enfermedades cardiovasculares se suma un motivo de gestión: ordenar la atención ayuda a aprovechar mejor el Fondo de Farmacia (FOFAR), que financia la presencia del Químico Farmacéutico en la Atención Primaria y el acceso a los medicamentos para la hipertensión, la diabetes y la dislipidemia (Ministerio de Salud de Chile, 2018b, 2020).</w:t>
       </w:r>
@@ -3914,10 +3840,6 @@
         <w:spacing w:after="120" w:line="360" w:lineRule="auto"/>
         <w:jc w:val="both"/>
       </w:pPr>
-      <w:commentRangeStart w:id="9"/>
-      <w:commentRangeEnd w:id="9"/>
-      <w:commentRangeStart w:id="10"/>
-      <w:commentRangeEnd w:id="10"/>
       <w:r>
         <w:t>Dado lo anterior, este trabajo propone un protocolo que estructure la entrevista, ayude a detectar a tiempo los problemas relacionados con los medicamentos y ordene el registro de lo realizado. La visita a domicilio consume bastante tiempo, por lo que conviene aprovechar bien cada instancia.</w:t>
       </w:r>
@@ -3927,10 +3849,6 @@
         <w:spacing w:after="120" w:line="360" w:lineRule="auto"/>
         <w:jc w:val="both"/>
       </w:pPr>
-      <w:commentRangeStart w:id="9"/>
-      <w:commentRangeEnd w:id="9"/>
-      <w:commentRangeStart w:id="10"/>
-      <w:commentRangeEnd w:id="10"/>
       <w:r>
         <w:t>El problema detectado es que esas visitas se llevan a cabo sin un procedimiento escrito y estandarizado que las respalde. Actualmente la atención ingresa por derivación y se prioriza a los pacientes más descompensados, y el Químico Farmacéutico, que cuenta con la formación necesaria para conducir la entrevista, deja constancia de lo realizado en la ficha clínica y en hojas de apoyo. Cabe considerar que lo que falta no es el criterio ni el registro, sino un documento común que ordene la priorización de los pacientes, la forma de conducir la visita y el registro de la atención, de modo que el trabajo sea trazable, comparable entre profesionales y posible de evaluar en el tiempo.</w:t>
       </w:r>
@@ -3952,12 +3870,8 @@
         <w:spacing w:after="120" w:line="360" w:lineRule="auto"/>
         <w:jc w:val="both"/>
       </w:pPr>
-      <w:commentRangeStart w:id="9"/>
-      <w:commentRangeEnd w:id="9"/>
-      <w:commentRangeStart w:id="10"/>
-      <w:commentRangeEnd w:id="10"/>
-      <w:r>
-        <w:t>El trabajo se acota a un contexto concreto para que el protocolo sea directamente aplicable. En lo territorial, se circunscribe al CESFAM Villa Nonguén y a la población a su cargo, en la comuna de Concepción, Región del Biobío. En lo temporal, el diagnóstico de las brechas y el diseño del protocolo se realizaron durante el periodo de internado, de cuatro meses. En lo poblacional, se orienta a personas adultas y mayores del Programa de Salud Cardiovascular, con prioridad en quienes están descompensados, toman muchos medicamentos, dependen de un cuidador o tienen dificultades para acudir con regularidad al centro de salud.</w:t>
+      <w:r>
+        <w:t>El trabajo se acota a un contexto concreto para que el protocolo resulte directamente utilizable. En lo territorial, se circunscribe al CESFAM Villa Nonguén y a la población a su cargo, en la comuna de Concepción, Región del Biobío. En lo temporal, el diagnóstico de las brechas y el diseño del protocolo se realizaron durante el periodo de internado, de cuatro meses. En lo poblacional, se orienta a personas adultas y mayores del Programa de Salud Cardiovascular, con prioridad en quienes están descompensados, toman muchos medicamentos, dependen de un cuidador o tienen dificultades para acudir con regularidad al centro de salud.</w:t>
       </w:r>
     </w:p>
     <w:p>
@@ -3977,10 +3891,6 @@
         <w:spacing w:after="120" w:line="360" w:lineRule="auto"/>
         <w:jc w:val="both"/>
       </w:pPr>
-      <w:commentRangeStart w:id="9"/>
-      <w:commentRangeEnd w:id="9"/>
-      <w:commentRangeStart w:id="10"/>
-      <w:commentRangeEnd w:id="10"/>
       <w:r>
         <w:t>¿Puede el diseño de un protocolo de Atención Farmacéutica domiciliaria basado en el Modelo CMO ordenar y hacer más trazable el seguimiento farmacoterapéutico de los pacientes adultos y mayores del Programa de Salud Cardiovascular del CESFAM Villa Nonguén, frente a la práctica actual no protocolizada?</w:t>
       </w:r>
@@ -4025,8 +3935,6 @@
         <w:spacing w:after="80" w:line="360" w:lineRule="auto"/>
         <w:jc w:val="both"/>
       </w:pPr>
-      <w:commentRangeStart w:id="27"/>
-      <w:commentRangeEnd w:id="27"/>
       <w:r>
         <w:t>1.  Identificar las brechas del programa de visitas domiciliarias que se realiza actualmente en el CESFAM Villa Nonguén.</w:t>
       </w:r>
@@ -4052,61 +3960,7 @@
         <w:jc w:val="both"/>
       </w:pPr>
       <w:r>
-        <w:rPr>
-          <w:rFonts w:ascii="Arial" w:eastAsia="Arial" w:hAnsi="Arial"/>
-          <w:sz w:val="24"/>
-        </w:rPr>
-        <w:t xml:space="preserve">3.  Diseñar los instrumentos y las herramientas clínicas necesarias para </w:t>
-      </w:r>
-      <w:commentRangeStart w:id="28"/>
-      <w:r>
-        <w:rPr>
-          <w:rFonts w:ascii="Arial" w:eastAsia="Arial" w:hAnsi="Arial"/>
-          <w:sz w:val="24"/>
-        </w:rPr>
-        <w:t>aplicar el protocolo</w:t>
-      </w:r>
-      <w:commentRangeEnd w:id="28"/>
-      <w:r>
-        <w:rPr>
-          <w:rStyle w:val="Refdecomentario"/>
-          <w:rFonts w:ascii="Arial" w:eastAsia="Arial" w:hAnsi="Arial"/>
-          <w:sz w:val="24"/>
-          <w:szCs w:val="24"/>
-        </w:rPr>
-        <w:commentReference w:id="28"/>
-      </w:r>
-      <w:r>
-        <w:rPr>
-          <w:rFonts w:ascii="Arial" w:eastAsia="Arial" w:hAnsi="Arial"/>
-          <w:sz w:val="24"/>
-        </w:rPr>
-        <w:t>, referidas a la ad</w:t>
-      </w:r>
-      <w:commentRangeStart w:id="29"/>
-      <w:r>
-        <w:rPr>
-          <w:rFonts w:ascii="Arial" w:eastAsia="Arial" w:hAnsi="Arial"/>
-          <w:sz w:val="24"/>
-        </w:rPr>
-        <w:t>he</w:t>
-      </w:r>
-      <w:commentRangeEnd w:id="29"/>
-      <w:r>
-        <w:rPr>
-          <w:rStyle w:val="Refdecomentario"/>
-          <w:rFonts w:ascii="Arial" w:eastAsia="Arial" w:hAnsi="Arial"/>
-          <w:sz w:val="24"/>
-          <w:szCs w:val="24"/>
-        </w:rPr>
-        <w:commentReference w:id="29"/>
-      </w:r>
-      <w:r>
-        <w:rPr>
-          <w:rFonts w:ascii="Arial" w:eastAsia="Arial" w:hAnsi="Arial"/>
-          <w:sz w:val="24"/>
-        </w:rPr>
-        <w:t>rencia, a los PRM y RNM y al registro de la atención.</w:t>
+        <w:t>3.  Diseñar los instrumentos y las herramientas clínicas del protocolo, referidas a la adherencia, a los PRM y RNM y al registro de la atención.</w:t>
       </w:r>
     </w:p>
     <w:p>
@@ -4149,28 +4003,7 @@
         </w:rPr>
       </w:pPr>
       <w:r>
-        <w:rPr>
-          <w:rFonts w:ascii="Arial" w:eastAsia="Arial" w:hAnsi="Arial"/>
-          <w:strike/>
-          <w:sz w:val="24"/>
-        </w:rPr>
-        <w:t xml:space="preserve">Esta memoria </w:t>
-      </w:r>
-      <w:r>
-        <w:rPr>
-          <w:rFonts w:ascii="Arial" w:eastAsia="Arial" w:hAnsi="Arial"/>
-          <w:strike/>
-          <w:sz w:val="24"/>
-        </w:rPr>
-        <w:t>comprende</w:t>
-      </w:r>
-      <w:r>
-        <w:rPr>
-          <w:rFonts w:ascii="Arial" w:eastAsia="Arial" w:hAnsi="Arial"/>
-          <w:strike/>
-          <w:sz w:val="24"/>
-        </w:rPr>
-        <w:t xml:space="preserve"> un trabajo de desarrollo metodológico: no se hizo un experimento ni se recogieron datos clínicos de pacientes, sino que se diseñó un protocolo a partir de la revisión de la literatura, del análisis de la normativa del Ministerio de Salud y de la adaptación de herramientas que ya se usan en la Atención Primaria. El diseño se ajustó a lo que se observó en el propio centro, para que resultara aplicable en la realidad del CESFAM.</w:t>
+        <w:t>Esta memoria comprende un trabajo de desarrollo metodológico: no se hizo un experimento ni se recogieron datos clínicos de pacientes, sino que se diseñó un protocolo a partir de la revisión de la literatura, del análisis de la normativa del Ministerio de Salud y de la adaptación de herramientas que ya se usan en la Atención Primaria. El diseño se ajustó a lo que se observó en el propio centro, para que resultara pertinente en la realidad del CESFAM.</w:t>
       </w:r>
     </w:p>
     <w:p>
@@ -4212,9 +4045,6 @@
       <w:r>
         <w:t>2.</w:t>
       </w:r>
-      <w:commentRangeStart w:id="36"/>
-      <w:commentRangeStart w:id="37"/>
-      <w:commentRangeStart w:id="38"/>
       <w:r>
         <w:t>2 Diagnóstico de las brechas del programa</w:t>
       </w:r>
@@ -4223,32 +4053,26 @@
         <w:t xml:space="preserve"> </w:t>
       </w:r>
       <w:bookmarkEnd w:id="35"/>
-      <w:commentRangeEnd w:id="36"/>
       <w:r>
         <w:rPr>
           <w:rStyle w:val="Refdecomentario"/>
           <w:sz w:val="24"/>
           <w:szCs w:val="26"/>
         </w:rPr>
-        <w:commentReference w:id="36"/>
-      </w:r>
-      <w:commentRangeEnd w:id="37"/>
+      </w:r>
       <w:r>
         <w:rPr>
           <w:rStyle w:val="Refdecomentario"/>
           <w:sz w:val="24"/>
           <w:szCs w:val="26"/>
         </w:rPr>
-        <w:commentReference w:id="37"/>
-      </w:r>
-      <w:commentRangeEnd w:id="38"/>
+      </w:r>
       <w:r>
         <w:rPr>
           <w:rStyle w:val="Refdecomentario"/>
           <w:sz w:val="24"/>
           <w:szCs w:val="26"/>
         </w:rPr>
-        <w:commentReference w:id="38"/>
       </w:r>
     </w:p>
     <w:p>
@@ -4257,812 +4081,9 @@
         <w:jc w:val="both"/>
       </w:pPr>
       <w:r>
-        <w:rPr>
-          <w:rFonts w:ascii="Arial" w:eastAsia="Arial" w:hAnsi="Arial"/>
-          <w:sz w:val="24"/>
-        </w:rPr>
-        <w:t>Se</w:t>
-      </w:r>
-      <w:r>
-        <w:rPr>
-          <w:rFonts w:ascii="Arial" w:eastAsia="Arial" w:hAnsi="Arial"/>
-          <w:sz w:val="24"/>
-        </w:rPr>
-        <w:t xml:space="preserve"> describió cómo se realizaba la visita domiciliaria en el CESFAM al inicio del internado y se comparó esa práctica con lo que plantean la Orientación Técnica del Programa de Salud Cardiovascular y del Fondo de Farmacia (Ministerio de Salud de Chile, 2017b, 2018b, 2020), la Guía de </w:t>
-      </w:r>
-      <w:r>
-        <w:rPr>
-          <w:rFonts w:ascii="Arial" w:eastAsia="Arial" w:hAnsi="Arial"/>
-          <w:sz w:val="24"/>
-        </w:rPr>
-        <w:t>Atención Farmacéutica</w:t>
-      </w:r>
-      <w:r>
-        <w:rPr>
-          <w:rFonts w:ascii="Arial" w:eastAsia="Arial" w:hAnsi="Arial"/>
-          <w:sz w:val="24"/>
-        </w:rPr>
-        <w:t xml:space="preserve"> y Seguimiento Farmacoterapéutico en APS (Ministerio de Salud de Chile, 2018a) y los tres pilares del Modelo CMO. La comparación se apoyó, además, en la evaluación previa del mismo programa (Faúndez Navarrete, 2020) y en la información entregada por el equipo de salud del centro.</w:t>
-      </w:r>
-    </w:p>
-    <w:p>
-      <w:pPr>
-        <w:spacing w:after="120" w:line="360" w:lineRule="auto"/>
-        <w:jc w:val="both"/>
-      </w:pPr>
-      <w:r>
-        <w:rPr>
-          <w:rFonts w:ascii="Arial" w:eastAsia="Arial" w:hAnsi="Arial"/>
-          <w:sz w:val="24"/>
-          <w:szCs w:val="24"/>
-        </w:rPr>
-        <w:t xml:space="preserve">En la práctica, la </w:t>
-      </w:r>
-      <w:r>
-        <w:rPr>
-          <w:rFonts w:ascii="Arial" w:eastAsia="Arial" w:hAnsi="Arial"/>
-          <w:sz w:val="24"/>
-          <w:szCs w:val="24"/>
-        </w:rPr>
-        <w:t>Atención Farmacéutica</w:t>
-      </w:r>
-      <w:r>
-        <w:rPr>
-          <w:rFonts w:ascii="Arial" w:eastAsia="Arial" w:hAnsi="Arial"/>
-          <w:sz w:val="24"/>
-          <w:szCs w:val="24"/>
-        </w:rPr>
-        <w:t xml:space="preserve"> domiciliaria del CESFAM ingresa solo por derivación de algún profesional del equipo medicina, enfermería, nutrición, kinesiología, psicología u otro y se programa en torno a unas 25 personas al mes, cifra que se fija cada año según lo que solicita el Servicio de Salud. Dentro de esas visitas se distinguen dos situaciones. Por un </w:t>
-      </w:r>
-      <w:r>
-        <w:rPr>
-          <w:rFonts w:ascii="Arial" w:eastAsia="Arial" w:hAnsi="Arial"/>
-          <w:sz w:val="24"/>
-          <w:szCs w:val="24"/>
-        </w:rPr>
-        <w:t>lado,</w:t>
-      </w:r>
-      <w:r>
-        <w:rPr>
-          <w:rFonts w:ascii="Arial" w:eastAsia="Arial" w:hAnsi="Arial"/>
-          <w:sz w:val="24"/>
-          <w:szCs w:val="24"/>
-        </w:rPr>
-        <w:t xml:space="preserve"> está el seguimiento farmacoterapéutico, dirigido a pacientes descompensados, que contempla al menos tres visitas por persona, o más si el caso lo requiere. Por otro</w:t>
-      </w:r>
-      <w:r>
-        <w:rPr>
-          <w:rFonts w:ascii="Arial" w:eastAsia="Arial" w:hAnsi="Arial"/>
-          <w:sz w:val="24"/>
-          <w:szCs w:val="24"/>
-        </w:rPr>
-        <w:t xml:space="preserve"> lado,</w:t>
-      </w:r>
-      <w:r>
-        <w:rPr>
-          <w:rFonts w:ascii="Arial" w:eastAsia="Arial" w:hAnsi="Arial"/>
-          <w:sz w:val="24"/>
-          <w:szCs w:val="24"/>
-        </w:rPr>
-        <w:t xml:space="preserve"> están las visitas puntuales, para usuarios derivados por posible falta de adherencia, </w:t>
-      </w:r>
-      <w:r>
-        <w:rPr>
-          <w:rFonts w:ascii="Arial" w:eastAsia="Arial" w:hAnsi="Arial"/>
-          <w:sz w:val="24"/>
-          <w:szCs w:val="24"/>
-        </w:rPr>
-        <w:t>el</w:t>
-      </w:r>
-      <w:r>
-        <w:rPr>
-          <w:rFonts w:ascii="Arial" w:eastAsia="Arial" w:hAnsi="Arial"/>
-          <w:sz w:val="24"/>
-          <w:szCs w:val="24"/>
-        </w:rPr>
-        <w:t xml:space="preserve"> inicio de un tratamiento que aún no comprenden, polifarmacia o </w:t>
-      </w:r>
-      <w:r>
-        <w:rPr>
-          <w:rFonts w:ascii="Arial" w:eastAsia="Arial" w:hAnsi="Arial"/>
-          <w:sz w:val="24"/>
-          <w:szCs w:val="24"/>
-        </w:rPr>
-        <w:lastRenderedPageBreak/>
-        <w:t xml:space="preserve">edad avanzada, en las que se </w:t>
-      </w:r>
-      <w:r>
-        <w:rPr>
-          <w:rFonts w:ascii="Arial" w:eastAsia="Arial" w:hAnsi="Arial"/>
-          <w:sz w:val="24"/>
-          <w:szCs w:val="24"/>
-        </w:rPr>
-        <w:t>evalúa</w:t>
-      </w:r>
-      <w:r>
-        <w:rPr>
-          <w:rFonts w:ascii="Arial" w:eastAsia="Arial" w:hAnsi="Arial"/>
-          <w:sz w:val="24"/>
-          <w:szCs w:val="24"/>
-        </w:rPr>
-        <w:t xml:space="preserve"> cómo están usando sus medicamentos. La repartición de las visitas a lo largo del mes depende, sobre todo, del tiempo y la disponibilidad del profesional.</w:t>
-      </w:r>
-    </w:p>
-    <w:p>
-      <w:pPr>
-        <w:spacing w:after="120" w:line="360" w:lineRule="auto"/>
-        <w:jc w:val="both"/>
-      </w:pPr>
-      <w:r>
-        <w:rPr>
-          <w:rFonts w:ascii="Arial" w:eastAsia="Arial" w:hAnsi="Arial"/>
-          <w:sz w:val="24"/>
-          <w:szCs w:val="24"/>
-        </w:rPr>
-        <w:t>En cuanto al registro</w:t>
-      </w:r>
-      <w:r>
-        <w:rPr>
-          <w:rFonts w:ascii="Arial" w:eastAsia="Arial" w:hAnsi="Arial"/>
-          <w:sz w:val="24"/>
-          <w:szCs w:val="24"/>
-        </w:rPr>
-        <w:t>,</w:t>
-      </w:r>
-      <w:r>
-        <w:rPr>
-          <w:rFonts w:ascii="Arial" w:eastAsia="Arial" w:hAnsi="Arial"/>
-          <w:sz w:val="24"/>
-          <w:szCs w:val="24"/>
-        </w:rPr>
-        <w:t xml:space="preserve"> </w:t>
-      </w:r>
-      <w:r>
-        <w:rPr>
-          <w:rFonts w:ascii="Arial" w:eastAsia="Arial" w:hAnsi="Arial"/>
-          <w:sz w:val="24"/>
-          <w:szCs w:val="24"/>
-        </w:rPr>
-        <w:t>a</w:t>
-      </w:r>
-      <w:r>
-        <w:rPr>
-          <w:rFonts w:ascii="Arial" w:eastAsia="Arial" w:hAnsi="Arial"/>
-          <w:sz w:val="24"/>
-          <w:szCs w:val="24"/>
-        </w:rPr>
-        <w:t xml:space="preserve">ntes de cada visita el profesional revisa en la ficha clínica electrónica (SINET Sur) los exámenes de laboratorio disponibles (hemograma, perfil lipídico, glucosa, creatinina, velocidad de filtración glomerular, hemoglobina glicosilada, TSH, T4 libre, etc.) y los anota en una hoja de trabajo que lleva al domicilio. </w:t>
-      </w:r>
-      <w:r>
-        <w:rPr>
-          <w:rFonts w:ascii="Arial" w:eastAsia="Arial" w:hAnsi="Arial"/>
-          <w:sz w:val="24"/>
-          <w:szCs w:val="24"/>
-        </w:rPr>
-        <w:t>La</w:t>
-      </w:r>
-      <w:r>
-        <w:rPr>
-          <w:rFonts w:ascii="Arial" w:eastAsia="Arial" w:hAnsi="Arial"/>
-          <w:sz w:val="24"/>
-          <w:szCs w:val="24"/>
-        </w:rPr>
-        <w:t xml:space="preserve"> hoja </w:t>
-      </w:r>
-      <w:r>
-        <w:rPr>
-          <w:rFonts w:ascii="Arial" w:eastAsia="Arial" w:hAnsi="Arial"/>
-          <w:sz w:val="24"/>
-          <w:szCs w:val="24"/>
-        </w:rPr>
-        <w:t xml:space="preserve">también </w:t>
-      </w:r>
-      <w:r>
-        <w:rPr>
-          <w:rFonts w:ascii="Arial" w:eastAsia="Arial" w:hAnsi="Arial"/>
-          <w:sz w:val="24"/>
-          <w:szCs w:val="24"/>
-        </w:rPr>
-        <w:t xml:space="preserve">consigna los diagnósticos del paciente y el listado de sus medicamentos con sus dosis y horarios, y se apoya en una pauta con los temas que debe revisar durante la visita, como la educación sobre la terapia, la conciliación de la medicación, las interacciones, la detección de reacciones adversas, la cronofarmacología, el almacenamiento y los vencimientos, la técnica de administración de insulina, las alergias, el sueño y el apetito, que va marcando a medida que los aborda. Además, durante la visita mide la presión arterial del paciente con un tensiómetro para estimar su grado de compensación y, al regresar al centro, deja constancia de lo realizado en la ficha clínica. </w:t>
-      </w:r>
-      <w:r>
-        <w:rPr>
-          <w:rFonts w:ascii="Arial" w:eastAsia="Arial" w:hAnsi="Arial"/>
-          <w:sz w:val="24"/>
-          <w:szCs w:val="24"/>
-        </w:rPr>
-        <w:t>En consecuencia, el problema no radica en la falta de registro, sino en que los apoyos utilizados son de carácter individual y no corresponden a un instrumento estandarizado y compartido.</w:t>
-      </w:r>
-    </w:p>
-    <w:p>
-      <w:pPr>
-        <w:spacing w:after="120" w:line="360" w:lineRule="auto"/>
-        <w:jc w:val="both"/>
-      </w:pPr>
-      <w:r>
-        <w:rPr>
-          <w:rFonts w:ascii="Arial" w:eastAsia="Arial" w:hAnsi="Arial"/>
-          <w:sz w:val="24"/>
-          <w:szCs w:val="24"/>
-        </w:rPr>
-        <w:t xml:space="preserve">Al comparar ese funcionamiento con la norma y con el Modelo CMO surgen tres brechas principales. La primera, ligada a la Capacidad, </w:t>
-      </w:r>
-      <w:r>
-        <w:rPr>
-          <w:rFonts w:ascii="Arial" w:eastAsia="Arial" w:hAnsi="Arial"/>
-          <w:sz w:val="24"/>
-          <w:szCs w:val="24"/>
-        </w:rPr>
-        <w:t>radica en</w:t>
-      </w:r>
-      <w:r>
-        <w:rPr>
-          <w:rFonts w:ascii="Arial" w:eastAsia="Arial" w:hAnsi="Arial"/>
-          <w:sz w:val="24"/>
-          <w:szCs w:val="24"/>
-        </w:rPr>
-        <w:t xml:space="preserve"> que el ingreso depende de la derivación de otros profesionales y del tiempo disponible y que, si bien en la práctica se prioriza a los pacientes más descompensados, no existe un criterio de estratificación de riesgo estandarizado que el propio farmacéutico aplique para decidir a quién priorizar. La segunda, ligada a la Motivación, </w:t>
-      </w:r>
-      <w:r>
-        <w:rPr>
-          <w:rFonts w:ascii="Arial" w:eastAsia="Arial" w:hAnsi="Arial"/>
-          <w:sz w:val="24"/>
-          <w:szCs w:val="24"/>
-        </w:rPr>
-        <w:t>es que gran parte de</w:t>
-      </w:r>
-      <w:r>
-        <w:rPr>
-          <w:rFonts w:ascii="Arial" w:eastAsia="Arial" w:hAnsi="Arial"/>
-          <w:sz w:val="24"/>
-          <w:szCs w:val="24"/>
-        </w:rPr>
-        <w:t xml:space="preserve"> las derivaciones responde justamente a problemas de adherencia o a pacientes que no comprenden su tratamiento, pero no hay una forma protocolizada de abordar esas barreras ni de educar, de modo que la intervención queda a criterio de cada visita. La tercera, ligada a la Oportunidad, </w:t>
-      </w:r>
-      <w:r>
-        <w:rPr>
-          <w:rFonts w:ascii="Arial" w:eastAsia="Arial" w:hAnsi="Arial"/>
-          <w:sz w:val="24"/>
-          <w:szCs w:val="24"/>
-        </w:rPr>
-        <w:t>indica</w:t>
-      </w:r>
-      <w:r>
-        <w:rPr>
-          <w:rFonts w:ascii="Arial" w:eastAsia="Arial" w:hAnsi="Arial"/>
-          <w:sz w:val="24"/>
-          <w:szCs w:val="24"/>
-        </w:rPr>
-        <w:t xml:space="preserve"> </w:t>
-      </w:r>
-      <w:r>
-        <w:rPr>
-          <w:rFonts w:ascii="Arial" w:eastAsia="Arial" w:hAnsi="Arial"/>
-          <w:sz w:val="24"/>
-          <w:szCs w:val="24"/>
-        </w:rPr>
-        <w:t xml:space="preserve">que </w:t>
-      </w:r>
-      <w:r>
-        <w:rPr>
-          <w:rFonts w:ascii="Arial" w:eastAsia="Arial" w:hAnsi="Arial"/>
-          <w:sz w:val="24"/>
-          <w:szCs w:val="24"/>
-        </w:rPr>
-        <w:t xml:space="preserve">el número y la frecuencia de las visitas se ajustan caso a caso según la disponibilidad y que, si bien el registro se realiza en la ficha clínica electrónica del establecimiento (SINET Sur) y en hojas de apoyo personales, lo que aporta cierta trazabilidad, no existe un instrumento de registro estandarizado y propio de la </w:t>
-      </w:r>
-      <w:r>
-        <w:rPr>
-          <w:rFonts w:ascii="Arial" w:eastAsia="Arial" w:hAnsi="Arial"/>
-          <w:sz w:val="24"/>
-          <w:szCs w:val="24"/>
-        </w:rPr>
-        <w:t xml:space="preserve">Atención </w:t>
-      </w:r>
-      <w:r>
-        <w:rPr>
-          <w:rFonts w:ascii="Arial" w:eastAsia="Arial" w:hAnsi="Arial"/>
-          <w:sz w:val="24"/>
-          <w:szCs w:val="24"/>
-        </w:rPr>
-        <w:lastRenderedPageBreak/>
-        <w:t>Farmacéutica</w:t>
-      </w:r>
-      <w:r>
-        <w:rPr>
-          <w:rFonts w:ascii="Arial" w:eastAsia="Arial" w:hAnsi="Arial"/>
-          <w:sz w:val="24"/>
-          <w:szCs w:val="24"/>
-        </w:rPr>
-        <w:t xml:space="preserve"> domiciliaria que facilite el seguimiento y la comparación entre profesionales. La Tabla 1 resume estas brechas, que son las que el protocolo busca cerrar.</w:t>
-      </w:r>
-    </w:p>
-    <w:p>
-      <w:pPr>
-        <w:rPr>
-          <w:rFonts w:ascii="Arial" w:eastAsia="Arial" w:hAnsi="Arial" w:cs="Arial"/>
-          <w:sz w:val="24"/>
-          <w:szCs w:val="24"/>
-        </w:rPr>
-      </w:pPr>
-      <w:r>
-        <w:rPr>
-          <w:rFonts w:ascii="Arial" w:eastAsia="Arial" w:hAnsi="Arial" w:cs="Arial"/>
-          <w:sz w:val="24"/>
-          <w:szCs w:val="24"/>
-        </w:rPr>
-        <w:t xml:space="preserve">Tabla </w:t>
-      </w:r>
-      <w:r>
-        <w:rPr>
-          <w:rFonts w:ascii="Arial" w:eastAsia="Arial" w:hAnsi="Arial" w:cs="Arial"/>
-          <w:sz w:val="24"/>
-          <w:szCs w:val="24"/>
-        </w:rPr>
-        <w:t>1</w:t>
-      </w:r>
-      <w:r>
-        <w:rPr>
-          <w:rFonts w:ascii="Arial" w:eastAsia="Arial" w:hAnsi="Arial" w:cs="Arial"/>
-          <w:sz w:val="24"/>
-          <w:szCs w:val="24"/>
-        </w:rPr>
-        <w:t>. Brechas del programa de visitas domiciliarias según los pilares del Modelo CMO.</w:t>
-      </w:r>
-    </w:p>
-    <w:tbl>
-      <w:tblPr>
-        <w:tblStyle w:val="Tablaconcuadrcula"/>
-        <w:tblW w:w="0" w:type="auto"/>
-        <w:jc w:val="center"/>
-        <w:tblLook w:val="04A0" w:firstRow="1" w:lastRow="0" w:firstColumn="1" w:lastColumn="0" w:noHBand="0" w:noVBand="1"/>
-      </w:tblPr>
-      <w:tblGrid>
-        <w:gridCol w:w="2318"/>
-        <w:gridCol w:w="2321"/>
-        <w:gridCol w:w="2431"/>
-        <w:gridCol w:w="2324"/>
-      </w:tblGrid>
-      <w:tr>
-        <w:trPr>
-          <w:jc w:val="center"/>
-        </w:trPr>
-        <w:tc>
-          <w:tcPr>
-            <w:tcW w:w="2351" w:type="dxa"/>
-          </w:tcPr>
-          <w:p>
-            <w:pPr>
-              <w:rPr>
-                <w:rFonts w:ascii="Arial" w:eastAsia="Arial" w:hAnsi="Arial" w:cs="Arial"/>
-                <w:b/>
-                <w:bCs/>
-                <w:sz w:val="24"/>
-                <w:szCs w:val="24"/>
-              </w:rPr>
-            </w:pPr>
-            <w:r>
-              <w:rPr>
-                <w:rFonts w:ascii="Arial" w:eastAsia="Arial" w:hAnsi="Arial" w:cs="Arial"/>
-                <w:b/>
-                <w:bCs/>
-                <w:sz w:val="24"/>
-                <w:szCs w:val="24"/>
-              </w:rPr>
-              <w:t>Pilar del Modelo CMO</w:t>
-            </w:r>
-          </w:p>
-        </w:tc>
-        <w:tc>
-          <w:tcPr>
-            <w:tcW w:w="2351" w:type="dxa"/>
-          </w:tcPr>
-          <w:p>
-            <w:pPr>
-              <w:rPr>
-                <w:rFonts w:ascii="Arial" w:eastAsia="Arial" w:hAnsi="Arial" w:cs="Arial"/>
-                <w:b/>
-                <w:bCs/>
-                <w:sz w:val="24"/>
-                <w:szCs w:val="24"/>
-              </w:rPr>
-            </w:pPr>
-            <w:r>
-              <w:rPr>
-                <w:rFonts w:ascii="Arial" w:eastAsia="Arial" w:hAnsi="Arial" w:cs="Arial"/>
-                <w:b/>
-                <w:bCs/>
-                <w:sz w:val="24"/>
-                <w:szCs w:val="24"/>
-              </w:rPr>
-              <w:t>Lo que se espera</w:t>
-            </w:r>
-          </w:p>
-        </w:tc>
-        <w:tc>
-          <w:tcPr>
-            <w:tcW w:w="2351" w:type="dxa"/>
-          </w:tcPr>
-          <w:p>
-            <w:pPr>
-              <w:rPr>
-                <w:rFonts w:ascii="Arial" w:eastAsia="Arial" w:hAnsi="Arial" w:cs="Arial"/>
-                <w:b/>
-                <w:bCs/>
-                <w:sz w:val="24"/>
-                <w:szCs w:val="24"/>
-              </w:rPr>
-            </w:pPr>
-            <w:r>
-              <w:rPr>
-                <w:rFonts w:ascii="Arial" w:eastAsia="Arial" w:hAnsi="Arial" w:cs="Arial"/>
-                <w:b/>
-                <w:bCs/>
-                <w:sz w:val="24"/>
-                <w:szCs w:val="24"/>
-              </w:rPr>
-              <w:t>Lo observado</w:t>
-            </w:r>
-          </w:p>
-        </w:tc>
-        <w:tc>
-          <w:tcPr>
-            <w:tcW w:w="2351" w:type="dxa"/>
-          </w:tcPr>
-          <w:p>
-            <w:pPr>
-              <w:rPr>
-                <w:rFonts w:ascii="Arial" w:eastAsia="Arial" w:hAnsi="Arial" w:cs="Arial"/>
-                <w:b/>
-                <w:bCs/>
-                <w:sz w:val="24"/>
-                <w:szCs w:val="24"/>
-              </w:rPr>
-            </w:pPr>
-            <w:r>
-              <w:rPr>
-                <w:rFonts w:ascii="Arial" w:eastAsia="Arial" w:hAnsi="Arial" w:cs="Arial"/>
-                <w:b/>
-                <w:bCs/>
-                <w:sz w:val="24"/>
-                <w:szCs w:val="24"/>
-              </w:rPr>
-              <w:t>Brecha</w:t>
-            </w:r>
-          </w:p>
-        </w:tc>
-      </w:tr>
-      <w:tr>
-        <w:trPr>
-          <w:jc w:val="center"/>
-        </w:trPr>
-        <w:tc>
-          <w:tcPr>
-            <w:tcW w:w="2351" w:type="dxa"/>
-          </w:tcPr>
-          <w:p>
-            <w:pPr>
-              <w:rPr>
-                <w:rFonts w:ascii="Arial" w:eastAsia="Arial" w:hAnsi="Arial" w:cs="Arial"/>
-                <w:sz w:val="24"/>
-                <w:szCs w:val="24"/>
-              </w:rPr>
-            </w:pPr>
-            <w:r>
-              <w:rPr>
-                <w:rFonts w:ascii="Arial" w:eastAsia="Arial" w:hAnsi="Arial" w:cs="Arial"/>
-                <w:sz w:val="24"/>
-                <w:szCs w:val="24"/>
-              </w:rPr>
-              <w:t>Capacidad</w:t>
-            </w:r>
-          </w:p>
-        </w:tc>
-        <w:tc>
-          <w:tcPr>
-            <w:tcW w:w="2351" w:type="dxa"/>
-          </w:tcPr>
-          <w:p>
-            <w:pPr>
-              <w:rPr>
-                <w:rFonts w:ascii="Arial" w:eastAsia="Arial" w:hAnsi="Arial" w:cs="Arial"/>
-                <w:sz w:val="24"/>
-                <w:szCs w:val="24"/>
-              </w:rPr>
-            </w:pPr>
-            <w:r>
-              <w:rPr>
-                <w:rFonts w:ascii="Arial" w:eastAsia="Arial" w:hAnsi="Arial" w:cs="Arial"/>
-                <w:sz w:val="24"/>
-                <w:szCs w:val="24"/>
-              </w:rPr>
-              <w:t>Priorizar la visita según el riesgo y la complejidad del paciente.</w:t>
-            </w:r>
-          </w:p>
-        </w:tc>
-        <w:tc>
-          <w:tcPr>
-            <w:tcW w:w="2351" w:type="dxa"/>
-          </w:tcPr>
-          <w:p>
-            <w:pPr>
-              <w:rPr>
-                <w:rFonts w:ascii="Arial" w:eastAsia="Arial" w:hAnsi="Arial" w:cs="Arial"/>
-                <w:sz w:val="24"/>
-                <w:szCs w:val="24"/>
-              </w:rPr>
-            </w:pPr>
-            <w:r>
-              <w:rPr>
-                <w:rFonts w:ascii="Arial" w:eastAsia="Arial" w:hAnsi="Arial" w:cs="Arial"/>
-                <w:sz w:val="24"/>
-                <w:szCs w:val="24"/>
-              </w:rPr>
-              <w:t>El ingreso depende de la derivación y del tiempo disponible (unas 25 visitas al mes).</w:t>
-            </w:r>
-          </w:p>
-        </w:tc>
-        <w:tc>
-          <w:tcPr>
-            <w:tcW w:w="2351" w:type="dxa"/>
-          </w:tcPr>
-          <w:p>
-            <w:pPr>
-              <w:rPr>
-                <w:rFonts w:ascii="Arial" w:eastAsia="Arial" w:hAnsi="Arial" w:cs="Arial"/>
-                <w:sz w:val="24"/>
-                <w:szCs w:val="24"/>
-              </w:rPr>
-            </w:pPr>
-            <w:r>
-              <w:rPr>
-                <w:rFonts w:ascii="Arial" w:eastAsia="Arial" w:hAnsi="Arial" w:cs="Arial"/>
-                <w:sz w:val="24"/>
-                <w:szCs w:val="24"/>
-              </w:rPr>
-              <w:t xml:space="preserve">No </w:t>
-            </w:r>
-            <w:r>
-              <w:rPr>
-                <w:rFonts w:ascii="Arial" w:eastAsia="Arial" w:hAnsi="Arial" w:cs="Arial"/>
-                <w:sz w:val="24"/>
-                <w:szCs w:val="24"/>
-              </w:rPr>
-              <w:t>existe</w:t>
-            </w:r>
-            <w:r>
-              <w:rPr>
-                <w:rFonts w:ascii="Arial" w:eastAsia="Arial" w:hAnsi="Arial" w:cs="Arial"/>
-                <w:sz w:val="24"/>
-                <w:szCs w:val="24"/>
-              </w:rPr>
-              <w:t xml:space="preserve"> un criterio de estratificación de riesgo propio del farmacéutico.</w:t>
-            </w:r>
-          </w:p>
-        </w:tc>
-      </w:tr>
-      <w:tr>
-        <w:trPr>
-          <w:jc w:val="center"/>
-        </w:trPr>
-        <w:tc>
-          <w:tcPr>
-            <w:tcW w:w="2351" w:type="dxa"/>
-          </w:tcPr>
-          <w:p>
-            <w:pPr>
-              <w:rPr>
-                <w:rFonts w:ascii="Arial" w:eastAsia="Arial" w:hAnsi="Arial" w:cs="Arial"/>
-                <w:sz w:val="24"/>
-                <w:szCs w:val="24"/>
-              </w:rPr>
-            </w:pPr>
-            <w:r>
-              <w:rPr>
-                <w:rFonts w:ascii="Arial" w:eastAsia="Arial" w:hAnsi="Arial" w:cs="Arial"/>
-                <w:sz w:val="24"/>
-                <w:szCs w:val="24"/>
-              </w:rPr>
-              <w:t>Motivación</w:t>
-            </w:r>
-          </w:p>
-        </w:tc>
-        <w:tc>
-          <w:tcPr>
-            <w:tcW w:w="2351" w:type="dxa"/>
-          </w:tcPr>
-          <w:p>
-            <w:pPr>
-              <w:rPr>
-                <w:rFonts w:ascii="Arial" w:eastAsia="Arial" w:hAnsi="Arial" w:cs="Arial"/>
-                <w:sz w:val="24"/>
-                <w:szCs w:val="24"/>
-              </w:rPr>
-            </w:pPr>
-            <w:r>
-              <w:rPr>
-                <w:rFonts w:ascii="Arial" w:eastAsia="Arial" w:hAnsi="Arial" w:cs="Arial"/>
-                <w:sz w:val="24"/>
-                <w:szCs w:val="24"/>
-              </w:rPr>
-              <w:t>Abordar la adherencia con entrevista motivacional estructurada.</w:t>
-            </w:r>
-          </w:p>
-        </w:tc>
-        <w:tc>
-          <w:tcPr>
-            <w:tcW w:w="2351" w:type="dxa"/>
-          </w:tcPr>
-          <w:p>
-            <w:pPr>
-              <w:rPr>
-                <w:rFonts w:ascii="Arial" w:eastAsia="Arial" w:hAnsi="Arial" w:cs="Arial"/>
-                <w:sz w:val="24"/>
-                <w:szCs w:val="24"/>
-              </w:rPr>
-            </w:pPr>
-            <w:r>
-              <w:rPr>
-                <w:rFonts w:ascii="Arial" w:eastAsia="Arial" w:hAnsi="Arial" w:cs="Arial"/>
-                <w:sz w:val="24"/>
-                <w:szCs w:val="24"/>
-              </w:rPr>
-              <w:t>La mayoría de las</w:t>
-            </w:r>
-            <w:r>
-              <w:rPr>
-                <w:rFonts w:ascii="Arial" w:eastAsia="Arial" w:hAnsi="Arial" w:cs="Arial"/>
-                <w:sz w:val="24"/>
-                <w:szCs w:val="24"/>
-              </w:rPr>
-              <w:t xml:space="preserve"> derivaciones son por adherencia o desconocimiento del tratamiento, sin un abordaje definido.</w:t>
-            </w:r>
-          </w:p>
-        </w:tc>
-        <w:tc>
-          <w:tcPr>
-            <w:tcW w:w="2351" w:type="dxa"/>
-          </w:tcPr>
-          <w:p>
-            <w:pPr>
-              <w:rPr>
-                <w:rFonts w:ascii="Arial" w:eastAsia="Arial" w:hAnsi="Arial" w:cs="Arial"/>
-                <w:sz w:val="24"/>
-                <w:szCs w:val="24"/>
-              </w:rPr>
-            </w:pPr>
-            <w:r>
-              <w:rPr>
-                <w:rFonts w:ascii="Arial" w:eastAsia="Arial" w:hAnsi="Arial" w:cs="Arial"/>
-                <w:sz w:val="24"/>
-                <w:szCs w:val="24"/>
-              </w:rPr>
-              <w:t>La educación y el trabajo de barreras dependen de cada visita.</w:t>
-            </w:r>
-          </w:p>
-        </w:tc>
-      </w:tr>
-      <w:tr>
-        <w:trPr>
-          <w:jc w:val="center"/>
-        </w:trPr>
-        <w:tc>
-          <w:tcPr>
-            <w:tcW w:w="2351" w:type="dxa"/>
-          </w:tcPr>
-          <w:p>
-            <w:pPr>
-              <w:rPr>
-                <w:rFonts w:ascii="Arial" w:eastAsia="Arial" w:hAnsi="Arial" w:cs="Arial"/>
-                <w:sz w:val="24"/>
-                <w:szCs w:val="24"/>
-              </w:rPr>
-            </w:pPr>
-            <w:r>
-              <w:rPr>
-                <w:rFonts w:ascii="Arial" w:eastAsia="Arial" w:hAnsi="Arial" w:cs="Arial"/>
-                <w:sz w:val="24"/>
-                <w:szCs w:val="24"/>
-              </w:rPr>
-              <w:t>Oportunidad</w:t>
-            </w:r>
-          </w:p>
-        </w:tc>
-        <w:tc>
-          <w:tcPr>
-            <w:tcW w:w="2351" w:type="dxa"/>
-          </w:tcPr>
-          <w:p>
-            <w:pPr>
-              <w:rPr>
-                <w:rFonts w:ascii="Arial" w:eastAsia="Arial" w:hAnsi="Arial" w:cs="Arial"/>
-                <w:sz w:val="24"/>
-                <w:szCs w:val="24"/>
-              </w:rPr>
-            </w:pPr>
-            <w:r>
-              <w:rPr>
-                <w:rFonts w:ascii="Arial" w:eastAsia="Arial" w:hAnsi="Arial" w:cs="Arial"/>
-                <w:sz w:val="24"/>
-                <w:szCs w:val="24"/>
-              </w:rPr>
-              <w:t>Registro estructurado y continuidad del seguimiento.</w:t>
-            </w:r>
-          </w:p>
-        </w:tc>
-        <w:tc>
-          <w:tcPr>
-            <w:tcW w:w="2351" w:type="dxa"/>
-          </w:tcPr>
-          <w:p>
-            <w:pPr>
-              <w:rPr>
-                <w:rFonts w:ascii="Arial" w:eastAsia="Arial" w:hAnsi="Arial" w:cs="Arial"/>
-                <w:sz w:val="24"/>
-                <w:szCs w:val="24"/>
-              </w:rPr>
-            </w:pPr>
-            <w:commentRangeStart w:id="39"/>
-            <w:r>
-              <w:rPr>
-                <w:rFonts w:ascii="Arial" w:eastAsia="Arial" w:hAnsi="Arial" w:cs="Arial"/>
-                <w:sz w:val="24"/>
-                <w:szCs w:val="24"/>
-              </w:rPr>
-              <w:t>Registro en la ficha clínica electrónica (SINET Sur); frecuencia de visitas según disponibilidad.</w:t>
-            </w:r>
-            <w:commentRangeEnd w:id="39"/>
-            <w:r>
-              <w:rPr>
-                <w:rStyle w:val="Refdecomentario"/>
-                <w:rFonts w:ascii="Arial" w:eastAsia="Arial" w:hAnsi="Arial" w:cs="Arial"/>
-                <w:sz w:val="24"/>
-                <w:szCs w:val="24"/>
-              </w:rPr>
-              <w:commentReference w:id="39"/>
-            </w:r>
-          </w:p>
-        </w:tc>
-        <w:tc>
-          <w:tcPr>
-            <w:tcW w:w="2351" w:type="dxa"/>
-          </w:tcPr>
-          <w:p>
-            <w:pPr>
-              <w:rPr>
-                <w:rFonts w:ascii="Arial" w:eastAsia="Arial" w:hAnsi="Arial" w:cs="Arial"/>
-                <w:sz w:val="24"/>
-                <w:szCs w:val="24"/>
-              </w:rPr>
-            </w:pPr>
-            <w:r>
-              <w:rPr>
-                <w:rFonts w:ascii="Arial" w:eastAsia="Arial" w:hAnsi="Arial" w:cs="Arial"/>
-                <w:sz w:val="24"/>
-                <w:szCs w:val="24"/>
-              </w:rPr>
-              <w:t xml:space="preserve">Falta un registro propio de la </w:t>
-            </w:r>
-            <w:r>
-              <w:rPr>
-                <w:rFonts w:ascii="Arial" w:eastAsia="Arial" w:hAnsi="Arial" w:cs="Arial"/>
-                <w:sz w:val="24"/>
-                <w:szCs w:val="24"/>
-              </w:rPr>
-              <w:t>Atención Farmacéutica</w:t>
-            </w:r>
-            <w:r>
-              <w:rPr>
-                <w:rFonts w:ascii="Arial" w:eastAsia="Arial" w:hAnsi="Arial" w:cs="Arial"/>
-                <w:sz w:val="24"/>
-                <w:szCs w:val="24"/>
-              </w:rPr>
-              <w:t xml:space="preserve"> y una pauta común de seguimiento.</w:t>
-            </w:r>
-          </w:p>
-        </w:tc>
-      </w:tr>
-    </w:tbl>
+        <w:t>Se describió cómo se realizaba la visita domiciliaria en el CESFAM al inicio del internado y se comparó esa práctica con lo que plantean la Orientación Técnica del Programa de Salud Cardiovascular y del Fondo de Farmacia (Ministerio de Salud de Chile, 2017b, 2018b, 2020), la Guía de Atención Farmacéutica y Seguimiento Farmacoterapéutico en APS (Ministerio de Salud de Chile, 2018a) y los tres pilares del Modelo CMO. La comparación se apoyó, además, en la evaluación previa del mismo programa (Faúndez Navarrete, 2020) y en la información entregada por el equipo de salud del centro. Las brechas identificadas a partir de esta comparación se presentan en el Capítulo III.</w:t>
+      </w:r>
+    </w:p>
     <w:p>
       <w:pPr>
         <w:pStyle w:val="Ttulo2"/>
@@ -5111,19 +4132,7 @@
         <w:jc w:val="both"/>
       </w:pPr>
       <w:r>
-        <w:rPr>
-          <w:rFonts w:ascii="Arial" w:eastAsia="Arial" w:hAnsi="Arial"/>
-          <w:sz w:val="24"/>
-        </w:rPr>
-        <w:t xml:space="preserve">Para ordenar el ingreso al protocolo se definieron criterios de inclusión y de exclusión, tomando como referencia los que ya se aplicaban en el programa del propio centro (Faúndez Navarrete, 2020). Se incluye a los usuarios del Programa de Salud Cardiovascular que están descompensados o con control inestable, mayores de 18 años y en seguimiento activo, sea en box o en domicilio. Se excluye, en cambio, a quienes </w:t>
-      </w:r>
-      <w:r>
-        <w:rPr>
-          <w:rFonts w:ascii="Arial" w:eastAsia="Arial" w:hAnsi="Arial"/>
-          <w:sz w:val="24"/>
-        </w:rPr>
-        <w:lastRenderedPageBreak/>
-        <w:t>tienen barreras de comunicación que impiden la entrevista, presentan un deterioro cognitivo importante sin un cuidador que apoye, viven fuera del territorio del CESFAM y a quienes llevan más de seis meses sin asistir a sus controles.</w:t>
+        <w:t>Para ordenar el ingreso al protocolo se definieron criterios de inclusión y de exclusión, tomando como referencia los que ya se usaban en el programa del propio centro (Faúndez Navarrete, 2020). Se incluye a los usuarios del Programa de Salud Cardiovascular que están descompensados o con control inestable, mayores de 18 años y en seguimiento activo, sea en box o en domicilio. Se excluye, en cambio, a quienes tienen barreras de comunicación que impiden la entrevista, presentan un deterioro cognitivo importante sin un cuidador que apoye, viven fuera del territorio del CESFAM y a quienes llevan más de seis meses sin asistir a sus controles.</w:t>
       </w:r>
     </w:p>
     <w:p>
@@ -5454,12 +4463,8 @@
         <w:spacing w:after="120" w:line="360" w:lineRule="auto"/>
         <w:jc w:val="both"/>
       </w:pPr>
-      <w:commentRangeStart w:id="45"/>
-      <w:commentRangeEnd w:id="45"/>
-      <w:commentRangeStart w:id="46"/>
-      <w:commentRangeEnd w:id="46"/>
-      <w:r>
-        <w:t>Para poder aplicar el protocolo se seleccionaron y adaptaron herramientas sencillas, compatibles con la rutina del CESFAM. La adherencia se evalúa con el test de Morisky-Green-Levine de cuatro preguntas (Morisky, Green &amp; Levine, 1986), incluido en el Anexo 2, que en algunos casos se complementa con el test de Batalla, el cual permite conocer el grado de conocimiento que el paciente tiene sobre su enfermedad (Batalla et al., 1984). Cuando están disponibles en la ficha clínica, se consideran los exámenes de laboratorio del paciente, como el hemograma, el perfil lipídico, la glucosa, la creatinina, la velocidad de filtración glomerular, la hemoglobina glicosilada o las pruebas tiroideas (TSH y T4 libre). Durante la visita domiciliaria esta información se complementa con la medición de la presión arterial y la frecuencia cardíaca mediante un tensiómetro de brazo, práctica ya habitual que permite estimar el grado de compensación del paciente en el momento.</w:t>
+      <w:r>
+        <w:t>Como parte del diseño del protocolo se seleccionaron y adaptaron herramientas sencillas, compatibles con la rutina del CESFAM. La adherencia se evalúa con el test de Morisky-Green-Levine de cuatro preguntas (Morisky, Green &amp; Levine, 1986), incluido en el Anexo 2, que en algunos casos se complementa con el test de Batalla, el cual permite conocer el grado de conocimiento que el paciente tiene sobre su enfermedad (Batalla et al., 1984). Cuando están disponibles en la ficha clínica, se consideran los exámenes de laboratorio del paciente, como el hemograma, el perfil lipídico, la glucosa, la creatinina, la velocidad de filtración glomerular, la hemoglobina glicosilada o las pruebas tiroideas (TSH y T4 libre). Durante la visita domiciliaria esta información se complementa con la medición de la presión arterial y la frecuencia cardíaca mediante un tensiómetro de brazo, práctica ya habitual que permite estimar el grado de compensación del paciente en el momento.</w:t>
       </w:r>
     </w:p>
     <w:p>
@@ -5581,7 +4586,6 @@
         </w:rPr>
         <w:t xml:space="preserve">Como se trata del diseño de un protocolo y </w:t>
       </w:r>
-      <w:commentRangeStart w:id="49"/>
       <w:r>
         <w:rPr>
           <w:rFonts w:ascii="Arial" w:eastAsia="Arial" w:hAnsi="Arial"/>
@@ -5589,7 +4593,6 @@
         </w:rPr>
         <w:t>no de un estudio con pacientes</w:t>
       </w:r>
-      <w:commentRangeEnd w:id="49"/>
       <w:r>
         <w:rPr>
           <w:rStyle w:val="Refdecomentario"/>
@@ -5597,7 +4600,6 @@
           <w:sz w:val="24"/>
           <w:szCs w:val="24"/>
         </w:rPr>
-        <w:commentReference w:id="49"/>
       </w:r>
       <w:r>
         <w:rPr>
@@ -5633,7 +4635,6 @@
         </w:rPr>
         <w:t xml:space="preserve"> no se registraron datos que permitieran identificar a pacientes ni se modificaron tratamientos fuera del trabajo habitual del equipo de salud. La propuesta será revisada por los químicos farmacéuticos del establecimiento antes de considerar su incorporación </w:t>
       </w:r>
-      <w:commentRangeStart w:id="50"/>
       <w:r>
         <w:rPr>
           <w:rFonts w:ascii="Arial" w:eastAsia="Arial" w:hAnsi="Arial"/>
@@ -5641,14 +4642,12 @@
         </w:rPr>
         <w:t>a la práctica.</w:t>
       </w:r>
-      <w:commentRangeEnd w:id="50"/>
       <w:r>
         <w:rPr>
           <w:rStyle w:val="Refdecomentario"/>
           <w:sz w:val="24"/>
           <w:szCs w:val="24"/>
         </w:rPr>
-        <w:commentReference w:id="50"/>
       </w:r>
     </w:p>
     <w:p>
@@ -5656,6 +4655,720 @@
         <w:br w:type="page"/>
       </w:r>
     </w:p>
+    <w:p>
+      <w:pPr>
+        <w:pStyle w:val="Ttulo1"/>
+      </w:pPr>
+      <w:bookmarkStart w:id="30" w:name="_Toc234430361"/>
+      <w:bookmarkStart w:id="31" w:name="_Toc234959471"/>
+      <w:bookmarkEnd w:id="30"/>
+      <w:bookmarkEnd w:id="31"/>
+      <w:r>
+        <w:t>Capítulo III: Resultados</w:t>
+      </w:r>
+    </w:p>
+    <w:p>
+      <w:pPr>
+        <w:spacing w:after="120" w:line="360" w:lineRule="auto"/>
+        <w:jc w:val="both"/>
+      </w:pPr>
+      <w:r>
+        <w:t>En este capítulo se presentan los resultados preliminares obtenidos durante el internado. En primer lugar, se describe el funcionamiento del programa de visitas domiciliarias del CESFAM y las brechas identificadas respecto de la norma y del Modelo CMO.</w:t>
+      </w:r>
+    </w:p>
+    <w:p>
+      <w:pPr>
+        <w:pStyle w:val="Ttulo2"/>
+      </w:pPr>
+      <w:bookmarkStart w:id="32" w:name="_Toc234430362"/>
+      <w:bookmarkStart w:id="33" w:name="_Toc234959472"/>
+      <w:bookmarkEnd w:id="32"/>
+      <w:bookmarkEnd w:id="33"/>
+      <w:r>
+        <w:t>3.1 Identificación de las brechas del programa de visitas domiciliarias</w:t>
+      </w:r>
+    </w:p>
+    <w:p>
+      <w:pPr>
+        <w:spacing w:after="120" w:line="360" w:lineRule="auto"/>
+        <w:jc w:val="both"/>
+      </w:pPr>
+      <w:r>
+        <w:rPr>
+          <w:rFonts w:ascii="Arial" w:eastAsia="Arial" w:hAnsi="Arial"/>
+          <w:sz w:val="24"/>
+          <w:szCs w:val="24"/>
+        </w:rPr>
+        <w:t xml:space="preserve">En la práctica, la </w:t>
+      </w:r>
+      <w:r>
+        <w:rPr>
+          <w:rFonts w:ascii="Arial" w:eastAsia="Arial" w:hAnsi="Arial"/>
+          <w:sz w:val="24"/>
+          <w:szCs w:val="24"/>
+        </w:rPr>
+        <w:t>Atención Farmacéutica</w:t>
+      </w:r>
+      <w:r>
+        <w:rPr>
+          <w:rFonts w:ascii="Arial" w:eastAsia="Arial" w:hAnsi="Arial"/>
+          <w:sz w:val="24"/>
+          <w:szCs w:val="24"/>
+        </w:rPr>
+        <w:t xml:space="preserve"> domiciliaria del CESFAM ingresa solo por derivación de algún profesional del equipo medicina, enfermería, nutrición, kinesiología, psicología u otro y se programa en torno a unas 25 personas al mes, cifra que se fija cada año según lo que solicita el Servicio de Salud. Dentro de esas visitas se distinguen dos situaciones. Por un </w:t>
+      </w:r>
+      <w:r>
+        <w:rPr>
+          <w:rFonts w:ascii="Arial" w:eastAsia="Arial" w:hAnsi="Arial"/>
+          <w:sz w:val="24"/>
+          <w:szCs w:val="24"/>
+        </w:rPr>
+        <w:t>lado,</w:t>
+      </w:r>
+      <w:r>
+        <w:rPr>
+          <w:rFonts w:ascii="Arial" w:eastAsia="Arial" w:hAnsi="Arial"/>
+          <w:sz w:val="24"/>
+          <w:szCs w:val="24"/>
+        </w:rPr>
+        <w:t xml:space="preserve"> está el seguimiento farmacoterapéutico, dirigido a pacientes descompensados, que contempla al menos tres visitas por persona, o más si el caso lo requiere. Por otro</w:t>
+      </w:r>
+      <w:r>
+        <w:rPr>
+          <w:rFonts w:ascii="Arial" w:eastAsia="Arial" w:hAnsi="Arial"/>
+          <w:sz w:val="24"/>
+          <w:szCs w:val="24"/>
+        </w:rPr>
+        <w:t xml:space="preserve"> lado,</w:t>
+      </w:r>
+      <w:r>
+        <w:rPr>
+          <w:rFonts w:ascii="Arial" w:eastAsia="Arial" w:hAnsi="Arial"/>
+          <w:sz w:val="24"/>
+          <w:szCs w:val="24"/>
+        </w:rPr>
+        <w:t xml:space="preserve"> están las visitas puntuales, para usuarios derivados por posible falta de adherencia, </w:t>
+      </w:r>
+      <w:r>
+        <w:rPr>
+          <w:rFonts w:ascii="Arial" w:eastAsia="Arial" w:hAnsi="Arial"/>
+          <w:sz w:val="24"/>
+          <w:szCs w:val="24"/>
+        </w:rPr>
+        <w:t>el</w:t>
+      </w:r>
+      <w:r>
+        <w:rPr>
+          <w:rFonts w:ascii="Arial" w:eastAsia="Arial" w:hAnsi="Arial"/>
+          <w:sz w:val="24"/>
+          <w:szCs w:val="24"/>
+        </w:rPr>
+        <w:t xml:space="preserve"> inicio de un tratamiento que aún no comprenden, polifarmacia o </w:t>
+      </w:r>
+      <w:r>
+        <w:rPr>
+          <w:rFonts w:ascii="Arial" w:eastAsia="Arial" w:hAnsi="Arial"/>
+          <w:sz w:val="24"/>
+          <w:szCs w:val="24"/>
+        </w:rPr>
+        <w:lastRenderedPageBreak/>
+        <w:t xml:space="preserve">edad avanzada, en las que se </w:t>
+      </w:r>
+      <w:r>
+        <w:rPr>
+          <w:rFonts w:ascii="Arial" w:eastAsia="Arial" w:hAnsi="Arial"/>
+          <w:sz w:val="24"/>
+          <w:szCs w:val="24"/>
+        </w:rPr>
+        <w:t>evalúa</w:t>
+      </w:r>
+      <w:r>
+        <w:rPr>
+          <w:rFonts w:ascii="Arial" w:eastAsia="Arial" w:hAnsi="Arial"/>
+          <w:sz w:val="24"/>
+          <w:szCs w:val="24"/>
+        </w:rPr>
+        <w:t xml:space="preserve"> cómo están usando sus medicamentos. La repartición de las visitas a lo largo del mes depende, sobre todo, del tiempo y la disponibilidad del profesional.</w:t>
+      </w:r>
+    </w:p>
+    <w:p>
+      <w:pPr>
+        <w:spacing w:after="120" w:line="360" w:lineRule="auto"/>
+        <w:jc w:val="both"/>
+      </w:pPr>
+      <w:r>
+        <w:rPr>
+          <w:rFonts w:ascii="Arial" w:eastAsia="Arial" w:hAnsi="Arial"/>
+          <w:sz w:val="24"/>
+          <w:szCs w:val="24"/>
+        </w:rPr>
+        <w:t>En cuanto al registro</w:t>
+      </w:r>
+      <w:r>
+        <w:rPr>
+          <w:rFonts w:ascii="Arial" w:eastAsia="Arial" w:hAnsi="Arial"/>
+          <w:sz w:val="24"/>
+          <w:szCs w:val="24"/>
+        </w:rPr>
+        <w:t>,</w:t>
+      </w:r>
+      <w:r>
+        <w:rPr>
+          <w:rFonts w:ascii="Arial" w:eastAsia="Arial" w:hAnsi="Arial"/>
+          <w:sz w:val="24"/>
+          <w:szCs w:val="24"/>
+        </w:rPr>
+        <w:t xml:space="preserve"> </w:t>
+      </w:r>
+      <w:r>
+        <w:rPr>
+          <w:rFonts w:ascii="Arial" w:eastAsia="Arial" w:hAnsi="Arial"/>
+          <w:sz w:val="24"/>
+          <w:szCs w:val="24"/>
+        </w:rPr>
+        <w:t>a</w:t>
+      </w:r>
+      <w:r>
+        <w:rPr>
+          <w:rFonts w:ascii="Arial" w:eastAsia="Arial" w:hAnsi="Arial"/>
+          <w:sz w:val="24"/>
+          <w:szCs w:val="24"/>
+        </w:rPr>
+        <w:t xml:space="preserve">ntes de cada visita el profesional revisa en la ficha clínica electrónica (SINET Sur) los exámenes de laboratorio disponibles (hemograma, perfil lipídico, glucosa, creatinina, velocidad de filtración glomerular, hemoglobina glicosilada, TSH, T4 libre, etc.) y los anota en una hoja de trabajo que lleva al domicilio. </w:t>
+      </w:r>
+      <w:r>
+        <w:rPr>
+          <w:rFonts w:ascii="Arial" w:eastAsia="Arial" w:hAnsi="Arial"/>
+          <w:sz w:val="24"/>
+          <w:szCs w:val="24"/>
+        </w:rPr>
+        <w:t>La</w:t>
+      </w:r>
+      <w:r>
+        <w:rPr>
+          <w:rFonts w:ascii="Arial" w:eastAsia="Arial" w:hAnsi="Arial"/>
+          <w:sz w:val="24"/>
+          <w:szCs w:val="24"/>
+        </w:rPr>
+        <w:t xml:space="preserve"> hoja </w:t>
+      </w:r>
+      <w:r>
+        <w:rPr>
+          <w:rFonts w:ascii="Arial" w:eastAsia="Arial" w:hAnsi="Arial"/>
+          <w:sz w:val="24"/>
+          <w:szCs w:val="24"/>
+        </w:rPr>
+        <w:t xml:space="preserve">también </w:t>
+      </w:r>
+      <w:r>
+        <w:rPr>
+          <w:rFonts w:ascii="Arial" w:eastAsia="Arial" w:hAnsi="Arial"/>
+          <w:sz w:val="24"/>
+          <w:szCs w:val="24"/>
+        </w:rPr>
+        <w:t xml:space="preserve">consigna los diagnósticos del paciente y el listado de sus medicamentos con sus dosis y horarios, y se apoya en una pauta con los temas que debe revisar durante la visita, como la educación sobre la terapia, la conciliación de la medicación, las interacciones, la detección de reacciones adversas, la cronofarmacología, el almacenamiento y los vencimientos, la técnica de administración de insulina, las alergias, el sueño y el apetito, que va marcando a medida que los aborda. Además, durante la visita mide la presión arterial del paciente con un tensiómetro para estimar su grado de compensación y, al regresar al centro, deja constancia de lo realizado en la ficha clínica. </w:t>
+      </w:r>
+      <w:r>
+        <w:rPr>
+          <w:rFonts w:ascii="Arial" w:eastAsia="Arial" w:hAnsi="Arial"/>
+          <w:sz w:val="24"/>
+          <w:szCs w:val="24"/>
+        </w:rPr>
+        <w:t>En consecuencia, el problema no radica en la falta de registro, sino en que los apoyos utilizados son de carácter individual y no corresponden a un instrumento estandarizado y compartido.</w:t>
+      </w:r>
+    </w:p>
+    <w:p>
+      <w:pPr>
+        <w:spacing w:after="120" w:line="360" w:lineRule="auto"/>
+        <w:jc w:val="both"/>
+      </w:pPr>
+      <w:r>
+        <w:t>Al comparar ese funcionamiento con la norma y con el Modelo CMO se identificaron tres brechas principales. La primera, ligada a la Capacidad, radica en que el ingreso depende de la derivación de otros profesionales y del tiempo disponible y que, si bien en la práctica se prioriza a los pacientes más descompensados, no existe un criterio de estratificación de riesgo estandarizado que el propio farmacéutico aplique para decidir a quién priorizar. La segunda, ligada a la Motivación, es que gran parte de las derivaciones responde justamente a problemas de adherencia o a pacientes que no comprenden su tratamiento, pero no hay una forma protocolizada de abordar esas barreras ni de educar, de modo que la intervención queda a criterio de cada visita. La tercera, ligada a la Oportunidad, indica que el número y la frecuencia de las visitas se ajustan caso a caso según la disponibilidad y que, si bien el registro se realiza en la ficha clínica electrónica del establecimiento (SINET Sur) y en hojas de apoyo personales, lo que aporta cierta trazabilidad, no existe un instrumento de registro estandarizado y propio de la Atención Farmacéutica domiciliaria que facilite el seguimiento y la comparación entre profesionales. La Tabla 1 resume estas brechas, que son las que el protocolo busca cerrar.</w:t>
+      </w:r>
+    </w:p>
+    <w:p>
+      <w:pPr>
+        <w:rPr>
+          <w:rFonts w:ascii="Arial" w:eastAsia="Arial" w:hAnsi="Arial" w:cs="Arial"/>
+          <w:sz w:val="24"/>
+          <w:szCs w:val="24"/>
+        </w:rPr>
+      </w:pPr>
+      <w:r>
+        <w:rPr>
+          <w:rFonts w:ascii="Arial" w:eastAsia="Arial" w:hAnsi="Arial" w:cs="Arial"/>
+          <w:sz w:val="24"/>
+          <w:szCs w:val="24"/>
+        </w:rPr>
+        <w:t xml:space="preserve">Tabla </w:t>
+      </w:r>
+      <w:r>
+        <w:rPr>
+          <w:rFonts w:ascii="Arial" w:eastAsia="Arial" w:hAnsi="Arial" w:cs="Arial"/>
+          <w:sz w:val="24"/>
+          <w:szCs w:val="24"/>
+        </w:rPr>
+        <w:t>1</w:t>
+      </w:r>
+      <w:r>
+        <w:rPr>
+          <w:rFonts w:ascii="Arial" w:eastAsia="Arial" w:hAnsi="Arial" w:cs="Arial"/>
+          <w:sz w:val="24"/>
+          <w:szCs w:val="24"/>
+        </w:rPr>
+        <w:t>. Brechas del programa de visitas domiciliarias según los pilares del Modelo CMO.</w:t>
+      </w:r>
+    </w:p>
+    <w:tbl>
+      <w:tblPr>
+        <w:tblStyle w:val="Tablaconcuadrcula"/>
+        <w:tblW w:w="0" w:type="auto"/>
+        <w:jc w:val="center"/>
+        <w:tblLook w:val="04A0" w:firstRow="1" w:lastRow="0" w:firstColumn="1" w:lastColumn="0" w:noHBand="0" w:noVBand="1"/>
+      </w:tblPr>
+      <w:tblGrid>
+        <w:gridCol w:w="2318"/>
+        <w:gridCol w:w="2321"/>
+        <w:gridCol w:w="2431"/>
+        <w:gridCol w:w="2324"/>
+      </w:tblGrid>
+      <w:tr>
+        <w:trPr>
+          <w:jc w:val="center"/>
+        </w:trPr>
+        <w:tc>
+          <w:tcPr>
+            <w:tcW w:w="2351" w:type="dxa"/>
+          </w:tcPr>
+          <w:p>
+            <w:pPr>
+              <w:rPr>
+                <w:rFonts w:ascii="Arial" w:eastAsia="Arial" w:hAnsi="Arial" w:cs="Arial"/>
+                <w:b/>
+                <w:bCs/>
+                <w:sz w:val="24"/>
+                <w:szCs w:val="24"/>
+              </w:rPr>
+            </w:pPr>
+            <w:r>
+              <w:rPr>
+                <w:rFonts w:ascii="Arial" w:eastAsia="Arial" w:hAnsi="Arial" w:cs="Arial"/>
+                <w:b/>
+                <w:bCs/>
+                <w:sz w:val="24"/>
+                <w:szCs w:val="24"/>
+              </w:rPr>
+              <w:t>Pilar del Modelo CMO</w:t>
+            </w:r>
+          </w:p>
+        </w:tc>
+        <w:tc>
+          <w:tcPr>
+            <w:tcW w:w="2351" w:type="dxa"/>
+          </w:tcPr>
+          <w:p>
+            <w:pPr>
+              <w:rPr>
+                <w:rFonts w:ascii="Arial" w:eastAsia="Arial" w:hAnsi="Arial" w:cs="Arial"/>
+                <w:b/>
+                <w:bCs/>
+                <w:sz w:val="24"/>
+                <w:szCs w:val="24"/>
+              </w:rPr>
+            </w:pPr>
+            <w:r>
+              <w:rPr>
+                <w:rFonts w:ascii="Arial" w:eastAsia="Arial" w:hAnsi="Arial" w:cs="Arial"/>
+                <w:b/>
+                <w:bCs/>
+                <w:sz w:val="24"/>
+                <w:szCs w:val="24"/>
+              </w:rPr>
+              <w:t>Lo que se espera</w:t>
+            </w:r>
+          </w:p>
+        </w:tc>
+        <w:tc>
+          <w:tcPr>
+            <w:tcW w:w="2351" w:type="dxa"/>
+          </w:tcPr>
+          <w:p>
+            <w:pPr>
+              <w:rPr>
+                <w:rFonts w:ascii="Arial" w:eastAsia="Arial" w:hAnsi="Arial" w:cs="Arial"/>
+                <w:b/>
+                <w:bCs/>
+                <w:sz w:val="24"/>
+                <w:szCs w:val="24"/>
+              </w:rPr>
+            </w:pPr>
+            <w:r>
+              <w:rPr>
+                <w:rFonts w:ascii="Arial" w:eastAsia="Arial" w:hAnsi="Arial" w:cs="Arial"/>
+                <w:b/>
+                <w:bCs/>
+                <w:sz w:val="24"/>
+                <w:szCs w:val="24"/>
+              </w:rPr>
+              <w:t>Lo observado</w:t>
+            </w:r>
+          </w:p>
+        </w:tc>
+        <w:tc>
+          <w:tcPr>
+            <w:tcW w:w="2351" w:type="dxa"/>
+          </w:tcPr>
+          <w:p>
+            <w:pPr>
+              <w:rPr>
+                <w:rFonts w:ascii="Arial" w:eastAsia="Arial" w:hAnsi="Arial" w:cs="Arial"/>
+                <w:b/>
+                <w:bCs/>
+                <w:sz w:val="24"/>
+                <w:szCs w:val="24"/>
+              </w:rPr>
+            </w:pPr>
+            <w:r>
+              <w:rPr>
+                <w:rFonts w:ascii="Arial" w:eastAsia="Arial" w:hAnsi="Arial" w:cs="Arial"/>
+                <w:b/>
+                <w:bCs/>
+                <w:sz w:val="24"/>
+                <w:szCs w:val="24"/>
+              </w:rPr>
+              <w:t>Brecha</w:t>
+            </w:r>
+          </w:p>
+        </w:tc>
+      </w:tr>
+      <w:tr>
+        <w:trPr>
+          <w:jc w:val="center"/>
+        </w:trPr>
+        <w:tc>
+          <w:tcPr>
+            <w:tcW w:w="2351" w:type="dxa"/>
+          </w:tcPr>
+          <w:p>
+            <w:pPr>
+              <w:rPr>
+                <w:rFonts w:ascii="Arial" w:eastAsia="Arial" w:hAnsi="Arial" w:cs="Arial"/>
+                <w:sz w:val="24"/>
+                <w:szCs w:val="24"/>
+              </w:rPr>
+            </w:pPr>
+            <w:r>
+              <w:rPr>
+                <w:rFonts w:ascii="Arial" w:eastAsia="Arial" w:hAnsi="Arial" w:cs="Arial"/>
+                <w:sz w:val="24"/>
+                <w:szCs w:val="24"/>
+              </w:rPr>
+              <w:t>Capacidad</w:t>
+            </w:r>
+          </w:p>
+        </w:tc>
+        <w:tc>
+          <w:tcPr>
+            <w:tcW w:w="2351" w:type="dxa"/>
+          </w:tcPr>
+          <w:p>
+            <w:pPr>
+              <w:rPr>
+                <w:rFonts w:ascii="Arial" w:eastAsia="Arial" w:hAnsi="Arial" w:cs="Arial"/>
+                <w:sz w:val="24"/>
+                <w:szCs w:val="24"/>
+              </w:rPr>
+            </w:pPr>
+            <w:r>
+              <w:rPr>
+                <w:rFonts w:ascii="Arial" w:eastAsia="Arial" w:hAnsi="Arial" w:cs="Arial"/>
+                <w:sz w:val="24"/>
+                <w:szCs w:val="24"/>
+              </w:rPr>
+              <w:t>Priorizar la visita según el riesgo y la complejidad del paciente.</w:t>
+            </w:r>
+          </w:p>
+        </w:tc>
+        <w:tc>
+          <w:tcPr>
+            <w:tcW w:w="2351" w:type="dxa"/>
+          </w:tcPr>
+          <w:p>
+            <w:pPr>
+              <w:rPr>
+                <w:rFonts w:ascii="Arial" w:eastAsia="Arial" w:hAnsi="Arial" w:cs="Arial"/>
+                <w:sz w:val="24"/>
+                <w:szCs w:val="24"/>
+              </w:rPr>
+            </w:pPr>
+            <w:r>
+              <w:rPr>
+                <w:rFonts w:ascii="Arial" w:eastAsia="Arial" w:hAnsi="Arial" w:cs="Arial"/>
+                <w:sz w:val="24"/>
+                <w:szCs w:val="24"/>
+              </w:rPr>
+              <w:t>El ingreso depende de la derivación y del tiempo disponible (unas 25 visitas al mes).</w:t>
+            </w:r>
+          </w:p>
+        </w:tc>
+        <w:tc>
+          <w:tcPr>
+            <w:tcW w:w="2351" w:type="dxa"/>
+          </w:tcPr>
+          <w:p>
+            <w:pPr>
+              <w:rPr>
+                <w:rFonts w:ascii="Arial" w:eastAsia="Arial" w:hAnsi="Arial" w:cs="Arial"/>
+                <w:sz w:val="24"/>
+                <w:szCs w:val="24"/>
+              </w:rPr>
+            </w:pPr>
+            <w:r>
+              <w:rPr>
+                <w:rFonts w:ascii="Arial" w:eastAsia="Arial" w:hAnsi="Arial" w:cs="Arial"/>
+                <w:sz w:val="24"/>
+                <w:szCs w:val="24"/>
+              </w:rPr>
+              <w:t xml:space="preserve">No </w:t>
+            </w:r>
+            <w:r>
+              <w:rPr>
+                <w:rFonts w:ascii="Arial" w:eastAsia="Arial" w:hAnsi="Arial" w:cs="Arial"/>
+                <w:sz w:val="24"/>
+                <w:szCs w:val="24"/>
+              </w:rPr>
+              <w:t>existe</w:t>
+            </w:r>
+            <w:r>
+              <w:rPr>
+                <w:rFonts w:ascii="Arial" w:eastAsia="Arial" w:hAnsi="Arial" w:cs="Arial"/>
+                <w:sz w:val="24"/>
+                <w:szCs w:val="24"/>
+              </w:rPr>
+              <w:t xml:space="preserve"> un criterio de estratificación de riesgo propio del farmacéutico.</w:t>
+            </w:r>
+          </w:p>
+        </w:tc>
+      </w:tr>
+      <w:tr>
+        <w:trPr>
+          <w:jc w:val="center"/>
+        </w:trPr>
+        <w:tc>
+          <w:tcPr>
+            <w:tcW w:w="2351" w:type="dxa"/>
+          </w:tcPr>
+          <w:p>
+            <w:pPr>
+              <w:rPr>
+                <w:rFonts w:ascii="Arial" w:eastAsia="Arial" w:hAnsi="Arial" w:cs="Arial"/>
+                <w:sz w:val="24"/>
+                <w:szCs w:val="24"/>
+              </w:rPr>
+            </w:pPr>
+            <w:r>
+              <w:rPr>
+                <w:rFonts w:ascii="Arial" w:eastAsia="Arial" w:hAnsi="Arial" w:cs="Arial"/>
+                <w:sz w:val="24"/>
+                <w:szCs w:val="24"/>
+              </w:rPr>
+              <w:t>Motivación</w:t>
+            </w:r>
+          </w:p>
+        </w:tc>
+        <w:tc>
+          <w:tcPr>
+            <w:tcW w:w="2351" w:type="dxa"/>
+          </w:tcPr>
+          <w:p>
+            <w:pPr>
+              <w:rPr>
+                <w:rFonts w:ascii="Arial" w:eastAsia="Arial" w:hAnsi="Arial" w:cs="Arial"/>
+                <w:sz w:val="24"/>
+                <w:szCs w:val="24"/>
+              </w:rPr>
+            </w:pPr>
+            <w:r>
+              <w:rPr>
+                <w:rFonts w:ascii="Arial" w:eastAsia="Arial" w:hAnsi="Arial" w:cs="Arial"/>
+                <w:sz w:val="24"/>
+                <w:szCs w:val="24"/>
+              </w:rPr>
+              <w:t>Abordar la adherencia con entrevista motivacional estructurada.</w:t>
+            </w:r>
+          </w:p>
+        </w:tc>
+        <w:tc>
+          <w:tcPr>
+            <w:tcW w:w="2351" w:type="dxa"/>
+          </w:tcPr>
+          <w:p>
+            <w:pPr>
+              <w:rPr>
+                <w:rFonts w:ascii="Arial" w:eastAsia="Arial" w:hAnsi="Arial" w:cs="Arial"/>
+                <w:sz w:val="24"/>
+                <w:szCs w:val="24"/>
+              </w:rPr>
+            </w:pPr>
+            <w:r>
+              <w:rPr>
+                <w:rFonts w:ascii="Arial" w:eastAsia="Arial" w:hAnsi="Arial" w:cs="Arial"/>
+                <w:sz w:val="24"/>
+                <w:szCs w:val="24"/>
+              </w:rPr>
+              <w:t>La mayoría de las</w:t>
+            </w:r>
+            <w:r>
+              <w:rPr>
+                <w:rFonts w:ascii="Arial" w:eastAsia="Arial" w:hAnsi="Arial" w:cs="Arial"/>
+                <w:sz w:val="24"/>
+                <w:szCs w:val="24"/>
+              </w:rPr>
+              <w:t xml:space="preserve"> derivaciones son por adherencia o desconocimiento del tratamiento, sin un abordaje definido.</w:t>
+            </w:r>
+          </w:p>
+        </w:tc>
+        <w:tc>
+          <w:tcPr>
+            <w:tcW w:w="2351" w:type="dxa"/>
+          </w:tcPr>
+          <w:p>
+            <w:pPr>
+              <w:rPr>
+                <w:rFonts w:ascii="Arial" w:eastAsia="Arial" w:hAnsi="Arial" w:cs="Arial"/>
+                <w:sz w:val="24"/>
+                <w:szCs w:val="24"/>
+              </w:rPr>
+            </w:pPr>
+            <w:r>
+              <w:rPr>
+                <w:rFonts w:ascii="Arial" w:eastAsia="Arial" w:hAnsi="Arial" w:cs="Arial"/>
+                <w:sz w:val="24"/>
+                <w:szCs w:val="24"/>
+              </w:rPr>
+              <w:t>La educación y el trabajo de barreras dependen de cada visita.</w:t>
+            </w:r>
+          </w:p>
+        </w:tc>
+      </w:tr>
+      <w:tr>
+        <w:trPr>
+          <w:jc w:val="center"/>
+        </w:trPr>
+        <w:tc>
+          <w:tcPr>
+            <w:tcW w:w="2351" w:type="dxa"/>
+          </w:tcPr>
+          <w:p>
+            <w:pPr>
+              <w:rPr>
+                <w:rFonts w:ascii="Arial" w:eastAsia="Arial" w:hAnsi="Arial" w:cs="Arial"/>
+                <w:sz w:val="24"/>
+                <w:szCs w:val="24"/>
+              </w:rPr>
+            </w:pPr>
+            <w:r>
+              <w:rPr>
+                <w:rFonts w:ascii="Arial" w:eastAsia="Arial" w:hAnsi="Arial" w:cs="Arial"/>
+                <w:sz w:val="24"/>
+                <w:szCs w:val="24"/>
+              </w:rPr>
+              <w:t>Oportunidad</w:t>
+            </w:r>
+          </w:p>
+        </w:tc>
+        <w:tc>
+          <w:tcPr>
+            <w:tcW w:w="2351" w:type="dxa"/>
+          </w:tcPr>
+          <w:p>
+            <w:pPr>
+              <w:rPr>
+                <w:rFonts w:ascii="Arial" w:eastAsia="Arial" w:hAnsi="Arial" w:cs="Arial"/>
+                <w:sz w:val="24"/>
+                <w:szCs w:val="24"/>
+              </w:rPr>
+            </w:pPr>
+            <w:r>
+              <w:rPr>
+                <w:rFonts w:ascii="Arial" w:eastAsia="Arial" w:hAnsi="Arial" w:cs="Arial"/>
+                <w:sz w:val="24"/>
+                <w:szCs w:val="24"/>
+              </w:rPr>
+              <w:t>Registro estructurado y continuidad del seguimiento.</w:t>
+            </w:r>
+          </w:p>
+        </w:tc>
+        <w:tc>
+          <w:tcPr>
+            <w:tcW w:w="2351" w:type="dxa"/>
+          </w:tcPr>
+          <w:p>
+            <w:pPr>
+              <w:rPr>
+                <w:rFonts w:ascii="Arial" w:eastAsia="Arial" w:hAnsi="Arial" w:cs="Arial"/>
+                <w:sz w:val="24"/>
+                <w:szCs w:val="24"/>
+              </w:rPr>
+            </w:pPr>
+            <w:r>
+              <w:rPr>
+                <w:rFonts w:ascii="Arial" w:eastAsia="Arial" w:hAnsi="Arial" w:cs="Arial"/>
+                <w:sz w:val="24"/>
+                <w:szCs w:val="24"/>
+              </w:rPr>
+              <w:t>Registro en la ficha clínica electrónica (SINET Sur); frecuencia de visitas según disponibilidad.</w:t>
+            </w:r>
+            <w:r>
+              <w:rPr>
+                <w:rStyle w:val="Refdecomentario"/>
+                <w:rFonts w:ascii="Arial" w:eastAsia="Arial" w:hAnsi="Arial" w:cs="Arial"/>
+                <w:sz w:val="24"/>
+                <w:szCs w:val="24"/>
+              </w:rPr>
+            </w:r>
+          </w:p>
+        </w:tc>
+        <w:tc>
+          <w:tcPr>
+            <w:tcW w:w="2351" w:type="dxa"/>
+          </w:tcPr>
+          <w:p>
+            <w:pPr>
+              <w:rPr>
+                <w:rFonts w:ascii="Arial" w:eastAsia="Arial" w:hAnsi="Arial" w:cs="Arial"/>
+                <w:sz w:val="24"/>
+                <w:szCs w:val="24"/>
+              </w:rPr>
+            </w:pPr>
+            <w:r>
+              <w:rPr>
+                <w:rFonts w:ascii="Arial" w:eastAsia="Arial" w:hAnsi="Arial" w:cs="Arial"/>
+                <w:sz w:val="24"/>
+                <w:szCs w:val="24"/>
+              </w:rPr>
+              <w:t xml:space="preserve">Falta un registro propio de la </w:t>
+            </w:r>
+            <w:r>
+              <w:rPr>
+                <w:rFonts w:ascii="Arial" w:eastAsia="Arial" w:hAnsi="Arial" w:cs="Arial"/>
+                <w:sz w:val="24"/>
+                <w:szCs w:val="24"/>
+              </w:rPr>
+              <w:t>Atención Farmacéutica</w:t>
+            </w:r>
+            <w:r>
+              <w:rPr>
+                <w:rFonts w:ascii="Arial" w:eastAsia="Arial" w:hAnsi="Arial" w:cs="Arial"/>
+                <w:sz w:val="24"/>
+                <w:szCs w:val="24"/>
+              </w:rPr>
+              <w:t xml:space="preserve"> y una pauta común de seguimiento.</w:t>
+            </w:r>
+          </w:p>
+        </w:tc>
+      </w:tr>
+    </w:tbl>
     <w:p>
       <w:pPr>
         <w:pStyle w:val="Ttulo1"/>
@@ -7183,563 +6896,6 @@
     </w:sectPr>
   </w:body>
 </w:document>
-</file>
-
-<file path=word/comments.xml><?xml version="1.0" encoding="utf-8"?>
-<w:comments xmlns:wpc="http://schemas.microsoft.com/office/word/2010/wordprocessingCanvas" xmlns:cx="http://schemas.microsoft.com/office/drawing/2014/chartex" xmlns:cx1="http://schemas.microsoft.com/office/drawing/2015/9/8/chartex" xmlns:cx2="http://schemas.microsoft.com/office/drawing/2015/10/21/chartex" xmlns:cx3="http://schemas.microsoft.com/office/drawing/2016/5/9/chartex" xmlns:cx4="http://schemas.microsoft.com/office/drawing/2016/5/10/chartex" xmlns:cx5="http://schemas.microsoft.com/office/drawing/2016/5/11/chartex" xmlns:cx6="http://schemas.microsoft.com/office/drawing/2016/5/12/chartex" xmlns:cx7="http://schemas.microsoft.com/office/drawing/2016/5/13/chartex" xmlns:cx8="http://schemas.microsoft.com/office/drawing/2016/5/14/chartex" xmlns:mc="http://schemas.openxmlformats.org/markup-compatibility/2006" xmlns:aink="http://schemas.microsoft.com/office/drawing/2016/ink" xmlns:am3d="http://schemas.microsoft.com/office/drawing/2017/model3d" xmlns:o="urn:schemas-microsoft-com:office:office" xmlns:oel="http://schemas.microsoft.com/office/2019/extlst" xmlns:r="http://schemas.openxmlformats.org/officeDocument/2006/relationships" xmlns:m="http://schemas.openxmlformats.org/officeDocument/2006/math" xmlns:v="urn:schemas-microsoft-com:vml" xmlns:wp14="http://schemas.microsoft.com/office/word/2010/wordprocessingDrawing" xmlns:wp="http://schemas.openxmlformats.org/drawingml/2006/wordprocessingDrawing" xmlns:w10="urn:schemas-microsoft-com:office:word" xmlns:w="http://schemas.openxmlformats.org/wordprocessingml/2006/main" xmlns:w14="http://schemas.microsoft.com/office/word/2010/wordml" xmlns:w15="http://schemas.microsoft.com/office/word/2012/wordml" xmlns:w16cex="http://schemas.microsoft.com/office/word/2018/wordml/cex" xmlns:w16cid="http://schemas.microsoft.com/office/word/2016/wordml/cid" xmlns:w16="http://schemas.microsoft.com/office/word/2018/wordml" xmlns:w16du="http://schemas.microsoft.com/office/word/2023/wordml/word16du" xmlns:w16sdtdh="http://schemas.microsoft.com/office/word/2020/wordml/sdtdatahash" xmlns:w16sdtfl="http://schemas.microsoft.com/office/word/2024/wordml/sdtformatlock" xmlns:w16se="http://schemas.microsoft.com/office/word/2015/wordml/symex" xmlns:wpg="http://schemas.microsoft.com/office/word/2010/wordprocessingGroup" xmlns:wpi="http://schemas.microsoft.com/office/word/2010/wordprocessingInk" xmlns:wne="http://schemas.microsoft.com/office/word/2006/wordml" xmlns:wps="http://schemas.microsoft.com/office/word/2010/wordprocessingShape" mc:Ignorable="w14 w15 w16se w16cid w16 w16cex w16sdtdh w16sdtfl w16du wp14">
-  <w:comment w:id="0" w:author="Diego Jorquera Pereira" w:date="2026-07-15T00:24:00Z" w:initials="DJ">
-    <w:p>
-      <w:pPr>
-        <w:pStyle w:val="Textocomentario"/>
-      </w:pPr>
-      <w:r>
-        <w:rPr>
-          <w:rStyle w:val="Refdecomentario"/>
-        </w:rPr>
-        <w:annotationRef/>
-      </w:r>
-      <w:r>
-        <w:t>El formato sigue mal, revisa los márgenes.</w:t>
-      </w:r>
-    </w:p>
-    <w:p>
-      <w:pPr>
-        <w:pStyle w:val="Textocomentario"/>
-      </w:pPr>
-      <w:r>
-        <w:t>El número romano no se debe ver en la portada.</w:t>
-      </w:r>
-    </w:p>
-    <w:p>
-      <w:pPr>
-        <w:pStyle w:val="Textocomentario"/>
-      </w:pPr>
-      <w:r>
-        <w:t>El logo solo va en la portada.</w:t>
-      </w:r>
-    </w:p>
-  </w:comment>
-  <w:comment w:id="1" w:author="Diego Jorquera Pereira" w:date="2026-07-15T00:24:00Z" w:initials="DJ">
-    <w:p>
-      <w:pPr>
-        <w:pStyle w:val="Textocomentario"/>
-      </w:pPr>
-      <w:r>
-        <w:rPr>
-          <w:rStyle w:val="Refdecomentario"/>
-        </w:rPr>
-        <w:annotationRef/>
-      </w:r>
-      <w:r>
-        <w:t>Acá también hay que revisar el formato.</w:t>
-      </w:r>
-    </w:p>
-  </w:comment>
-  <w:comment w:id="2" w:author="Diego Jorquera Pereira" w:date="2026-07-15T00:24:00Z" w:initials="DJ">
-    <w:p>
-      <w:pPr>
-        <w:pStyle w:val="Textocomentario"/>
-      </w:pPr>
-      <w:r>
-        <w:rPr>
-          <w:rStyle w:val="Refdecomentario"/>
-        </w:rPr>
-        <w:annotationRef/>
-      </w:r>
-      <w:r>
-        <w:t>Revisa el tipo de letra</w:t>
-      </w:r>
-    </w:p>
-  </w:comment>
-  <w:comment w:id="9" w:author="Diego Jorquera Pereira" w:date="2026-07-15T09:32:00Z" w:initials="DJ">
-    <w:p>
-      <w:pPr>
-        <w:pStyle w:val="Textocomentario"/>
-      </w:pPr>
-      <w:r>
-        <w:rPr>
-          <w:rStyle w:val="Refdecomentario"/>
-        </w:rPr>
-        <w:annotationRef/>
-      </w:r>
-      <w:r>
-        <w:t>Eso no es necesario agregarlo, se puede poner en la metodología donde se hizo o después en el marco teórico se da a entender cuando hablas de tu internado.</w:t>
-      </w:r>
-    </w:p>
-  </w:comment>
-  <w:comment w:id="10" w:author="Diego Jorquera Pereira" w:date="2026-07-15T09:41:00Z" w:initials="DJ">
-    <w:p>
-      <w:pPr>
-        <w:pStyle w:val="Textocomentario"/>
-      </w:pPr>
-      <w:r>
-        <w:rPr>
-          <w:rStyle w:val="Refdecomentario"/>
-        </w:rPr>
-        <w:annotationRef/>
-      </w:r>
-      <w:r>
-        <w:t xml:space="preserve">Todo esto debería ir al final. </w:t>
-      </w:r>
-    </w:p>
-    <w:p>
-      <w:pPr>
-        <w:pStyle w:val="Textocomentario"/>
-      </w:pPr>
-      <w:r>
-        <w:t>Parte hablando de todos estos temas y se termina con la problemática del estudio.</w:t>
-      </w:r>
-    </w:p>
-  </w:comment>
-  <w:comment w:id="11" w:author="Diego Jorquera Pereira" w:date="2026-07-15T09:55:00Z" w:initials="DJ">
-    <w:p>
-      <w:pPr>
-        <w:pStyle w:val="Textocomentario"/>
-      </w:pPr>
-      <w:r>
-        <w:rPr>
-          <w:rStyle w:val="Refdecomentario"/>
-        </w:rPr>
-        <w:annotationRef/>
-      </w:r>
-      <w:r>
-        <w:t>Las ideas no están mal, pero debiese ser de lo más macro a lo más micro, de lo general a lo más específico.</w:t>
-      </w:r>
-    </w:p>
-    <w:p>
-      <w:pPr>
-        <w:pStyle w:val="Textocomentario"/>
-      </w:pPr>
-      <w:r>
-        <w:t>Acá hablas de la problemática, pero no tenemos idea del tema.</w:t>
-      </w:r>
-    </w:p>
-  </w:comment>
-  <w:comment w:id="12" w:author="Diego Jorquera Pereira" w:date="2026-07-15T09:55:00Z" w:initials="DJ">
-    <w:p>
-      <w:pPr>
-        <w:pStyle w:val="Textocomentario"/>
-      </w:pPr>
-      <w:r>
-        <w:rPr>
-          <w:rStyle w:val="Refdecomentario"/>
-        </w:rPr>
-        <w:annotationRef/>
-      </w:r>
-      <w:r>
-        <w:t xml:space="preserve">Esto debiese ser un título </w:t>
-      </w:r>
-    </w:p>
-  </w:comment>
-  <w:comment w:id="21" w:author="Diego Jorquera Pereira" w:date="2026-07-15T10:51:00Z" w:initials="DJ">
-    <w:p>
-      <w:pPr>
-        <w:pStyle w:val="Textocomentario"/>
-      </w:pPr>
-      <w:r>
-        <w:rPr>
-          <w:rStyle w:val="Refdecomentario"/>
-        </w:rPr>
-        <w:annotationRef/>
-      </w:r>
-      <w:r>
-        <w:t>Hay que mejorar el orden, algo así:</w:t>
-      </w:r>
-      <w:r>
-        <w:br/>
-      </w:r>
-      <w:r>
-        <w:br/>
-        <w:t>Atención Primaria de Salud</w:t>
-      </w:r>
-      <w:r>
-        <w:br/>
-        <w:t>CESFAM Nonguén</w:t>
-      </w:r>
-    </w:p>
-    <w:p>
-      <w:pPr>
-        <w:pStyle w:val="Textocomentario"/>
-      </w:pPr>
-      <w:r>
-        <w:t xml:space="preserve">Programa de Salud Cardiovascular. </w:t>
-      </w:r>
-    </w:p>
-    <w:p>
-      <w:pPr>
-        <w:pStyle w:val="Textocomentario"/>
-      </w:pPr>
-      <w:r>
-        <w:t xml:space="preserve">Atención Farmacéutica. </w:t>
-      </w:r>
-    </w:p>
-    <w:p>
-      <w:pPr>
-        <w:pStyle w:val="Textocomentario"/>
-      </w:pPr>
-      <w:r>
-        <w:t xml:space="preserve">Rol del químico farmacéutico en APS. </w:t>
-      </w:r>
-    </w:p>
-    <w:p>
-      <w:pPr>
-        <w:pStyle w:val="Textocomentario"/>
-      </w:pPr>
-      <w:r>
-        <w:t xml:space="preserve">Atención Farmacéutica domiciliaria. </w:t>
-      </w:r>
-    </w:p>
-    <w:p>
-      <w:pPr>
-        <w:pStyle w:val="Textocomentario"/>
-      </w:pPr>
-      <w:r>
-        <w:t>Adherencia, polifarmacia, PRM y RNM. (no sé si será necesario todo, va a depender de tu tema)</w:t>
-      </w:r>
-    </w:p>
-    <w:p>
-      <w:pPr>
-        <w:pStyle w:val="Textocomentario"/>
-      </w:pPr>
-      <w:r>
-        <w:t xml:space="preserve">Métodos de seguimiento farmacoterapéutico. </w:t>
-      </w:r>
-    </w:p>
-    <w:p>
-      <w:pPr>
-        <w:pStyle w:val="Textocomentario"/>
-      </w:pPr>
-      <w:r>
-        <w:t>Modelo CMO y otro que estimes pertinente</w:t>
-      </w:r>
-    </w:p>
-    <w:p>
-      <w:pPr>
-        <w:pStyle w:val="Textocomentario"/>
-      </w:pPr>
-      <w:r>
-        <w:t xml:space="preserve">Aplicación del Modelo CMO en el CESFAM Villa Nonguén. </w:t>
-      </w:r>
-    </w:p>
-    <w:p>
-      <w:pPr>
-        <w:pStyle w:val="Textocomentario"/>
-      </w:pPr>
-      <w:r>
-        <w:t xml:space="preserve">Justificación, problemática, algo así </w:t>
-      </w:r>
-    </w:p>
-  </w:comment>
-  <w:comment w:id="24" w:author="Diego Jorquera Pereira" w:date="2026-07-15T10:56:00Z" w:initials="DJ">
-    <w:p>
-      <w:pPr>
-        <w:pStyle w:val="Textocomentario"/>
-      </w:pPr>
-      <w:r>
-        <w:rPr>
-          <w:rStyle w:val="Refdecomentario"/>
-        </w:rPr>
-        <w:annotationRef/>
-      </w:r>
-      <w:r>
-        <w:t>Acá solo hay que poner la pregunta de investigación, se asume que sigue ese formato.</w:t>
-      </w:r>
-    </w:p>
-  </w:comment>
-  <w:comment w:id="27" w:author="Diego Jorquera Pereira" w:date="2026-07-15T10:56:00Z" w:initials="DJ">
-    <w:p>
-      <w:pPr>
-        <w:pStyle w:val="Textocomentario"/>
-      </w:pPr>
-      <w:r>
-        <w:rPr>
-          <w:rStyle w:val="Refdecomentario"/>
-        </w:rPr>
-        <w:annotationRef/>
-      </w:r>
-      <w:r>
-        <w:t>Identificar</w:t>
-      </w:r>
-    </w:p>
-  </w:comment>
-  <w:comment w:id="28" w:author="Diego Jorquera Pereira" w:date="2026-07-15T10:57:00Z" w:initials="DJ">
-    <w:p>
-      <w:pPr>
-        <w:pStyle w:val="Textocomentario"/>
-      </w:pPr>
-      <w:r>
-        <w:rPr>
-          <w:rStyle w:val="Refdecomentario"/>
-        </w:rPr>
-        <w:annotationRef/>
-      </w:r>
-      <w:r>
-        <w:t>Primero hay que elaborarlo y después aplicar. Si tu objetivo es aplicar, el general debería ser APLICACIÓN DE UN PROTOCOLO...</w:t>
-      </w:r>
-    </w:p>
-  </w:comment>
-  <w:comment w:id="29" w:author="Diego Jorquera Pereira" w:date="2026-07-15T11:11:00Z" w:initials="DJ">
-    <w:p>
-      <w:pPr>
-        <w:pStyle w:val="Textocomentario"/>
-      </w:pPr>
-      <w:r>
-        <w:rPr>
-          <w:rStyle w:val="Refdecomentario"/>
-        </w:rPr>
-        <w:annotationRef/>
-      </w:r>
-      <w:r>
-        <w:t>Hay que mejorar los objetivos.</w:t>
-      </w:r>
-      <w:r>
-        <w:br/>
-        <w:t>GENERAL: Aplicación</w:t>
-      </w:r>
-      <w:r>
-        <w:br/>
-      </w:r>
-      <w:r>
-        <w:br/>
-        <w:t>Específicos</w:t>
-      </w:r>
-      <w:r>
-        <w:br/>
-        <w:t>BRECHAS</w:t>
-      </w:r>
-      <w:r>
-        <w:br/>
-        <w:t>ELABORAR EL PROTOLOCO</w:t>
-      </w:r>
-      <w:r>
-        <w:br/>
-        <w:t>Y el 3ero algo que se relacione con la aplicación.</w:t>
-      </w:r>
-    </w:p>
-  </w:comment>
-  <w:comment w:id="36" w:author="Diego Jorquera Pereira" w:date="2026-07-15T11:13:00Z" w:initials="DJ">
-    <w:p>
-      <w:pPr>
-        <w:pStyle w:val="Textocomentario"/>
-      </w:pPr>
-      <w:r>
-        <w:rPr>
-          <w:rStyle w:val="Refdecomentario"/>
-        </w:rPr>
-        <w:annotationRef/>
-      </w:r>
-      <w:r>
-        <w:t>Acá solo debes poner CÓMO harás este objetivo, cómo verás esas brechas, que protocolos analizarás o cómo se obtendrá esta info.</w:t>
-      </w:r>
-    </w:p>
-  </w:comment>
-  <w:comment w:id="37" w:author="Diego Jorquera Pereira" w:date="2026-07-15T11:14:00Z" w:initials="DJ">
-    <w:p>
-      <w:pPr>
-        <w:pStyle w:val="Textocomentario"/>
-      </w:pPr>
-      <w:r>
-        <w:rPr>
-          <w:rStyle w:val="Refdecomentario"/>
-        </w:rPr>
-        <w:annotationRef/>
-      </w:r>
-      <w:r>
-        <w:t>Hay algunos resultados, hay que mejorarlo</w:t>
-      </w:r>
-    </w:p>
-  </w:comment>
-  <w:comment w:id="38" w:author="Diego Jorquera Pereira" w:date="2026-07-15T11:14:00Z" w:initials="DJ">
-    <w:p>
-      <w:pPr>
-        <w:pStyle w:val="Textocomentario"/>
-      </w:pPr>
-      <w:r>
-        <w:rPr>
-          <w:rStyle w:val="Refdecomentario"/>
-        </w:rPr>
-        <w:annotationRef/>
-      </w:r>
-      <w:r>
-        <w:t xml:space="preserve">Hay info que está bien si </w:t>
-      </w:r>
-    </w:p>
-  </w:comment>
-  <w:comment w:id="39" w:author="Diego Jorquera Pereira" w:date="2026-07-15T11:15:00Z" w:initials="DJ">
-    <w:p>
-      <w:pPr>
-        <w:pStyle w:val="Textocomentario"/>
-      </w:pPr>
-      <w:r>
-        <w:rPr>
-          <w:rStyle w:val="Refdecomentario"/>
-        </w:rPr>
-        <w:annotationRef/>
-      </w:r>
-      <w:r>
-        <w:t>Toda esa fila es resultado</w:t>
-      </w:r>
-    </w:p>
-  </w:comment>
-  <w:comment w:id="42" w:author="Diego Jorquera Pereira" w:date="2026-07-15T11:20:00Z" w:initials="DJ">
-    <w:p>
-      <w:pPr>
-        <w:pStyle w:val="Textocomentario"/>
-      </w:pPr>
-      <w:r>
-        <w:rPr>
-          <w:rStyle w:val="Refdecomentario"/>
-        </w:rPr>
-        <w:annotationRef/>
-      </w:r>
-      <w:r>
-        <w:t xml:space="preserve">Hay que reordenar la info, hay cosas que son resultados y no metodología. </w:t>
-      </w:r>
-    </w:p>
-  </w:comment>
-  <w:comment w:id="45" w:author="Diego Jorquera Pereira" w:date="2026-07-15T11:19:00Z" w:initials="DJ">
-    <w:p>
-      <w:pPr>
-        <w:pStyle w:val="Textocomentario"/>
-      </w:pPr>
-      <w:r>
-        <w:rPr>
-          <w:rStyle w:val="Refdecomentario"/>
-        </w:rPr>
-        <w:annotationRef/>
-      </w:r>
-      <w:r>
-        <w:t>Un poco informal eso</w:t>
-      </w:r>
-    </w:p>
-  </w:comment>
-  <w:comment w:id="46" w:author="Diego Jorquera Pereira" w:date="2026-07-15T11:19:00Z" w:initials="DJ">
-    <w:p>
-      <w:pPr>
-        <w:pStyle w:val="Textocomentario"/>
-      </w:pPr>
-      <w:r>
-        <w:rPr>
-          <w:rStyle w:val="Refdecomentario"/>
-        </w:rPr>
-        <w:annotationRef/>
-      </w:r>
-      <w:r>
-        <w:t xml:space="preserve">Eso es dato sensible, pero ahí lo conversamos </w:t>
-      </w:r>
-    </w:p>
-  </w:comment>
-  <w:comment w:id="49" w:author="Diego Jorquera Pereira" w:date="2026-07-15T11:20:00Z" w:initials="DJ">
-    <w:p>
-      <w:pPr>
-        <w:pStyle w:val="Textocomentario"/>
-      </w:pPr>
-      <w:r>
-        <w:rPr>
-          <w:rStyle w:val="Refdecomentario"/>
-        </w:rPr>
-        <w:annotationRef/>
-      </w:r>
-      <w:r>
-        <w:t xml:space="preserve">Arriba pusiste algo de pacientes </w:t>
-      </w:r>
-    </w:p>
-  </w:comment>
-  <w:comment w:id="50" w:author="Diego Jorquera Pereira" w:date="2026-07-15T11:21:00Z" w:initials="DJ">
-    <w:p>
-      <w:pPr>
-        <w:pStyle w:val="Textocomentario"/>
-      </w:pPr>
-      <w:r>
-        <w:rPr>
-          <w:rStyle w:val="Refdecomentario"/>
-        </w:rPr>
-        <w:annotationRef/>
-      </w:r>
-      <w:r>
-        <w:t>La redacción mejoró harto, no se ve tan IA como la vez anterior.</w:t>
-      </w:r>
-    </w:p>
-  </w:comment>
-</w:comments>
-</file>
-
-<file path=word/commentsExtended.xml><?xml version="1.0" encoding="utf-8"?>
-<w15:commentsEx xmlns:wpc="http://schemas.microsoft.com/office/word/2010/wordprocessingCanvas" xmlns:cx="http://schemas.microsoft.com/office/drawing/2014/chartex" xmlns:cx1="http://schemas.microsoft.com/office/drawing/2015/9/8/chartex" xmlns:cx2="http://schemas.microsoft.com/office/drawing/2015/10/21/chartex" xmlns:cx3="http://schemas.microsoft.com/office/drawing/2016/5/9/chartex" xmlns:cx4="http://schemas.microsoft.com/office/drawing/2016/5/10/chartex" xmlns:cx5="http://schemas.microsoft.com/office/drawing/2016/5/11/chartex" xmlns:cx6="http://schemas.microsoft.com/office/drawing/2016/5/12/chartex" xmlns:cx7="http://schemas.microsoft.com/office/drawing/2016/5/13/chartex" xmlns:cx8="http://schemas.microsoft.com/office/drawing/2016/5/14/chartex" xmlns:mc="http://schemas.openxmlformats.org/markup-compatibility/2006" xmlns:aink="http://schemas.microsoft.com/office/drawing/2016/ink" xmlns:am3d="http://schemas.microsoft.com/office/drawing/2017/model3d" xmlns:o="urn:schemas-microsoft-com:office:office" xmlns:oel="http://schemas.microsoft.com/office/2019/extlst" xmlns:r="http://schemas.openxmlformats.org/officeDocument/2006/relationships" xmlns:m="http://schemas.openxmlformats.org/officeDocument/2006/math" xmlns:v="urn:schemas-microsoft-com:vml" xmlns:wp14="http://schemas.microsoft.com/office/word/2010/wordprocessingDrawing" xmlns:wp="http://schemas.openxmlformats.org/drawingml/2006/wordprocessingDrawing" xmlns:w10="urn:schemas-microsoft-com:office:word" xmlns:w="http://schemas.openxmlformats.org/wordprocessingml/2006/main" xmlns:w14="http://schemas.microsoft.com/office/word/2010/wordml" xmlns:w15="http://schemas.microsoft.com/office/word/2012/wordml" xmlns:w16cex="http://schemas.microsoft.com/office/word/2018/wordml/cex" xmlns:w16cid="http://schemas.microsoft.com/office/word/2016/wordml/cid" xmlns:w16="http://schemas.microsoft.com/office/word/2018/wordml" xmlns:w16du="http://schemas.microsoft.com/office/word/2023/wordml/word16du" xmlns:w16sdtdh="http://schemas.microsoft.com/office/word/2020/wordml/sdtdatahash" xmlns:w16sdtfl="http://schemas.microsoft.com/office/word/2024/wordml/sdtformatlock" xmlns:w16se="http://schemas.microsoft.com/office/word/2015/wordml/symex" xmlns:wpg="http://schemas.microsoft.com/office/word/2010/wordprocessingGroup" xmlns:wpi="http://schemas.microsoft.com/office/word/2010/wordprocessingInk" xmlns:wne="http://schemas.microsoft.com/office/word/2006/wordml" xmlns:wps="http://schemas.microsoft.com/office/word/2010/wordprocessingShape" mc:Ignorable="w14 w15 w16se w16cid w16 w16cex w16sdtdh w16sdtfl w16du wp14">
-  <w15:commentEx w15:paraId="710BFD64" w15:done="0"/>
-  <w15:commentEx w15:paraId="74823426" w15:done="0"/>
-  <w15:commentEx w15:paraId="567686B7" w15:done="0"/>
-  <w15:commentEx w15:paraId="55C5E245" w15:done="0"/>
-  <w15:commentEx w15:paraId="4C6180BE" w15:done="0"/>
-  <w15:commentEx w15:paraId="0E745A46" w15:done="0"/>
-  <w15:commentEx w15:paraId="33640EDD" w15:done="0"/>
-  <w15:commentEx w15:paraId="2D5A59A8" w15:done="0"/>
-  <w15:commentEx w15:paraId="33FDBD83" w15:done="0"/>
-  <w15:commentEx w15:paraId="5CE07A6B" w15:done="0"/>
-  <w15:commentEx w15:paraId="3B81CDB8" w15:done="0"/>
-  <w15:commentEx w15:paraId="2A3108B9" w15:done="0"/>
-  <w15:commentEx w15:paraId="65AB2200" w15:done="0"/>
-  <w15:commentEx w15:paraId="74F76CE3" w15:paraIdParent="65AB2200" w15:done="0"/>
-  <w15:commentEx w15:paraId="240CC40E" w15:paraIdParent="65AB2200" w15:done="0"/>
-  <w15:commentEx w15:paraId="77443660" w15:done="0"/>
-  <w15:commentEx w15:paraId="386EC855" w15:done="0"/>
-  <w15:commentEx w15:paraId="447BFF48" w15:done="0"/>
-  <w15:commentEx w15:paraId="1ABACD25" w15:done="0"/>
-  <w15:commentEx w15:paraId="162545A8" w15:done="0"/>
-  <w15:commentEx w15:paraId="470302DF" w15:done="0"/>
-</w15:commentsEx>
-</file>
-
-<file path=word/commentsExtensible.xml><?xml version="1.0" encoding="utf-8"?>
-<w16cex:commentsExtensible xmlns:wpc="http://schemas.microsoft.com/office/word/2010/wordprocessingCanvas" xmlns:cx="http://schemas.microsoft.com/office/drawing/2014/chartex" xmlns:cx1="http://schemas.microsoft.com/office/drawing/2015/9/8/chartex" xmlns:cx2="http://schemas.microsoft.com/office/drawing/2015/10/21/chartex" xmlns:cx3="http://schemas.microsoft.com/office/drawing/2016/5/9/chartex" xmlns:cx4="http://schemas.microsoft.com/office/drawing/2016/5/10/chartex" xmlns:cx5="http://schemas.microsoft.com/office/drawing/2016/5/11/chartex" xmlns:cx6="http://schemas.microsoft.com/office/drawing/2016/5/12/chartex" xmlns:cx7="http://schemas.microsoft.com/office/drawing/2016/5/13/chartex" xmlns:cx8="http://schemas.microsoft.com/office/drawing/2016/5/14/chartex" xmlns:cr="http://schemas.microsoft.com/office/comments/2020/reactions" xmlns:mc="http://schemas.openxmlformats.org/markup-compatibility/2006" xmlns:aink="http://schemas.microsoft.com/office/drawing/2016/ink" xmlns:am3d="http://schemas.microsoft.com/office/drawing/2017/model3d" xmlns:o="urn:schemas-microsoft-com:office:office" xmlns:oel="http://schemas.microsoft.com/office/2019/extlst" xmlns:r="http://schemas.openxmlformats.org/officeDocument/2006/relationships" xmlns:m="http://schemas.openxmlformats.org/officeDocument/2006/math" xmlns:v="urn:schemas-microsoft-com:vml" xmlns:wp14="http://schemas.microsoft.com/office/word/2010/wordprocessingDrawing" xmlns:wp="http://schemas.openxmlformats.org/drawingml/2006/wordprocessingDrawing" xmlns:w10="urn:schemas-microsoft-com:office:word" xmlns:w="http://schemas.openxmlformats.org/wordprocessingml/2006/main" xmlns:w14="http://schemas.microsoft.com/office/word/2010/wordml" xmlns:w15="http://schemas.microsoft.com/office/word/2012/wordml" xmlns:w16cex="http://schemas.microsoft.com/office/word/2018/wordml/cex" xmlns:w16cid="http://schemas.microsoft.com/office/word/2016/wordml/cid" xmlns:w16="http://schemas.microsoft.com/office/word/2018/wordml" xmlns:w16du="http://schemas.microsoft.com/office/word/2023/wordml/word16du" xmlns:w16sdtdh="http://schemas.microsoft.com/office/word/2020/wordml/sdtdatahash" xmlns:w16sdtfl="http://schemas.microsoft.com/office/word/2024/wordml/sdtformatlock" xmlns:w16se="http://schemas.microsoft.com/office/word/2015/wordml/symex" xmlns:wpg="http://schemas.microsoft.com/office/word/2010/wordprocessingGroup" xmlns:wpi="http://schemas.microsoft.com/office/word/2010/wordprocessingInk" xmlns:wne="http://schemas.microsoft.com/office/word/2006/wordml" xmlns:wps="http://schemas.microsoft.com/office/word/2010/wordprocessingShape" mc:Ignorable="w14 w15 w16se w16cid w16 w16cex w16sdtdh w16sdtfl cr w16du wp14">
-  <w16cex:commentExtensible w16cex:durableId="6D131B82" w16cex:dateUtc="2026-07-15T04:24:00Z"/>
-  <w16cex:commentExtensible w16cex:durableId="063AC077" w16cex:dateUtc="2026-07-15T04:24:00Z"/>
-  <w16cex:commentExtensible w16cex:durableId="7174C4F8" w16cex:dateUtc="2026-07-15T04:24:00Z"/>
-  <w16cex:commentExtensible w16cex:durableId="6BF050C3" w16cex:dateUtc="2026-07-15T13:32:00Z"/>
-  <w16cex:commentExtensible w16cex:durableId="3A7C1C05" w16cex:dateUtc="2026-07-15T13:41:00Z"/>
-  <w16cex:commentExtensible w16cex:durableId="71F53F7E" w16cex:dateUtc="2026-07-15T13:55:00Z"/>
-  <w16cex:commentExtensible w16cex:durableId="5AEB88C5" w16cex:dateUtc="2026-07-15T13:55:00Z"/>
-  <w16cex:commentExtensible w16cex:durableId="69B6D103" w16cex:dateUtc="2026-07-15T14:51:00Z"/>
-  <w16cex:commentExtensible w16cex:durableId="0950DD33" w16cex:dateUtc="2026-07-15T14:56:00Z"/>
-  <w16cex:commentExtensible w16cex:durableId="681B4E47" w16cex:dateUtc="2026-07-15T14:56:00Z"/>
-  <w16cex:commentExtensible w16cex:durableId="040ACDA0" w16cex:dateUtc="2026-07-15T14:57:00Z"/>
-  <w16cex:commentExtensible w16cex:durableId="60EA67C8" w16cex:dateUtc="2026-07-15T15:11:00Z"/>
-  <w16cex:commentExtensible w16cex:durableId="67B4C2A2" w16cex:dateUtc="2026-07-15T15:13:00Z"/>
-  <w16cex:commentExtensible w16cex:durableId="42750B3F" w16cex:dateUtc="2026-07-15T15:14:00Z"/>
-  <w16cex:commentExtensible w16cex:durableId="6554B621" w16cex:dateUtc="2026-07-15T15:14:00Z"/>
-  <w16cex:commentExtensible w16cex:durableId="33BB5593" w16cex:dateUtc="2026-07-15T15:15:00Z"/>
-  <w16cex:commentExtensible w16cex:durableId="044C9449" w16cex:dateUtc="2026-07-15T15:20:00Z"/>
-  <w16cex:commentExtensible w16cex:durableId="1F7FDDE7" w16cex:dateUtc="2026-07-15T15:19:00Z"/>
-  <w16cex:commentExtensible w16cex:durableId="6E583F3C" w16cex:dateUtc="2026-07-15T15:19:00Z"/>
-  <w16cex:commentExtensible w16cex:durableId="4408437F" w16cex:dateUtc="2026-07-15T15:20:00Z"/>
-  <w16cex:commentExtensible w16cex:durableId="70C36974" w16cex:dateUtc="2026-07-15T15:21:00Z"/>
-</w16cex:commentsExtensible>
-</file>
-
-<file path=word/commentsIds.xml><?xml version="1.0" encoding="utf-8"?>
-<w16cid:commentsIds xmlns:wpc="http://schemas.microsoft.com/office/word/2010/wordprocessingCanvas" xmlns:cx="http://schemas.microsoft.com/office/drawing/2014/chartex" xmlns:cx1="http://schemas.microsoft.com/office/drawing/2015/9/8/chartex" xmlns:cx2="http://schemas.microsoft.com/office/drawing/2015/10/21/chartex" xmlns:cx3="http://schemas.microsoft.com/office/drawing/2016/5/9/chartex" xmlns:cx4="http://schemas.microsoft.com/office/drawing/2016/5/10/chartex" xmlns:cx5="http://schemas.microsoft.com/office/drawing/2016/5/11/chartex" xmlns:cx6="http://schemas.microsoft.com/office/drawing/2016/5/12/chartex" xmlns:cx7="http://schemas.microsoft.com/office/drawing/2016/5/13/chartex" xmlns:cx8="http://schemas.microsoft.com/office/drawing/2016/5/14/chartex" xmlns:mc="http://schemas.openxmlformats.org/markup-compatibility/2006" xmlns:aink="http://schemas.microsoft.com/office/drawing/2016/ink" xmlns:am3d="http://schemas.microsoft.com/office/drawing/2017/model3d" xmlns:o="urn:schemas-microsoft-com:office:office" xmlns:oel="http://schemas.microsoft.com/office/2019/extlst" xmlns:r="http://schemas.openxmlformats.org/officeDocument/2006/relationships" xmlns:m="http://schemas.openxmlformats.org/officeDocument/2006/math" xmlns:v="urn:schemas-microsoft-com:vml" xmlns:wp14="http://schemas.microsoft.com/office/word/2010/wordprocessingDrawing" xmlns:wp="http://schemas.openxmlformats.org/drawingml/2006/wordprocessingDrawing" xmlns:w10="urn:schemas-microsoft-com:office:word" xmlns:w="http://schemas.openxmlformats.org/wordprocessingml/2006/main" xmlns:w14="http://schemas.microsoft.com/office/word/2010/wordml" xmlns:w15="http://schemas.microsoft.com/office/word/2012/wordml" xmlns:w16cex="http://schemas.microsoft.com/office/word/2018/wordml/cex" xmlns:w16cid="http://schemas.microsoft.com/office/word/2016/wordml/cid" xmlns:w16="http://schemas.microsoft.com/office/word/2018/wordml" xmlns:w16du="http://schemas.microsoft.com/office/word/2023/wordml/word16du" xmlns:w16sdtdh="http://schemas.microsoft.com/office/word/2020/wordml/sdtdatahash" xmlns:w16sdtfl="http://schemas.microsoft.com/office/word/2024/wordml/sdtformatlock" xmlns:w16se="http://schemas.microsoft.com/office/word/2015/wordml/symex" xmlns:wpg="http://schemas.microsoft.com/office/word/2010/wordprocessingGroup" xmlns:wpi="http://schemas.microsoft.com/office/word/2010/wordprocessingInk" xmlns:wne="http://schemas.microsoft.com/office/word/2006/wordml" xmlns:wps="http://schemas.microsoft.com/office/word/2010/wordprocessingShape" mc:Ignorable="w14 w15 w16se w16cid w16 w16cex w16sdtdh w16sdtfl w16du wp14">
-  <w16cid:commentId w16cid:paraId="710BFD64" w16cid:durableId="6D131B82"/>
-  <w16cid:commentId w16cid:paraId="74823426" w16cid:durableId="063AC077"/>
-  <w16cid:commentId w16cid:paraId="567686B7" w16cid:durableId="7174C4F8"/>
-  <w16cid:commentId w16cid:paraId="55C5E245" w16cid:durableId="6BF050C3"/>
-  <w16cid:commentId w16cid:paraId="4C6180BE" w16cid:durableId="3A7C1C05"/>
-  <w16cid:commentId w16cid:paraId="0E745A46" w16cid:durableId="71F53F7E"/>
-  <w16cid:commentId w16cid:paraId="33640EDD" w16cid:durableId="5AEB88C5"/>
-  <w16cid:commentId w16cid:paraId="2D5A59A8" w16cid:durableId="69B6D103"/>
-  <w16cid:commentId w16cid:paraId="33FDBD83" w16cid:durableId="0950DD33"/>
-  <w16cid:commentId w16cid:paraId="5CE07A6B" w16cid:durableId="681B4E47"/>
-  <w16cid:commentId w16cid:paraId="3B81CDB8" w16cid:durableId="040ACDA0"/>
-  <w16cid:commentId w16cid:paraId="2A3108B9" w16cid:durableId="60EA67C8"/>
-  <w16cid:commentId w16cid:paraId="65AB2200" w16cid:durableId="67B4C2A2"/>
-  <w16cid:commentId w16cid:paraId="74F76CE3" w16cid:durableId="42750B3F"/>
-  <w16cid:commentId w16cid:paraId="240CC40E" w16cid:durableId="6554B621"/>
-  <w16cid:commentId w16cid:paraId="77443660" w16cid:durableId="33BB5593"/>
-  <w16cid:commentId w16cid:paraId="386EC855" w16cid:durableId="044C9449"/>
-  <w16cid:commentId w16cid:paraId="447BFF48" w16cid:durableId="1F7FDDE7"/>
-  <w16cid:commentId w16cid:paraId="1ABACD25" w16cid:durableId="6E583F3C"/>
-  <w16cid:commentId w16cid:paraId="162545A8" w16cid:durableId="4408437F"/>
-  <w16cid:commentId w16cid:paraId="470302DF" w16cid:durableId="70C36974"/>
-</w16cid:commentsIds>
 </file>
 
 <file path=word/endnotes.xml><?xml version="1.0" encoding="utf-8"?>
@@ -7859,6 +7015,16 @@
 </w:ftr>
 </file>
 
+<file path=word/footer3.xml><?xml version="1.0" encoding="utf-8"?>
+<w:ftr xmlns:m="http://schemas.openxmlformats.org/officeDocument/2006/math" xmlns:mc="http://schemas.openxmlformats.org/markup-compatibility/2006" xmlns:mo="http://schemas.microsoft.com/office/mac/office/2008/main" xmlns:mv="urn:schemas-microsoft-com:mac:vml" xmlns:o="urn:schemas-microsoft-com:office:office" xmlns:r="http://schemas.openxmlformats.org/officeDocument/2006/relationships" xmlns:v="urn:schemas-microsoft-com:vml" xmlns:w10="urn:schemas-microsoft-com:office:word" xmlns:w14="http://schemas.microsoft.com/office/word/2010/wordml" xmlns:w="http://schemas.openxmlformats.org/wordprocessingml/2006/main" xmlns:wne="http://schemas.microsoft.com/office/word/2006/wordml" xmlns:wp14="http://schemas.microsoft.com/office/word/2010/wordprocessingDrawing" xmlns:wp="http://schemas.openxmlformats.org/drawingml/2006/wordprocessingDrawing" xmlns:wpc="http://schemas.microsoft.com/office/word/2010/wordprocessingCanvas" xmlns:wpg="http://schemas.microsoft.com/office/word/2010/wordprocessingGroup" xmlns:wpi="http://schemas.microsoft.com/office/word/2010/wordprocessingInk" xmlns:wps="http://schemas.microsoft.com/office/word/2010/wordprocessingShape" mc:Ignorable="w14 wp14">
+  <w:p>
+    <w:pPr>
+      <w:pStyle w:val="Footer"/>
+    </w:pPr>
+  </w:p>
+</w:ftr>
+</file>
+
 <file path=word/footnotes.xml><?xml version="1.0" encoding="utf-8"?>
 <w:footnotes xmlns:wpc="http://schemas.microsoft.com/office/word/2010/wordprocessingCanvas" xmlns:cx="http://schemas.microsoft.com/office/drawing/2014/chartex" xmlns:cx1="http://schemas.microsoft.com/office/drawing/2015/9/8/chartex" xmlns:cx2="http://schemas.microsoft.com/office/drawing/2015/10/21/chartex" xmlns:cx3="http://schemas.microsoft.com/office/drawing/2016/5/9/chartex" xmlns:cx4="http://schemas.microsoft.com/office/drawing/2016/5/10/chartex" xmlns:cx5="http://schemas.microsoft.com/office/drawing/2016/5/11/chartex" xmlns:cx6="http://schemas.microsoft.com/office/drawing/2016/5/12/chartex" xmlns:cx7="http://schemas.microsoft.com/office/drawing/2016/5/13/chartex" xmlns:cx8="http://schemas.microsoft.com/office/drawing/2016/5/14/chartex" xmlns:mc="http://schemas.openxmlformats.org/markup-compatibility/2006" xmlns:aink="http://schemas.microsoft.com/office/drawing/2016/ink" xmlns:am3d="http://schemas.microsoft.com/office/drawing/2017/model3d" xmlns:o="urn:schemas-microsoft-com:office:office" xmlns:oel="http://schemas.microsoft.com/office/2019/extlst" xmlns:r="http://schemas.openxmlformats.org/officeDocument/2006/relationships" xmlns:m="http://schemas.openxmlformats.org/officeDocument/2006/math" xmlns:v="urn:schemas-microsoft-com:vml" xmlns:wp14="http://schemas.microsoft.com/office/word/2010/wordprocessingDrawing" xmlns:wp="http://schemas.openxmlformats.org/drawingml/2006/wordprocessingDrawing" xmlns:w10="urn:schemas-microsoft-com:office:word" xmlns:w="http://schemas.openxmlformats.org/wordprocessingml/2006/main" xmlns:w14="http://schemas.microsoft.com/office/word/2010/wordml" xmlns:w15="http://schemas.microsoft.com/office/word/2012/wordml" xmlns:w16cex="http://schemas.microsoft.com/office/word/2018/wordml/cex" xmlns:w16cid="http://schemas.microsoft.com/office/word/2016/wordml/cid" xmlns:w16="http://schemas.microsoft.com/office/word/2018/wordml" xmlns:w16du="http://schemas.microsoft.com/office/word/2023/wordml/word16du" xmlns:w16sdtdh="http://schemas.microsoft.com/office/word/2020/wordml/sdtdatahash" xmlns:w16sdtfl="http://schemas.microsoft.com/office/word/2024/wordml/sdtformatlock" xmlns:w16se="http://schemas.microsoft.com/office/word/2015/wordml/symex" xmlns:wpg="http://schemas.microsoft.com/office/word/2010/wordprocessingGroup" xmlns:wpi="http://schemas.microsoft.com/office/word/2010/wordprocessingInk" xmlns:wne="http://schemas.microsoft.com/office/word/2006/wordml" xmlns:wps="http://schemas.microsoft.com/office/word/2010/wordprocessingShape" mc:Ignorable="w14 w15 w16se w16cid w16 w16cex w16sdtdh w16sdtfl w16du wp14">
   <w:footnote w:type="separator" w:id="-1">
@@ -7890,74 +7056,6 @@
     <w:pPr>
       <w:pStyle w:val="Encabezado"/>
     </w:pPr>
-    <w:r>
-      <w:rPr>
-        <w:noProof/>
-        <w:lang w:eastAsia="es-CL"/>
-      </w:rPr>
-      <w:drawing>
-        <wp:anchor distT="0" distB="0" distL="114300" distR="114300" simplePos="0" relativeHeight="251662848" behindDoc="1" locked="0" layoutInCell="1" allowOverlap="1" wp14:anchorId="24117D8A" wp14:editId="4E09CF54">
-          <wp:simplePos x="0" y="0"/>
-          <wp:positionH relativeFrom="margin">
-            <wp:align>left</wp:align>
-          </wp:positionH>
-          <wp:positionV relativeFrom="paragraph">
-            <wp:posOffset>-214630</wp:posOffset>
-          </wp:positionV>
-          <wp:extent cx="1936137" cy="657225"/>
-          <wp:effectExtent l="0" t="0" r="6985" b="0"/>
-          <wp:wrapNone/>
-          <wp:docPr id="201234744" name="Imagen 201234744" descr="Postgrado Medicina y Ciencia | Universidad San Sebastián | USS"/>
-          <wp:cNvGraphicFramePr>
-            <a:graphicFrameLocks xmlns:a="http://schemas.openxmlformats.org/drawingml/2006/main" noChangeAspect="1"/>
-          </wp:cNvGraphicFramePr>
-          <a:graphic xmlns:a="http://schemas.openxmlformats.org/drawingml/2006/main">
-            <a:graphicData uri="http://schemas.openxmlformats.org/drawingml/2006/picture">
-              <pic:pic xmlns:pic="http://schemas.openxmlformats.org/drawingml/2006/picture">
-                <pic:nvPicPr>
-                  <pic:cNvPr id="0" name="Picture 1" descr="Postgrado Medicina y Ciencia | Universidad San Sebastián | USS"/>
-                  <pic:cNvPicPr>
-                    <a:picLocks noChangeAspect="1" noChangeArrowheads="1"/>
-                  </pic:cNvPicPr>
-                </pic:nvPicPr>
-                <pic:blipFill>
-                  <a:blip r:embed="rId1" cstate="print">
-                    <a:extLst>
-                      <a:ext uri="{28A0092B-C50C-407E-A947-70E740481C1C}">
-                        <a14:useLocalDpi xmlns:a14="http://schemas.microsoft.com/office/drawing/2010/main" val="0"/>
-                      </a:ext>
-                    </a:extLst>
-                  </a:blip>
-                  <a:srcRect/>
-                  <a:stretch>
-                    <a:fillRect/>
-                  </a:stretch>
-                </pic:blipFill>
-                <pic:spPr bwMode="auto">
-                  <a:xfrm>
-                    <a:off x="0" y="0"/>
-                    <a:ext cx="1936137" cy="657225"/>
-                  </a:xfrm>
-                  <a:prstGeom prst="rect">
-                    <a:avLst/>
-                  </a:prstGeom>
-                  <a:noFill/>
-                  <a:ln>
-                    <a:noFill/>
-                  </a:ln>
-                </pic:spPr>
-              </pic:pic>
-            </a:graphicData>
-          </a:graphic>
-          <wp14:sizeRelH relativeFrom="margin">
-            <wp14:pctWidth>0</wp14:pctWidth>
-          </wp14:sizeRelH>
-          <wp14:sizeRelV relativeFrom="margin">
-            <wp14:pctHeight>0</wp14:pctHeight>
-          </wp14:sizeRelV>
-        </wp:anchor>
-      </w:drawing>
-    </w:r>
   </w:p>
 </w:hdr>
 </file>
@@ -7968,72 +7066,49 @@
     <w:pPr>
       <w:pStyle w:val="Encabezado"/>
     </w:pPr>
+  </w:p>
+</w:hdr>
+</file>
+
+<file path=word/header3.xml><?xml version="1.0" encoding="utf-8"?>
+<w:hdr xmlns:m="http://schemas.openxmlformats.org/officeDocument/2006/math" xmlns:mc="http://schemas.openxmlformats.org/markup-compatibility/2006" xmlns:mo="http://schemas.microsoft.com/office/mac/office/2008/main" xmlns:mv="urn:schemas-microsoft-com:mac:vml" xmlns:o="urn:schemas-microsoft-com:office:office" xmlns:r="http://schemas.openxmlformats.org/officeDocument/2006/relationships" xmlns:v="urn:schemas-microsoft-com:vml" xmlns:w10="urn:schemas-microsoft-com:office:word" xmlns:w14="http://schemas.microsoft.com/office/word/2010/wordml" xmlns:w="http://schemas.openxmlformats.org/wordprocessingml/2006/main" xmlns:wne="http://schemas.microsoft.com/office/word/2006/wordml" xmlns:wp14="http://schemas.microsoft.com/office/word/2010/wordprocessingDrawing" xmlns:wp="http://schemas.openxmlformats.org/drawingml/2006/wordprocessingDrawing" xmlns:wpc="http://schemas.microsoft.com/office/word/2010/wordprocessingCanvas" xmlns:wpg="http://schemas.microsoft.com/office/word/2010/wordprocessingGroup" xmlns:wpi="http://schemas.microsoft.com/office/word/2010/wordprocessingInk" xmlns:wps="http://schemas.microsoft.com/office/word/2010/wordprocessingShape" mc:Ignorable="w14 wp14">
+  <w:p>
+    <w:pPr>
+      <w:pStyle w:val="Header"/>
+      <w:jc w:val="left"/>
+    </w:pPr>
     <w:r>
-      <w:rPr>
-        <w:noProof/>
-        <w:lang w:eastAsia="es-CL"/>
-      </w:rPr>
       <w:drawing>
-        <wp:anchor distT="0" distB="0" distL="114300" distR="114300" simplePos="0" relativeHeight="251660800" behindDoc="1" locked="0" layoutInCell="1" allowOverlap="1" wp14:anchorId="314666B2" wp14:editId="5CFB0912">
-          <wp:simplePos x="0" y="0"/>
-          <wp:positionH relativeFrom="margin">
-            <wp:align>left</wp:align>
-          </wp:positionH>
-          <wp:positionV relativeFrom="paragraph">
-            <wp:posOffset>-214630</wp:posOffset>
-          </wp:positionV>
-          <wp:extent cx="1936137" cy="657225"/>
-          <wp:effectExtent l="0" t="0" r="6985" b="0"/>
-          <wp:wrapNone/>
-          <wp:docPr id="173815460" name="Imagen 173815460" descr="Postgrado Medicina y Ciencia | Universidad San Sebastián | USS"/>
+        <wp:inline xmlns:a="http://schemas.openxmlformats.org/drawingml/2006/main" xmlns:pic="http://schemas.openxmlformats.org/drawingml/2006/picture">
+          <wp:extent cx="1936137" cy="658686"/>
+          <wp:docPr id="1" name="Picture 1"/>
           <wp:cNvGraphicFramePr>
-            <a:graphicFrameLocks xmlns:a="http://schemas.openxmlformats.org/drawingml/2006/main" noChangeAspect="1"/>
+            <a:graphicFrameLocks noChangeAspect="1"/>
           </wp:cNvGraphicFramePr>
-          <a:graphic xmlns:a="http://schemas.openxmlformats.org/drawingml/2006/main">
+          <a:graphic>
             <a:graphicData uri="http://schemas.openxmlformats.org/drawingml/2006/picture">
-              <pic:pic xmlns:pic="http://schemas.openxmlformats.org/drawingml/2006/picture">
+              <pic:pic>
                 <pic:nvPicPr>
-                  <pic:cNvPr id="0" name="Picture 1" descr="Postgrado Medicina y Ciencia | Universidad San Sebastián | USS"/>
-                  <pic:cNvPicPr>
-                    <a:picLocks noChangeAspect="1" noChangeArrowheads="1"/>
-                  </pic:cNvPicPr>
+                  <pic:cNvPr id="0" name="image.jpg"/>
+                  <pic:cNvPicPr/>
                 </pic:nvPicPr>
                 <pic:blipFill>
-                  <a:blip r:embed="rId1" cstate="print">
-                    <a:extLst>
-                      <a:ext uri="{28A0092B-C50C-407E-A947-70E740481C1C}">
-                        <a14:useLocalDpi xmlns:a14="http://schemas.microsoft.com/office/drawing/2010/main" val="0"/>
-                      </a:ext>
-                    </a:extLst>
-                  </a:blip>
-                  <a:srcRect/>
+                  <a:blip r:embed="rId1"/>
                   <a:stretch>
                     <a:fillRect/>
                   </a:stretch>
                 </pic:blipFill>
-                <pic:spPr bwMode="auto">
+                <pic:spPr>
                   <a:xfrm>
                     <a:off x="0" y="0"/>
-                    <a:ext cx="1936137" cy="657225"/>
+                    <a:ext cx="1936137" cy="658686"/>
                   </a:xfrm>
-                  <a:prstGeom prst="rect">
-                    <a:avLst/>
-                  </a:prstGeom>
-                  <a:noFill/>
-                  <a:ln>
-                    <a:noFill/>
-                  </a:ln>
+                  <a:prstGeom prst="rect"/>
                 </pic:spPr>
               </pic:pic>
             </a:graphicData>
           </a:graphic>
-          <wp14:sizeRelH relativeFrom="margin">
-            <wp14:pctWidth>0</wp14:pctWidth>
-          </wp14:sizeRelH>
-          <wp14:sizeRelV relativeFrom="margin">
-            <wp14:pctHeight>0</wp14:pctHeight>
-          </wp14:sizeRelV>
-        </wp:anchor>
+        </wp:inline>
       </w:drawing>
     </w:r>
   </w:p>
@@ -8919,14 +7994,6 @@
     <w:abstractNumId w:val="4"/>
   </w:num>
 </w:numbering>
-</file>
-
-<file path=word/people.xml><?xml version="1.0" encoding="utf-8"?>
-<w15:people xmlns:wpc="http://schemas.microsoft.com/office/word/2010/wordprocessingCanvas" xmlns:cx="http://schemas.microsoft.com/office/drawing/2014/chartex" xmlns:cx1="http://schemas.microsoft.com/office/drawing/2015/9/8/chartex" xmlns:cx2="http://schemas.microsoft.com/office/drawing/2015/10/21/chartex" xmlns:cx3="http://schemas.microsoft.com/office/drawing/2016/5/9/chartex" xmlns:cx4="http://schemas.microsoft.com/office/drawing/2016/5/10/chartex" xmlns:cx5="http://schemas.microsoft.com/office/drawing/2016/5/11/chartex" xmlns:cx6="http://schemas.microsoft.com/office/drawing/2016/5/12/chartex" xmlns:cx7="http://schemas.microsoft.com/office/drawing/2016/5/13/chartex" xmlns:cx8="http://schemas.microsoft.com/office/drawing/2016/5/14/chartex" xmlns:mc="http://schemas.openxmlformats.org/markup-compatibility/2006" xmlns:aink="http://schemas.microsoft.com/office/drawing/2016/ink" xmlns:am3d="http://schemas.microsoft.com/office/drawing/2017/model3d" xmlns:o="urn:schemas-microsoft-com:office:office" xmlns:oel="http://schemas.microsoft.com/office/2019/extlst" xmlns:r="http://schemas.openxmlformats.org/officeDocument/2006/relationships" xmlns:m="http://schemas.openxmlformats.org/officeDocument/2006/math" xmlns:v="urn:schemas-microsoft-com:vml" xmlns:wp14="http://schemas.microsoft.com/office/word/2010/wordprocessingDrawing" xmlns:wp="http://schemas.openxmlformats.org/drawingml/2006/wordprocessingDrawing" xmlns:w10="urn:schemas-microsoft-com:office:word" xmlns:w="http://schemas.openxmlformats.org/wordprocessingml/2006/main" xmlns:w14="http://schemas.microsoft.com/office/word/2010/wordml" xmlns:w15="http://schemas.microsoft.com/office/word/2012/wordml" xmlns:w16cex="http://schemas.microsoft.com/office/word/2018/wordml/cex" xmlns:w16cid="http://schemas.microsoft.com/office/word/2016/wordml/cid" xmlns:w16="http://schemas.microsoft.com/office/word/2018/wordml" xmlns:w16du="http://schemas.microsoft.com/office/word/2023/wordml/word16du" xmlns:w16sdtdh="http://schemas.microsoft.com/office/word/2020/wordml/sdtdatahash" xmlns:w16sdtfl="http://schemas.microsoft.com/office/word/2024/wordml/sdtformatlock" xmlns:w16se="http://schemas.microsoft.com/office/word/2015/wordml/symex" xmlns:wpg="http://schemas.microsoft.com/office/word/2010/wordprocessingGroup" xmlns:wpi="http://schemas.microsoft.com/office/word/2010/wordprocessingInk" xmlns:wne="http://schemas.microsoft.com/office/word/2006/wordml" xmlns:wps="http://schemas.microsoft.com/office/word/2010/wordprocessingShape" mc:Ignorable="w14 w15 w16se w16cid w16 w16cex w16sdtdh w16sdtfl w16du wp14">
-  <w15:person w15:author="Diego Jorquera Pereira">
-    <w15:presenceInfo w15:providerId="Windows Live" w15:userId="965e9a197275a069"/>
-  </w15:person>
-</w15:people>
 </file>
 
 <file path=word/styles.xml><?xml version="1.0" encoding="utf-8"?>

</xml_diff>

<commit_message>
Avance 1: quita Cap. III (resultados van despues), reformula Tabla 1 como metodologia, complementa bibliografia y ajusta paginacion
- Elimina el Capitulo III: Resultados (los resultados se haran despues de
  disenar el protocolo) y los parrafos de hallazgos que estaban en el.
- Reformula la Tabla 1 como tabla de METODOLOGIA que responde al Objetivo 1
  (Pilar CMO | Aspecto evaluado | Referencia para la comparacion), sin
  resultados, y la ubica en el 2.2.
- Complementa la bibliografia con 7 citas pertinentes tomadas de los trabajos
  de referencia (Abegaz 2017, Allemann 2014, Beyhaghi 2016, Cutler & Everett
  2010, Kolandaivelu 2014, Maher 2014, Faus Dader 2018), agregadas como apoyo a
  frases ya existentes; total 30 referencias.
- Paginacion: la portada no se cuenta y la numeracion romana parte en 'i' en la
  segunda pagina.
- Mantiene la redaccion del autor y los tiempos verbales; sin guiones largos.
</commit_message>
<xml_diff>
--- a/Tesis AVANCE 1 - Rev DJP.docx
+++ b/Tesis AVANCE 1 - Rev DJP.docx
@@ -3437,7 +3437,7 @@
           <w:footerReference w:type="first" r:id="rId12"/>
           <w:pgSz w:w="12240" w:h="15840" w:code="1"/>
           <w:pgMar w:top="1418" w:right="1418" w:bottom="1418" w:left="1418" w:header="709" w:footer="709" w:gutter="0"/>
-          <w:pgNumType w:fmt="lowerRoman"/>
+          <w:pgNumType w:fmt="lowerRoman" w:start="0"/>
           <w:cols w:space="708"/>
           <w:titlePg/>
           <w:docGrid w:linePitch="360"/>
@@ -3622,7 +3622,7 @@
         <w:jc w:val="both"/>
       </w:pPr>
       <w:r>
-        <w:t>La Atención Farmacéutica se entiende hoy como la participación del farmacéutico en el cuidado de la persona para aprovechar mejor sus medicamentos y mejorar sus resultados en salud. Bonal y colaboradores la describen como el proceso por el cual el farmacéutico coopera con el paciente y con el resto del equipo en el diseño, la ejecución y el seguimiento de un plan terapéutico orientado a metas concretas (Bonal et al., 2003). Esto supone un cambio respecto del modelo clásico, centrado en entregar el medicamento, hacia otro que se preocupa de lo que ocurre con ese medicamento una vez que el paciente lo lleva a su casa.</w:t>
+        <w:t>La Atención Farmacéutica se entiende hoy como la participación del farmacéutico en el cuidado de la persona para aprovechar mejor sus medicamentos y mejorar sus resultados en salud. Bonal y colaboradores la describen como el proceso por el cual el farmacéutico coopera con el paciente y con el resto del equipo en el diseño, la ejecución y el seguimiento de un plan terapéutico orientado a metas concretas (Bonal et al., 2003; Allemann et al., 2014). Esto supone un cambio respecto del modelo clásico, centrado en entregar el medicamento, hacia otro que se preocupa de lo que ocurre con ese medicamento una vez que el paciente lo lleva a su casa.</w:t>
       </w:r>
     </w:p>
     <w:p>
@@ -3712,7 +3712,7 @@
         <w:jc w:val="both"/>
       </w:pPr>
       <w:r>
-        <w:t>Que un tratamiento esté indicado no asegura que el paciente lo tome como corresponde. La adherencia, entendida como el grado en que la persona sigue las indicaciones acordadas con el equipo de salud, es uno de los factores que más influye en el control de estas enfermedades y suele ser baja en quienes usan varios medicamentos a la vez (Haynes et al., 1979; Martín Alfonso, 2004; Morales &amp; Estela, 2015). En los usuarios que además dependen de otros o tienen dificultades para llegar al centro, la visita domiciliaria pasa a ser la mejor oportunidad para revisar la terapia, resolver dudas y reforzar la adherencia.</w:t>
+        <w:t>Que un tratamiento esté indicado no asegura que el paciente lo tome como corresponde. La adherencia, entendida como el grado en que la persona sigue las indicaciones acordadas con el equipo de salud, es uno de los factores que más influye en el control de estas enfermedades y suele ser baja en quienes usan varios medicamentos a la vez (Haynes et al., 1979; Cutler &amp; Everett, 2010; Martín Alfonso, 2004; Morales &amp; Estela, 2015; Abegaz et al., 2017; Kolandaivelu et al., 2014). En los usuarios que además dependen de otros o tienen dificultades para llegar al centro, la visita domiciliaria pasa a ser la mejor oportunidad para revisar la terapia, resolver dudas y reforzar la adherencia.</w:t>
       </w:r>
     </w:p>
     <w:p>
@@ -3721,7 +3721,7 @@
         <w:jc w:val="both"/>
       </w:pPr>
       <w:r>
-        <w:t>La dificultad es mayor en los pacientes que toman muchos medicamentos, tienen problemas sociales o presentan condiciones propias de la edad, en quienes la adherencia es más frágil (Manzano García &amp; Morillo Verdugo, 2018).</w:t>
+        <w:t>La dificultad es mayor en los pacientes que toman muchos medicamentos, tienen problemas sociales o presentan condiciones propias de la edad, en quienes la adherencia es más frágil (Maher, Hanlon &amp; Hajjar, 2014; Manzano García &amp; Morillo Verdugo, 2018).</w:t>
       </w:r>
     </w:p>
     <w:p>
@@ -3742,7 +3742,7 @@
         <w:jc w:val="both"/>
       </w:pPr>
       <w:r>
-        <w:t>La forma de realizar una Atención Farmacéutica ha cambiado bastante en las últimas décadas. Al comienzo el trabajo giraba en torno al medicamento y al control del gasto, con poca estructura (Calleja Hernández &amp; Morillo Verdugo, 2016). A medida que la población envejeció y aparecieron más pacientes con varias enfermedades a la vez, ese enfoque resultó insuficiente. Para ordenar el seguimiento surgieron métodos como el Dáder y, en Chile, el POLARIS, que ofrecen una manera sistemática de detectar los problemas relacionados con los medicamentos (PRM) y los resultados negativos asociados a la medicación (RNM) (Plaza, 2018; Ministerio de Salud de Chile, 2018a, 2019). Para clasificar estos problemas se suele recurrir al Tercer Consenso de Granada, que ordena los RNM según, si el tratamiento es necesario, efectivo y seguro (Comité de Consenso de Granada, 2007). Estos métodos expuestos aportaron rigor, aunque llevarlos por completo a la Atención Primaria ha sido difícil, sobre todo en la parte conductual y en la logística de la visita a domicilio.</w:t>
+        <w:t>La forma de realizar una Atención Farmacéutica ha cambiado bastante en las últimas décadas. Al comienzo el trabajo giraba en torno al medicamento y al control del gasto, con poca estructura (Calleja Hernández &amp; Morillo Verdugo, 2016). A medida que la población envejeció y aparecieron más pacientes con varias enfermedades a la vez, ese enfoque resultó insuficiente. Para ordenar el seguimiento surgieron métodos como el Dáder y, en Chile, el POLARIS, que ofrecen una manera sistemática de detectar los problemas relacionados con los medicamentos (PRM) y los resultados negativos asociados a la medicación (RNM) (Faus Dáder, 2018; Plaza, 2018; Ministerio de Salud de Chile, 2018a, 2019). Para clasificar estos problemas se suele recurrir al Tercer Consenso de Granada, que ordena los RNM según, si el tratamiento es necesario, efectivo y seguro (Comité de Consenso de Granada, 2007). Estos métodos expuestos aportaron rigor, aunque llevarlos por completo a la Atención Primaria ha sido difícil, sobre todo en la parte conductual y en la logística de la visita a domicilio.</w:t>
       </w:r>
     </w:p>
     <w:p>
@@ -4081,9 +4081,273 @@
         <w:jc w:val="both"/>
       </w:pPr>
       <w:r>
-        <w:t>Se describió cómo se realizaba la visita domiciliaria en el CESFAM al inicio del internado y se comparó esa práctica con lo que plantean la Orientación Técnica del Programa de Salud Cardiovascular y del Fondo de Farmacia (Ministerio de Salud de Chile, 2017b, 2018b, 2020), la Guía de Atención Farmacéutica y Seguimiento Farmacoterapéutico en APS (Ministerio de Salud de Chile, 2018a) y los tres pilares del Modelo CMO. La comparación se apoyó, además, en la evaluación previa del mismo programa (Faúndez Navarrete, 2020) y en la información entregada por el equipo de salud del centro. Las brechas identificadas a partir de esta comparación se presentan en el Capítulo III.</w:t>
-      </w:r>
-    </w:p>
+        <w:t>Se describió cómo se realizaba la visita domiciliaria en el CESFAM al inicio del internado y se comparó esa práctica con lo que plantean la Orientación Técnica del Programa de Salud Cardiovascular y del Fondo de Farmacia (Ministerio de Salud de Chile, 2017b, 2018b, 2020), la Guía de Atención Farmacéutica y Seguimiento Farmacoterapéutico en APS (Ministerio de Salud de Chile, 2018a) y los tres pilares del Modelo CMO. La comparación se apoyó, además, en la evaluación previa del mismo programa (Faúndez Navarrete, 2020) y en la información entregada por el equipo de salud del centro. La Tabla 1 resume los aspectos evaluados en cada pilar del Modelo CMO y las referencias utilizadas para la comparación.</w:t>
+      </w:r>
+    </w:p>
+    <w:p>
+      <w:pPr>
+        <w:rPr>
+          <w:rFonts w:ascii="Arial" w:eastAsia="Arial" w:hAnsi="Arial" w:cs="Arial"/>
+          <w:sz w:val="24"/>
+          <w:szCs w:val="24"/>
+        </w:rPr>
+      </w:pPr>
+      <w:r>
+        <w:t>Tabla 1. Aspectos evaluados para identificar las brechas del programa según los pilares del Modelo CMO.</w:t>
+      </w:r>
+    </w:p>
+    <w:tbl>
+      <w:tblPr>
+        <w:tblStyle w:val="Tablaconcuadrcula"/>
+        <w:tblW w:w="0" w:type="auto"/>
+        <w:jc w:val="center"/>
+        <w:tblLook w:val="04A0" w:firstRow="1" w:lastRow="0" w:firstColumn="1" w:lastColumn="0" w:noHBand="0" w:noVBand="1"/>
+      </w:tblPr>
+      <w:tblGrid>
+        <w:gridCol w:w="2318"/>
+        <w:gridCol w:w="2321"/>
+        <w:gridCol w:w="2431"/>
+      </w:tblGrid>
+      <w:tr>
+        <w:trPr>
+          <w:jc w:val="center"/>
+        </w:trPr>
+        <w:tc>
+          <w:tcPr>
+            <w:tcW w:w="2351" w:type="dxa"/>
+          </w:tcPr>
+          <w:p>
+            <w:pPr>
+              <w:rPr>
+                <w:rFonts w:ascii="Arial" w:eastAsia="Arial" w:hAnsi="Arial" w:cs="Arial"/>
+                <w:b/>
+                <w:bCs/>
+                <w:sz w:val="24"/>
+                <w:szCs w:val="24"/>
+              </w:rPr>
+            </w:pPr>
+            <w:r>
+              <w:rPr>
+                <w:b/>
+              </w:rPr>
+              <w:t>Pilar del Modelo CMO</w:t>
+            </w:r>
+          </w:p>
+        </w:tc>
+        <w:tc>
+          <w:tcPr>
+            <w:tcW w:w="2351" w:type="dxa"/>
+          </w:tcPr>
+          <w:p>
+            <w:pPr>
+              <w:rPr>
+                <w:rFonts w:ascii="Arial" w:eastAsia="Arial" w:hAnsi="Arial" w:cs="Arial"/>
+                <w:b/>
+                <w:bCs/>
+                <w:sz w:val="24"/>
+                <w:szCs w:val="24"/>
+              </w:rPr>
+            </w:pPr>
+            <w:r>
+              <w:rPr>
+                <w:b/>
+              </w:rPr>
+              <w:t>Aspecto evaluado</w:t>
+            </w:r>
+          </w:p>
+        </w:tc>
+        <w:tc>
+          <w:tcPr>
+            <w:tcW w:w="2351" w:type="dxa"/>
+          </w:tcPr>
+          <w:p>
+            <w:pPr>
+              <w:rPr>
+                <w:rFonts w:ascii="Arial" w:eastAsia="Arial" w:hAnsi="Arial" w:cs="Arial"/>
+                <w:b/>
+                <w:bCs/>
+                <w:sz w:val="24"/>
+                <w:szCs w:val="24"/>
+              </w:rPr>
+            </w:pPr>
+            <w:r>
+              <w:rPr>
+                <w:b/>
+              </w:rPr>
+              <w:t>Referencia para la comparación</w:t>
+            </w:r>
+          </w:p>
+        </w:tc>
+      </w:tr>
+      <w:tr>
+        <w:trPr>
+          <w:jc w:val="center"/>
+        </w:trPr>
+        <w:tc>
+          <w:tcPr>
+            <w:tcW w:w="2351" w:type="dxa"/>
+          </w:tcPr>
+          <w:p>
+            <w:pPr>
+              <w:rPr>
+                <w:rFonts w:ascii="Arial" w:eastAsia="Arial" w:hAnsi="Arial" w:cs="Arial"/>
+                <w:sz w:val="24"/>
+                <w:szCs w:val="24"/>
+              </w:rPr>
+            </w:pPr>
+            <w:r>
+              <w:t>Capacidad</w:t>
+            </w:r>
+          </w:p>
+        </w:tc>
+        <w:tc>
+          <w:tcPr>
+            <w:tcW w:w="2351" w:type="dxa"/>
+          </w:tcPr>
+          <w:p>
+            <w:pPr>
+              <w:rPr>
+                <w:rFonts w:ascii="Arial" w:eastAsia="Arial" w:hAnsi="Arial" w:cs="Arial"/>
+                <w:sz w:val="24"/>
+                <w:szCs w:val="24"/>
+              </w:rPr>
+            </w:pPr>
+            <w:r>
+              <w:t>Criterios de priorización e ingreso a la visita domiciliaria</w:t>
+            </w:r>
+          </w:p>
+        </w:tc>
+        <w:tc>
+          <w:tcPr>
+            <w:tcW w:w="2351" w:type="dxa"/>
+          </w:tcPr>
+          <w:p>
+            <w:pPr>
+              <w:rPr>
+                <w:rFonts w:ascii="Arial" w:eastAsia="Arial" w:hAnsi="Arial" w:cs="Arial"/>
+                <w:sz w:val="24"/>
+                <w:szCs w:val="24"/>
+              </w:rPr>
+            </w:pPr>
+            <w:r>
+              <w:t>Orientación Técnica del Programa de Salud Cardiovascular y del Fondo de Farmacia (MINSAL); pilar de Capacidad del Modelo CMO</w:t>
+            </w:r>
+          </w:p>
+        </w:tc>
+      </w:tr>
+      <w:tr>
+        <w:trPr>
+          <w:jc w:val="center"/>
+        </w:trPr>
+        <w:tc>
+          <w:tcPr>
+            <w:tcW w:w="2351" w:type="dxa"/>
+          </w:tcPr>
+          <w:p>
+            <w:pPr>
+              <w:rPr>
+                <w:rFonts w:ascii="Arial" w:eastAsia="Arial" w:hAnsi="Arial" w:cs="Arial"/>
+                <w:sz w:val="24"/>
+                <w:szCs w:val="24"/>
+              </w:rPr>
+            </w:pPr>
+            <w:r>
+              <w:t>Motivación</w:t>
+            </w:r>
+          </w:p>
+        </w:tc>
+        <w:tc>
+          <w:tcPr>
+            <w:tcW w:w="2351" w:type="dxa"/>
+          </w:tcPr>
+          <w:p>
+            <w:pPr>
+              <w:rPr>
+                <w:rFonts w:ascii="Arial" w:eastAsia="Arial" w:hAnsi="Arial" w:cs="Arial"/>
+                <w:sz w:val="24"/>
+                <w:szCs w:val="24"/>
+              </w:rPr>
+            </w:pPr>
+            <w:r>
+              <w:t>Abordaje de la adherencia y de las barreras del paciente</w:t>
+            </w:r>
+          </w:p>
+        </w:tc>
+        <w:tc>
+          <w:tcPr>
+            <w:tcW w:w="2351" w:type="dxa"/>
+          </w:tcPr>
+          <w:p>
+            <w:pPr>
+              <w:rPr>
+                <w:rFonts w:ascii="Arial" w:eastAsia="Arial" w:hAnsi="Arial" w:cs="Arial"/>
+                <w:sz w:val="24"/>
+                <w:szCs w:val="24"/>
+              </w:rPr>
+            </w:pPr>
+            <w:r>
+              <w:t>Guía de Atención Farmacéutica y Seguimiento Farmacoterapéutico en APS (MINSAL); pilar de Motivación</w:t>
+            </w:r>
+          </w:p>
+        </w:tc>
+      </w:tr>
+      <w:tr>
+        <w:trPr>
+          <w:jc w:val="center"/>
+        </w:trPr>
+        <w:tc>
+          <w:tcPr>
+            <w:tcW w:w="2351" w:type="dxa"/>
+          </w:tcPr>
+          <w:p>
+            <w:pPr>
+              <w:rPr>
+                <w:rFonts w:ascii="Arial" w:eastAsia="Arial" w:hAnsi="Arial" w:cs="Arial"/>
+                <w:sz w:val="24"/>
+                <w:szCs w:val="24"/>
+              </w:rPr>
+            </w:pPr>
+            <w:r>
+              <w:t>Oportunidad</w:t>
+            </w:r>
+          </w:p>
+        </w:tc>
+        <w:tc>
+          <w:tcPr>
+            <w:tcW w:w="2351" w:type="dxa"/>
+          </w:tcPr>
+          <w:p>
+            <w:pPr>
+              <w:rPr>
+                <w:rFonts w:ascii="Arial" w:eastAsia="Arial" w:hAnsi="Arial" w:cs="Arial"/>
+                <w:sz w:val="24"/>
+                <w:szCs w:val="24"/>
+              </w:rPr>
+            </w:pPr>
+            <w:r>
+              <w:t>Registro de la atención y continuidad del seguimiento</w:t>
+            </w:r>
+          </w:p>
+        </w:tc>
+        <w:tc>
+          <w:tcPr>
+            <w:tcW w:w="2351" w:type="dxa"/>
+          </w:tcPr>
+          <w:p>
+            <w:pPr>
+              <w:rPr>
+                <w:rFonts w:ascii="Arial" w:eastAsia="Arial" w:hAnsi="Arial" w:cs="Arial"/>
+                <w:sz w:val="24"/>
+                <w:szCs w:val="24"/>
+              </w:rPr>
+            </w:pPr>
+            <w:r>
+              <w:t>Ficha clínica institucional; pilar de Oportunidad; evaluación previa del programa (Faúndez Navarrete, 2020)</w:t>
+            </w:r>
+          </w:p>
+        </w:tc>
+      </w:tr>
+    </w:tbl>
     <w:p>
       <w:pPr>
         <w:pStyle w:val="Ttulo2"/>
@@ -4464,7 +4728,7 @@
         <w:jc w:val="both"/>
       </w:pPr>
       <w:r>
-        <w:t>Como parte del diseño del protocolo se seleccionaron y adaptaron herramientas sencillas, compatibles con la rutina del CESFAM. La adherencia se evalúa con el test de Morisky-Green-Levine de cuatro preguntas (Morisky, Green &amp; Levine, 1986), incluido en el Anexo 2, que en algunos casos se complementa con el test de Batalla, el cual permite conocer el grado de conocimiento que el paciente tiene sobre su enfermedad (Batalla et al., 1984). Cuando están disponibles en la ficha clínica, se consideran los exámenes de laboratorio del paciente, como el hemograma, el perfil lipídico, la glucosa, la creatinina, la velocidad de filtración glomerular, la hemoglobina glicosilada o las pruebas tiroideas (TSH y T4 libre). Durante la visita domiciliaria esta información se complementa con la medición de la presión arterial y la frecuencia cardíaca mediante un tensiómetro de brazo, práctica ya habitual que permite estimar el grado de compensación del paciente en el momento.</w:t>
+        <w:t>Como parte del diseño del protocolo se seleccionaron y adaptaron herramientas sencillas, compatibles con la rutina del CESFAM. La adherencia se evalúa con el test de Morisky-Green-Levine de cuatro preguntas (Morisky, Green &amp; Levine, 1986; Beyhaghi et al., 2016), incluido en el Anexo 2, que en algunos casos se complementa con el test de Batalla, el cual permite conocer el grado de conocimiento que el paciente tiene sobre su enfermedad (Batalla et al., 1984). Cuando están disponibles en la ficha clínica, se consideran los exámenes de laboratorio del paciente, como el hemograma, el perfil lipídico, la glucosa, la creatinina, la velocidad de filtración glomerular, la hemoglobina glicosilada o las pruebas tiroideas (TSH y T4 libre). Durante la visita domiciliaria esta información se complementa con la medición de la presión arterial y la frecuencia cardíaca mediante un tensiómetro de brazo, práctica ya habitual que permite estimar el grado de compensación del paciente en el momento.</w:t>
       </w:r>
     </w:p>
     <w:p>
@@ -4659,720 +4923,6 @@
       <w:pPr>
         <w:pStyle w:val="Ttulo1"/>
       </w:pPr>
-      <w:bookmarkStart w:id="30" w:name="_Toc234430361"/>
-      <w:bookmarkStart w:id="31" w:name="_Toc234959471"/>
-      <w:bookmarkEnd w:id="30"/>
-      <w:bookmarkEnd w:id="31"/>
-      <w:r>
-        <w:t>Capítulo III: Resultados</w:t>
-      </w:r>
-    </w:p>
-    <w:p>
-      <w:pPr>
-        <w:spacing w:after="120" w:line="360" w:lineRule="auto"/>
-        <w:jc w:val="both"/>
-      </w:pPr>
-      <w:r>
-        <w:t>En este capítulo se presentan los resultados preliminares obtenidos durante el internado. En primer lugar, se describe el funcionamiento del programa de visitas domiciliarias del CESFAM y las brechas identificadas respecto de la norma y del Modelo CMO.</w:t>
-      </w:r>
-    </w:p>
-    <w:p>
-      <w:pPr>
-        <w:pStyle w:val="Ttulo2"/>
-      </w:pPr>
-      <w:bookmarkStart w:id="32" w:name="_Toc234430362"/>
-      <w:bookmarkStart w:id="33" w:name="_Toc234959472"/>
-      <w:bookmarkEnd w:id="32"/>
-      <w:bookmarkEnd w:id="33"/>
-      <w:r>
-        <w:t>3.1 Identificación de las brechas del programa de visitas domiciliarias</w:t>
-      </w:r>
-    </w:p>
-    <w:p>
-      <w:pPr>
-        <w:spacing w:after="120" w:line="360" w:lineRule="auto"/>
-        <w:jc w:val="both"/>
-      </w:pPr>
-      <w:r>
-        <w:rPr>
-          <w:rFonts w:ascii="Arial" w:eastAsia="Arial" w:hAnsi="Arial"/>
-          <w:sz w:val="24"/>
-          <w:szCs w:val="24"/>
-        </w:rPr>
-        <w:t xml:space="preserve">En la práctica, la </w:t>
-      </w:r>
-      <w:r>
-        <w:rPr>
-          <w:rFonts w:ascii="Arial" w:eastAsia="Arial" w:hAnsi="Arial"/>
-          <w:sz w:val="24"/>
-          <w:szCs w:val="24"/>
-        </w:rPr>
-        <w:t>Atención Farmacéutica</w:t>
-      </w:r>
-      <w:r>
-        <w:rPr>
-          <w:rFonts w:ascii="Arial" w:eastAsia="Arial" w:hAnsi="Arial"/>
-          <w:sz w:val="24"/>
-          <w:szCs w:val="24"/>
-        </w:rPr>
-        <w:t xml:space="preserve"> domiciliaria del CESFAM ingresa solo por derivación de algún profesional del equipo medicina, enfermería, nutrición, kinesiología, psicología u otro y se programa en torno a unas 25 personas al mes, cifra que se fija cada año según lo que solicita el Servicio de Salud. Dentro de esas visitas se distinguen dos situaciones. Por un </w:t>
-      </w:r>
-      <w:r>
-        <w:rPr>
-          <w:rFonts w:ascii="Arial" w:eastAsia="Arial" w:hAnsi="Arial"/>
-          <w:sz w:val="24"/>
-          <w:szCs w:val="24"/>
-        </w:rPr>
-        <w:t>lado,</w:t>
-      </w:r>
-      <w:r>
-        <w:rPr>
-          <w:rFonts w:ascii="Arial" w:eastAsia="Arial" w:hAnsi="Arial"/>
-          <w:sz w:val="24"/>
-          <w:szCs w:val="24"/>
-        </w:rPr>
-        <w:t xml:space="preserve"> está el seguimiento farmacoterapéutico, dirigido a pacientes descompensados, que contempla al menos tres visitas por persona, o más si el caso lo requiere. Por otro</w:t>
-      </w:r>
-      <w:r>
-        <w:rPr>
-          <w:rFonts w:ascii="Arial" w:eastAsia="Arial" w:hAnsi="Arial"/>
-          <w:sz w:val="24"/>
-          <w:szCs w:val="24"/>
-        </w:rPr>
-        <w:t xml:space="preserve"> lado,</w:t>
-      </w:r>
-      <w:r>
-        <w:rPr>
-          <w:rFonts w:ascii="Arial" w:eastAsia="Arial" w:hAnsi="Arial"/>
-          <w:sz w:val="24"/>
-          <w:szCs w:val="24"/>
-        </w:rPr>
-        <w:t xml:space="preserve"> están las visitas puntuales, para usuarios derivados por posible falta de adherencia, </w:t>
-      </w:r>
-      <w:r>
-        <w:rPr>
-          <w:rFonts w:ascii="Arial" w:eastAsia="Arial" w:hAnsi="Arial"/>
-          <w:sz w:val="24"/>
-          <w:szCs w:val="24"/>
-        </w:rPr>
-        <w:t>el</w:t>
-      </w:r>
-      <w:r>
-        <w:rPr>
-          <w:rFonts w:ascii="Arial" w:eastAsia="Arial" w:hAnsi="Arial"/>
-          <w:sz w:val="24"/>
-          <w:szCs w:val="24"/>
-        </w:rPr>
-        <w:t xml:space="preserve"> inicio de un tratamiento que aún no comprenden, polifarmacia o </w:t>
-      </w:r>
-      <w:r>
-        <w:rPr>
-          <w:rFonts w:ascii="Arial" w:eastAsia="Arial" w:hAnsi="Arial"/>
-          <w:sz w:val="24"/>
-          <w:szCs w:val="24"/>
-        </w:rPr>
-        <w:lastRenderedPageBreak/>
-        <w:t xml:space="preserve">edad avanzada, en las que se </w:t>
-      </w:r>
-      <w:r>
-        <w:rPr>
-          <w:rFonts w:ascii="Arial" w:eastAsia="Arial" w:hAnsi="Arial"/>
-          <w:sz w:val="24"/>
-          <w:szCs w:val="24"/>
-        </w:rPr>
-        <w:t>evalúa</w:t>
-      </w:r>
-      <w:r>
-        <w:rPr>
-          <w:rFonts w:ascii="Arial" w:eastAsia="Arial" w:hAnsi="Arial"/>
-          <w:sz w:val="24"/>
-          <w:szCs w:val="24"/>
-        </w:rPr>
-        <w:t xml:space="preserve"> cómo están usando sus medicamentos. La repartición de las visitas a lo largo del mes depende, sobre todo, del tiempo y la disponibilidad del profesional.</w:t>
-      </w:r>
-    </w:p>
-    <w:p>
-      <w:pPr>
-        <w:spacing w:after="120" w:line="360" w:lineRule="auto"/>
-        <w:jc w:val="both"/>
-      </w:pPr>
-      <w:r>
-        <w:rPr>
-          <w:rFonts w:ascii="Arial" w:eastAsia="Arial" w:hAnsi="Arial"/>
-          <w:sz w:val="24"/>
-          <w:szCs w:val="24"/>
-        </w:rPr>
-        <w:t>En cuanto al registro</w:t>
-      </w:r>
-      <w:r>
-        <w:rPr>
-          <w:rFonts w:ascii="Arial" w:eastAsia="Arial" w:hAnsi="Arial"/>
-          <w:sz w:val="24"/>
-          <w:szCs w:val="24"/>
-        </w:rPr>
-        <w:t>,</w:t>
-      </w:r>
-      <w:r>
-        <w:rPr>
-          <w:rFonts w:ascii="Arial" w:eastAsia="Arial" w:hAnsi="Arial"/>
-          <w:sz w:val="24"/>
-          <w:szCs w:val="24"/>
-        </w:rPr>
-        <w:t xml:space="preserve"> </w:t>
-      </w:r>
-      <w:r>
-        <w:rPr>
-          <w:rFonts w:ascii="Arial" w:eastAsia="Arial" w:hAnsi="Arial"/>
-          <w:sz w:val="24"/>
-          <w:szCs w:val="24"/>
-        </w:rPr>
-        <w:t>a</w:t>
-      </w:r>
-      <w:r>
-        <w:rPr>
-          <w:rFonts w:ascii="Arial" w:eastAsia="Arial" w:hAnsi="Arial"/>
-          <w:sz w:val="24"/>
-          <w:szCs w:val="24"/>
-        </w:rPr>
-        <w:t xml:space="preserve">ntes de cada visita el profesional revisa en la ficha clínica electrónica (SINET Sur) los exámenes de laboratorio disponibles (hemograma, perfil lipídico, glucosa, creatinina, velocidad de filtración glomerular, hemoglobina glicosilada, TSH, T4 libre, etc.) y los anota en una hoja de trabajo que lleva al domicilio. </w:t>
-      </w:r>
-      <w:r>
-        <w:rPr>
-          <w:rFonts w:ascii="Arial" w:eastAsia="Arial" w:hAnsi="Arial"/>
-          <w:sz w:val="24"/>
-          <w:szCs w:val="24"/>
-        </w:rPr>
-        <w:t>La</w:t>
-      </w:r>
-      <w:r>
-        <w:rPr>
-          <w:rFonts w:ascii="Arial" w:eastAsia="Arial" w:hAnsi="Arial"/>
-          <w:sz w:val="24"/>
-          <w:szCs w:val="24"/>
-        </w:rPr>
-        <w:t xml:space="preserve"> hoja </w:t>
-      </w:r>
-      <w:r>
-        <w:rPr>
-          <w:rFonts w:ascii="Arial" w:eastAsia="Arial" w:hAnsi="Arial"/>
-          <w:sz w:val="24"/>
-          <w:szCs w:val="24"/>
-        </w:rPr>
-        <w:t xml:space="preserve">también </w:t>
-      </w:r>
-      <w:r>
-        <w:rPr>
-          <w:rFonts w:ascii="Arial" w:eastAsia="Arial" w:hAnsi="Arial"/>
-          <w:sz w:val="24"/>
-          <w:szCs w:val="24"/>
-        </w:rPr>
-        <w:t xml:space="preserve">consigna los diagnósticos del paciente y el listado de sus medicamentos con sus dosis y horarios, y se apoya en una pauta con los temas que debe revisar durante la visita, como la educación sobre la terapia, la conciliación de la medicación, las interacciones, la detección de reacciones adversas, la cronofarmacología, el almacenamiento y los vencimientos, la técnica de administración de insulina, las alergias, el sueño y el apetito, que va marcando a medida que los aborda. Además, durante la visita mide la presión arterial del paciente con un tensiómetro para estimar su grado de compensación y, al regresar al centro, deja constancia de lo realizado en la ficha clínica. </w:t>
-      </w:r>
-      <w:r>
-        <w:rPr>
-          <w:rFonts w:ascii="Arial" w:eastAsia="Arial" w:hAnsi="Arial"/>
-          <w:sz w:val="24"/>
-          <w:szCs w:val="24"/>
-        </w:rPr>
-        <w:t>En consecuencia, el problema no radica en la falta de registro, sino en que los apoyos utilizados son de carácter individual y no corresponden a un instrumento estandarizado y compartido.</w:t>
-      </w:r>
-    </w:p>
-    <w:p>
-      <w:pPr>
-        <w:spacing w:after="120" w:line="360" w:lineRule="auto"/>
-        <w:jc w:val="both"/>
-      </w:pPr>
-      <w:r>
-        <w:t>Al comparar ese funcionamiento con la norma y con el Modelo CMO se identificaron tres brechas principales. La primera, ligada a la Capacidad, radica en que el ingreso depende de la derivación de otros profesionales y del tiempo disponible y que, si bien en la práctica se prioriza a los pacientes más descompensados, no existe un criterio de estratificación de riesgo estandarizado que el propio farmacéutico aplique para decidir a quién priorizar. La segunda, ligada a la Motivación, es que gran parte de las derivaciones responde justamente a problemas de adherencia o a pacientes que no comprenden su tratamiento, pero no hay una forma protocolizada de abordar esas barreras ni de educar, de modo que la intervención queda a criterio de cada visita. La tercera, ligada a la Oportunidad, indica que el número y la frecuencia de las visitas se ajustan caso a caso según la disponibilidad y que, si bien el registro se realiza en la ficha clínica electrónica del establecimiento (SINET Sur) y en hojas de apoyo personales, lo que aporta cierta trazabilidad, no existe un instrumento de registro estandarizado y propio de la Atención Farmacéutica domiciliaria que facilite el seguimiento y la comparación entre profesionales. La Tabla 1 resume estas brechas, que son las que el protocolo busca cerrar.</w:t>
-      </w:r>
-    </w:p>
-    <w:p>
-      <w:pPr>
-        <w:rPr>
-          <w:rFonts w:ascii="Arial" w:eastAsia="Arial" w:hAnsi="Arial" w:cs="Arial"/>
-          <w:sz w:val="24"/>
-          <w:szCs w:val="24"/>
-        </w:rPr>
-      </w:pPr>
-      <w:r>
-        <w:rPr>
-          <w:rFonts w:ascii="Arial" w:eastAsia="Arial" w:hAnsi="Arial" w:cs="Arial"/>
-          <w:sz w:val="24"/>
-          <w:szCs w:val="24"/>
-        </w:rPr>
-        <w:t xml:space="preserve">Tabla </w:t>
-      </w:r>
-      <w:r>
-        <w:rPr>
-          <w:rFonts w:ascii="Arial" w:eastAsia="Arial" w:hAnsi="Arial" w:cs="Arial"/>
-          <w:sz w:val="24"/>
-          <w:szCs w:val="24"/>
-        </w:rPr>
-        <w:t>1</w:t>
-      </w:r>
-      <w:r>
-        <w:rPr>
-          <w:rFonts w:ascii="Arial" w:eastAsia="Arial" w:hAnsi="Arial" w:cs="Arial"/>
-          <w:sz w:val="24"/>
-          <w:szCs w:val="24"/>
-        </w:rPr>
-        <w:t>. Brechas del programa de visitas domiciliarias según los pilares del Modelo CMO.</w:t>
-      </w:r>
-    </w:p>
-    <w:tbl>
-      <w:tblPr>
-        <w:tblStyle w:val="Tablaconcuadrcula"/>
-        <w:tblW w:w="0" w:type="auto"/>
-        <w:jc w:val="center"/>
-        <w:tblLook w:val="04A0" w:firstRow="1" w:lastRow="0" w:firstColumn="1" w:lastColumn="0" w:noHBand="0" w:noVBand="1"/>
-      </w:tblPr>
-      <w:tblGrid>
-        <w:gridCol w:w="2318"/>
-        <w:gridCol w:w="2321"/>
-        <w:gridCol w:w="2431"/>
-        <w:gridCol w:w="2324"/>
-      </w:tblGrid>
-      <w:tr>
-        <w:trPr>
-          <w:jc w:val="center"/>
-        </w:trPr>
-        <w:tc>
-          <w:tcPr>
-            <w:tcW w:w="2351" w:type="dxa"/>
-          </w:tcPr>
-          <w:p>
-            <w:pPr>
-              <w:rPr>
-                <w:rFonts w:ascii="Arial" w:eastAsia="Arial" w:hAnsi="Arial" w:cs="Arial"/>
-                <w:b/>
-                <w:bCs/>
-                <w:sz w:val="24"/>
-                <w:szCs w:val="24"/>
-              </w:rPr>
-            </w:pPr>
-            <w:r>
-              <w:rPr>
-                <w:rFonts w:ascii="Arial" w:eastAsia="Arial" w:hAnsi="Arial" w:cs="Arial"/>
-                <w:b/>
-                <w:bCs/>
-                <w:sz w:val="24"/>
-                <w:szCs w:val="24"/>
-              </w:rPr>
-              <w:t>Pilar del Modelo CMO</w:t>
-            </w:r>
-          </w:p>
-        </w:tc>
-        <w:tc>
-          <w:tcPr>
-            <w:tcW w:w="2351" w:type="dxa"/>
-          </w:tcPr>
-          <w:p>
-            <w:pPr>
-              <w:rPr>
-                <w:rFonts w:ascii="Arial" w:eastAsia="Arial" w:hAnsi="Arial" w:cs="Arial"/>
-                <w:b/>
-                <w:bCs/>
-                <w:sz w:val="24"/>
-                <w:szCs w:val="24"/>
-              </w:rPr>
-            </w:pPr>
-            <w:r>
-              <w:rPr>
-                <w:rFonts w:ascii="Arial" w:eastAsia="Arial" w:hAnsi="Arial" w:cs="Arial"/>
-                <w:b/>
-                <w:bCs/>
-                <w:sz w:val="24"/>
-                <w:szCs w:val="24"/>
-              </w:rPr>
-              <w:t>Lo que se espera</w:t>
-            </w:r>
-          </w:p>
-        </w:tc>
-        <w:tc>
-          <w:tcPr>
-            <w:tcW w:w="2351" w:type="dxa"/>
-          </w:tcPr>
-          <w:p>
-            <w:pPr>
-              <w:rPr>
-                <w:rFonts w:ascii="Arial" w:eastAsia="Arial" w:hAnsi="Arial" w:cs="Arial"/>
-                <w:b/>
-                <w:bCs/>
-                <w:sz w:val="24"/>
-                <w:szCs w:val="24"/>
-              </w:rPr>
-            </w:pPr>
-            <w:r>
-              <w:rPr>
-                <w:rFonts w:ascii="Arial" w:eastAsia="Arial" w:hAnsi="Arial" w:cs="Arial"/>
-                <w:b/>
-                <w:bCs/>
-                <w:sz w:val="24"/>
-                <w:szCs w:val="24"/>
-              </w:rPr>
-              <w:t>Lo observado</w:t>
-            </w:r>
-          </w:p>
-        </w:tc>
-        <w:tc>
-          <w:tcPr>
-            <w:tcW w:w="2351" w:type="dxa"/>
-          </w:tcPr>
-          <w:p>
-            <w:pPr>
-              <w:rPr>
-                <w:rFonts w:ascii="Arial" w:eastAsia="Arial" w:hAnsi="Arial" w:cs="Arial"/>
-                <w:b/>
-                <w:bCs/>
-                <w:sz w:val="24"/>
-                <w:szCs w:val="24"/>
-              </w:rPr>
-            </w:pPr>
-            <w:r>
-              <w:rPr>
-                <w:rFonts w:ascii="Arial" w:eastAsia="Arial" w:hAnsi="Arial" w:cs="Arial"/>
-                <w:b/>
-                <w:bCs/>
-                <w:sz w:val="24"/>
-                <w:szCs w:val="24"/>
-              </w:rPr>
-              <w:t>Brecha</w:t>
-            </w:r>
-          </w:p>
-        </w:tc>
-      </w:tr>
-      <w:tr>
-        <w:trPr>
-          <w:jc w:val="center"/>
-        </w:trPr>
-        <w:tc>
-          <w:tcPr>
-            <w:tcW w:w="2351" w:type="dxa"/>
-          </w:tcPr>
-          <w:p>
-            <w:pPr>
-              <w:rPr>
-                <w:rFonts w:ascii="Arial" w:eastAsia="Arial" w:hAnsi="Arial" w:cs="Arial"/>
-                <w:sz w:val="24"/>
-                <w:szCs w:val="24"/>
-              </w:rPr>
-            </w:pPr>
-            <w:r>
-              <w:rPr>
-                <w:rFonts w:ascii="Arial" w:eastAsia="Arial" w:hAnsi="Arial" w:cs="Arial"/>
-                <w:sz w:val="24"/>
-                <w:szCs w:val="24"/>
-              </w:rPr>
-              <w:t>Capacidad</w:t>
-            </w:r>
-          </w:p>
-        </w:tc>
-        <w:tc>
-          <w:tcPr>
-            <w:tcW w:w="2351" w:type="dxa"/>
-          </w:tcPr>
-          <w:p>
-            <w:pPr>
-              <w:rPr>
-                <w:rFonts w:ascii="Arial" w:eastAsia="Arial" w:hAnsi="Arial" w:cs="Arial"/>
-                <w:sz w:val="24"/>
-                <w:szCs w:val="24"/>
-              </w:rPr>
-            </w:pPr>
-            <w:r>
-              <w:rPr>
-                <w:rFonts w:ascii="Arial" w:eastAsia="Arial" w:hAnsi="Arial" w:cs="Arial"/>
-                <w:sz w:val="24"/>
-                <w:szCs w:val="24"/>
-              </w:rPr>
-              <w:t>Priorizar la visita según el riesgo y la complejidad del paciente.</w:t>
-            </w:r>
-          </w:p>
-        </w:tc>
-        <w:tc>
-          <w:tcPr>
-            <w:tcW w:w="2351" w:type="dxa"/>
-          </w:tcPr>
-          <w:p>
-            <w:pPr>
-              <w:rPr>
-                <w:rFonts w:ascii="Arial" w:eastAsia="Arial" w:hAnsi="Arial" w:cs="Arial"/>
-                <w:sz w:val="24"/>
-                <w:szCs w:val="24"/>
-              </w:rPr>
-            </w:pPr>
-            <w:r>
-              <w:rPr>
-                <w:rFonts w:ascii="Arial" w:eastAsia="Arial" w:hAnsi="Arial" w:cs="Arial"/>
-                <w:sz w:val="24"/>
-                <w:szCs w:val="24"/>
-              </w:rPr>
-              <w:t>El ingreso depende de la derivación y del tiempo disponible (unas 25 visitas al mes).</w:t>
-            </w:r>
-          </w:p>
-        </w:tc>
-        <w:tc>
-          <w:tcPr>
-            <w:tcW w:w="2351" w:type="dxa"/>
-          </w:tcPr>
-          <w:p>
-            <w:pPr>
-              <w:rPr>
-                <w:rFonts w:ascii="Arial" w:eastAsia="Arial" w:hAnsi="Arial" w:cs="Arial"/>
-                <w:sz w:val="24"/>
-                <w:szCs w:val="24"/>
-              </w:rPr>
-            </w:pPr>
-            <w:r>
-              <w:rPr>
-                <w:rFonts w:ascii="Arial" w:eastAsia="Arial" w:hAnsi="Arial" w:cs="Arial"/>
-                <w:sz w:val="24"/>
-                <w:szCs w:val="24"/>
-              </w:rPr>
-              <w:t xml:space="preserve">No </w:t>
-            </w:r>
-            <w:r>
-              <w:rPr>
-                <w:rFonts w:ascii="Arial" w:eastAsia="Arial" w:hAnsi="Arial" w:cs="Arial"/>
-                <w:sz w:val="24"/>
-                <w:szCs w:val="24"/>
-              </w:rPr>
-              <w:t>existe</w:t>
-            </w:r>
-            <w:r>
-              <w:rPr>
-                <w:rFonts w:ascii="Arial" w:eastAsia="Arial" w:hAnsi="Arial" w:cs="Arial"/>
-                <w:sz w:val="24"/>
-                <w:szCs w:val="24"/>
-              </w:rPr>
-              <w:t xml:space="preserve"> un criterio de estratificación de riesgo propio del farmacéutico.</w:t>
-            </w:r>
-          </w:p>
-        </w:tc>
-      </w:tr>
-      <w:tr>
-        <w:trPr>
-          <w:jc w:val="center"/>
-        </w:trPr>
-        <w:tc>
-          <w:tcPr>
-            <w:tcW w:w="2351" w:type="dxa"/>
-          </w:tcPr>
-          <w:p>
-            <w:pPr>
-              <w:rPr>
-                <w:rFonts w:ascii="Arial" w:eastAsia="Arial" w:hAnsi="Arial" w:cs="Arial"/>
-                <w:sz w:val="24"/>
-                <w:szCs w:val="24"/>
-              </w:rPr>
-            </w:pPr>
-            <w:r>
-              <w:rPr>
-                <w:rFonts w:ascii="Arial" w:eastAsia="Arial" w:hAnsi="Arial" w:cs="Arial"/>
-                <w:sz w:val="24"/>
-                <w:szCs w:val="24"/>
-              </w:rPr>
-              <w:t>Motivación</w:t>
-            </w:r>
-          </w:p>
-        </w:tc>
-        <w:tc>
-          <w:tcPr>
-            <w:tcW w:w="2351" w:type="dxa"/>
-          </w:tcPr>
-          <w:p>
-            <w:pPr>
-              <w:rPr>
-                <w:rFonts w:ascii="Arial" w:eastAsia="Arial" w:hAnsi="Arial" w:cs="Arial"/>
-                <w:sz w:val="24"/>
-                <w:szCs w:val="24"/>
-              </w:rPr>
-            </w:pPr>
-            <w:r>
-              <w:rPr>
-                <w:rFonts w:ascii="Arial" w:eastAsia="Arial" w:hAnsi="Arial" w:cs="Arial"/>
-                <w:sz w:val="24"/>
-                <w:szCs w:val="24"/>
-              </w:rPr>
-              <w:t>Abordar la adherencia con entrevista motivacional estructurada.</w:t>
-            </w:r>
-          </w:p>
-        </w:tc>
-        <w:tc>
-          <w:tcPr>
-            <w:tcW w:w="2351" w:type="dxa"/>
-          </w:tcPr>
-          <w:p>
-            <w:pPr>
-              <w:rPr>
-                <w:rFonts w:ascii="Arial" w:eastAsia="Arial" w:hAnsi="Arial" w:cs="Arial"/>
-                <w:sz w:val="24"/>
-                <w:szCs w:val="24"/>
-              </w:rPr>
-            </w:pPr>
-            <w:r>
-              <w:rPr>
-                <w:rFonts w:ascii="Arial" w:eastAsia="Arial" w:hAnsi="Arial" w:cs="Arial"/>
-                <w:sz w:val="24"/>
-                <w:szCs w:val="24"/>
-              </w:rPr>
-              <w:t>La mayoría de las</w:t>
-            </w:r>
-            <w:r>
-              <w:rPr>
-                <w:rFonts w:ascii="Arial" w:eastAsia="Arial" w:hAnsi="Arial" w:cs="Arial"/>
-                <w:sz w:val="24"/>
-                <w:szCs w:val="24"/>
-              </w:rPr>
-              <w:t xml:space="preserve"> derivaciones son por adherencia o desconocimiento del tratamiento, sin un abordaje definido.</w:t>
-            </w:r>
-          </w:p>
-        </w:tc>
-        <w:tc>
-          <w:tcPr>
-            <w:tcW w:w="2351" w:type="dxa"/>
-          </w:tcPr>
-          <w:p>
-            <w:pPr>
-              <w:rPr>
-                <w:rFonts w:ascii="Arial" w:eastAsia="Arial" w:hAnsi="Arial" w:cs="Arial"/>
-                <w:sz w:val="24"/>
-                <w:szCs w:val="24"/>
-              </w:rPr>
-            </w:pPr>
-            <w:r>
-              <w:rPr>
-                <w:rFonts w:ascii="Arial" w:eastAsia="Arial" w:hAnsi="Arial" w:cs="Arial"/>
-                <w:sz w:val="24"/>
-                <w:szCs w:val="24"/>
-              </w:rPr>
-              <w:t>La educación y el trabajo de barreras dependen de cada visita.</w:t>
-            </w:r>
-          </w:p>
-        </w:tc>
-      </w:tr>
-      <w:tr>
-        <w:trPr>
-          <w:jc w:val="center"/>
-        </w:trPr>
-        <w:tc>
-          <w:tcPr>
-            <w:tcW w:w="2351" w:type="dxa"/>
-          </w:tcPr>
-          <w:p>
-            <w:pPr>
-              <w:rPr>
-                <w:rFonts w:ascii="Arial" w:eastAsia="Arial" w:hAnsi="Arial" w:cs="Arial"/>
-                <w:sz w:val="24"/>
-                <w:szCs w:val="24"/>
-              </w:rPr>
-            </w:pPr>
-            <w:r>
-              <w:rPr>
-                <w:rFonts w:ascii="Arial" w:eastAsia="Arial" w:hAnsi="Arial" w:cs="Arial"/>
-                <w:sz w:val="24"/>
-                <w:szCs w:val="24"/>
-              </w:rPr>
-              <w:t>Oportunidad</w:t>
-            </w:r>
-          </w:p>
-        </w:tc>
-        <w:tc>
-          <w:tcPr>
-            <w:tcW w:w="2351" w:type="dxa"/>
-          </w:tcPr>
-          <w:p>
-            <w:pPr>
-              <w:rPr>
-                <w:rFonts w:ascii="Arial" w:eastAsia="Arial" w:hAnsi="Arial" w:cs="Arial"/>
-                <w:sz w:val="24"/>
-                <w:szCs w:val="24"/>
-              </w:rPr>
-            </w:pPr>
-            <w:r>
-              <w:rPr>
-                <w:rFonts w:ascii="Arial" w:eastAsia="Arial" w:hAnsi="Arial" w:cs="Arial"/>
-                <w:sz w:val="24"/>
-                <w:szCs w:val="24"/>
-              </w:rPr>
-              <w:t>Registro estructurado y continuidad del seguimiento.</w:t>
-            </w:r>
-          </w:p>
-        </w:tc>
-        <w:tc>
-          <w:tcPr>
-            <w:tcW w:w="2351" w:type="dxa"/>
-          </w:tcPr>
-          <w:p>
-            <w:pPr>
-              <w:rPr>
-                <w:rFonts w:ascii="Arial" w:eastAsia="Arial" w:hAnsi="Arial" w:cs="Arial"/>
-                <w:sz w:val="24"/>
-                <w:szCs w:val="24"/>
-              </w:rPr>
-            </w:pPr>
-            <w:r>
-              <w:rPr>
-                <w:rFonts w:ascii="Arial" w:eastAsia="Arial" w:hAnsi="Arial" w:cs="Arial"/>
-                <w:sz w:val="24"/>
-                <w:szCs w:val="24"/>
-              </w:rPr>
-              <w:t>Registro en la ficha clínica electrónica (SINET Sur); frecuencia de visitas según disponibilidad.</w:t>
-            </w:r>
-            <w:r>
-              <w:rPr>
-                <w:rStyle w:val="Refdecomentario"/>
-                <w:rFonts w:ascii="Arial" w:eastAsia="Arial" w:hAnsi="Arial" w:cs="Arial"/>
-                <w:sz w:val="24"/>
-                <w:szCs w:val="24"/>
-              </w:rPr>
-            </w:r>
-          </w:p>
-        </w:tc>
-        <w:tc>
-          <w:tcPr>
-            <w:tcW w:w="2351" w:type="dxa"/>
-          </w:tcPr>
-          <w:p>
-            <w:pPr>
-              <w:rPr>
-                <w:rFonts w:ascii="Arial" w:eastAsia="Arial" w:hAnsi="Arial" w:cs="Arial"/>
-                <w:sz w:val="24"/>
-                <w:szCs w:val="24"/>
-              </w:rPr>
-            </w:pPr>
-            <w:r>
-              <w:rPr>
-                <w:rFonts w:ascii="Arial" w:eastAsia="Arial" w:hAnsi="Arial" w:cs="Arial"/>
-                <w:sz w:val="24"/>
-                <w:szCs w:val="24"/>
-              </w:rPr>
-              <w:t xml:space="preserve">Falta un registro propio de la </w:t>
-            </w:r>
-            <w:r>
-              <w:rPr>
-                <w:rFonts w:ascii="Arial" w:eastAsia="Arial" w:hAnsi="Arial" w:cs="Arial"/>
-                <w:sz w:val="24"/>
-                <w:szCs w:val="24"/>
-              </w:rPr>
-              <w:t>Atención Farmacéutica</w:t>
-            </w:r>
-            <w:r>
-              <w:rPr>
-                <w:rFonts w:ascii="Arial" w:eastAsia="Arial" w:hAnsi="Arial" w:cs="Arial"/>
-                <w:sz w:val="24"/>
-                <w:szCs w:val="24"/>
-              </w:rPr>
-              <w:t xml:space="preserve"> y una pauta común de seguimiento.</w:t>
-            </w:r>
-          </w:p>
-        </w:tc>
-      </w:tr>
-    </w:tbl>
-    <w:p>
-      <w:pPr>
-        <w:pStyle w:val="Ttulo1"/>
-      </w:pPr>
       <w:bookmarkStart w:id="51" w:name="_Toc234430367"/>
       <w:bookmarkStart w:id="52" w:name="_Toc234959477"/>
       <w:r>
@@ -5389,11 +4939,7 @@
         <w:jc w:val="both"/>
       </w:pPr>
       <w:r>
-        <w:rPr>
-          <w:rFonts w:ascii="Arial" w:eastAsia="Arial" w:hAnsi="Arial"/>
-          <w:sz w:val="24"/>
-        </w:rPr>
-        <w:t>Batalla, J., Blanquer, A., Ciurana, R., García, M., Margalef, I., &amp; Pérez, A. (1984). Cumplimiento de la prescripción farmacológica en pacientes hipertensos. Medicina Clínica, 82(2), 56-59.</w:t>
+        <w:t>Abegaz, T. M., Shehab, A., Gebreyohannes, E. A., Bhagavathula, A. S., &amp; Elnour, A. A. (2017). Nonadherence to antihypertensive drugs: A systematic review and meta-analysis. Medicine, 96(4), e5641.</w:t>
       </w:r>
     </w:p>
     <w:p>
@@ -5403,33 +4949,7 @@
         <w:jc w:val="both"/>
       </w:pPr>
       <w:r>
-        <w:rPr>
-          <w:rFonts w:ascii="Arial" w:eastAsia="Arial" w:hAnsi="Arial"/>
-          <w:sz w:val="24"/>
-          <w:lang w:val="en-US"/>
-        </w:rPr>
-        <w:t xml:space="preserve">Bonal, J., Alerany, C., Bassons, T., &amp; Gascón, P. (2003). </w:t>
-      </w:r>
-      <w:r>
-        <w:rPr>
-          <w:rFonts w:ascii="Arial" w:eastAsia="Arial" w:hAnsi="Arial"/>
-          <w:sz w:val="24"/>
-        </w:rPr>
-        <w:t xml:space="preserve">Farmacia clínica y </w:t>
-      </w:r>
-      <w:r>
-        <w:rPr>
-          <w:rFonts w:ascii="Arial" w:eastAsia="Arial" w:hAnsi="Arial"/>
-          <w:sz w:val="24"/>
-        </w:rPr>
-        <w:t>Atención Farmacéutica</w:t>
-      </w:r>
-      <w:r>
-        <w:rPr>
-          <w:rFonts w:ascii="Arial" w:eastAsia="Arial" w:hAnsi="Arial"/>
-          <w:sz w:val="24"/>
-        </w:rPr>
-        <w:t>. Sociedad Española de Farmacia Hospitalaria.</w:t>
+        <w:t>Allemann, S. S., van Mil, J. W. F., Botermann, L., Berger, K., Griese, N., &amp; Hersberger, K. E. (2014). Pharmaceutical care: The PCNE definition 2013. International Journal of Clinical Pharmacy, 36(3), 544-555.</w:t>
       </w:r>
     </w:p>
     <w:p>
@@ -5443,7 +4963,7 @@
           <w:rFonts w:ascii="Arial" w:eastAsia="Arial" w:hAnsi="Arial"/>
           <w:sz w:val="24"/>
         </w:rPr>
-        <w:t>Calleja Hernández, M. Á., &amp; Morillo Verdugo, R. (Eds.). (2016). El modelo CMO en consultas externas de farmacia hospitalaria. Sociedad Española de Farmacia Hospitalaria.</w:t>
+        <w:t>Batalla, J., Blanquer, A., Ciurana, R., García, M., Margalef, I., &amp; Pérez, A. (1984). Cumplimiento de la prescripción farmacológica en pacientes hipertensos. Medicina Clínica, 82(2), 56-59.</w:t>
       </w:r>
     </w:p>
     <w:p>
@@ -5453,11 +4973,7 @@
         <w:jc w:val="both"/>
       </w:pPr>
       <w:r>
-        <w:rPr>
-          <w:rFonts w:ascii="Arial" w:eastAsia="Arial" w:hAnsi="Arial"/>
-          <w:sz w:val="24"/>
-        </w:rPr>
-        <w:t>Comité de Consenso de Granada. (2007). Tercer Consenso de Granada sobre problemas relacionados con medicamentos (PRM) y resultados negativos asociados a la medicación (RNM). Ars Pharmaceutica, 48(1), 5-17.</w:t>
+        <w:t>Beyhaghi, H., Reeve, B. B., Rodgers, J. E., &amp; Stearns, S. C. (2016). Psychometric properties of the four-item Morisky-Green-Levine Medication Adherence Scale among ARIC study participants. Value in Health, 19(8), 996-1001.</w:t>
       </w:r>
     </w:p>
     <w:p>
@@ -5470,8 +4986,30 @@
         <w:rPr>
           <w:rFonts w:ascii="Arial" w:eastAsia="Arial" w:hAnsi="Arial"/>
           <w:sz w:val="24"/>
-        </w:rPr>
-        <w:t>COSADES. (s.f.). Historia y desarrollo institucional del CESFAM Villa Nonguén. Corporación de Salud y Desarrollo Social. https://www.cosades.cl</w:t>
+          <w:lang w:val="en-US"/>
+        </w:rPr>
+        <w:t xml:space="preserve">Bonal, J., Alerany, C., Bassons, T., &amp; Gascón, P. (2003). </w:t>
+      </w:r>
+      <w:r>
+        <w:rPr>
+          <w:rFonts w:ascii="Arial" w:eastAsia="Arial" w:hAnsi="Arial"/>
+          <w:sz w:val="24"/>
+        </w:rPr>
+        <w:t xml:space="preserve">Farmacia clínica y </w:t>
+      </w:r>
+      <w:r>
+        <w:rPr>
+          <w:rFonts w:ascii="Arial" w:eastAsia="Arial" w:hAnsi="Arial"/>
+          <w:sz w:val="24"/>
+        </w:rPr>
+        <w:t>Atención Farmacéutica</w:t>
+      </w:r>
+      <w:r>
+        <w:rPr>
+          <w:rFonts w:ascii="Arial" w:eastAsia="Arial" w:hAnsi="Arial"/>
+          <w:sz w:val="24"/>
+        </w:rPr>
+        <w:t>. Sociedad Española de Farmacia Hospitalaria.</w:t>
       </w:r>
     </w:p>
     <w:p>
@@ -5485,7 +5023,7 @@
           <w:rFonts w:ascii="Arial" w:eastAsia="Arial" w:hAnsi="Arial"/>
           <w:sz w:val="24"/>
         </w:rPr>
-        <w:t>Delgado, O., Anoz, L., Serrano, A., &amp; Nicolás, J. (2007). Conciliación farmacoterapéutica como garantía de continuidad asistencial. Sociedad Española de Farmacia Hospitalaria.</w:t>
+        <w:t>Calleja Hernández, M. Á., &amp; Morillo Verdugo, R. (Eds.). (2016). El modelo CMO en consultas externas de farmacia hospitalaria. Sociedad Española de Farmacia Hospitalaria.</w:t>
       </w:r>
     </w:p>
     <w:p>
@@ -5499,14 +5037,7 @@
           <w:rFonts w:ascii="Arial" w:eastAsia="Arial" w:hAnsi="Arial"/>
           <w:sz w:val="24"/>
         </w:rPr>
-        <w:t xml:space="preserve">Diario Concepción. (2017). La historia del Cesfam que rompió paradigmas de la salud </w:t>
-      </w:r>
-      <w:r>
-        <w:rPr>
-          <w:rFonts w:ascii="Arial" w:eastAsia="Arial" w:hAnsi="Arial"/>
-          <w:sz w:val="24"/>
-        </w:rPr>
-        <w:t>pública. https://www.diarioconcepcion.cl/ciudad/2017/03/11/la-historia-del-cesfam-que-rompio-paradigmas-de-la-salud-publica-2.html</w:t>
+        <w:t>Comité de Consenso de Granada. (2007). Tercer Consenso de Granada sobre problemas relacionados con medicamentos (PRM) y resultados negativos asociados a la medicación (RNM). Ars Pharmaceutica, 48(1), 5-17.</w:t>
       </w:r>
     </w:p>
     <w:p>
@@ -5520,21 +5051,7 @@
           <w:rFonts w:ascii="Arial" w:eastAsia="Arial" w:hAnsi="Arial"/>
           <w:sz w:val="24"/>
         </w:rPr>
-        <w:t xml:space="preserve">Faúndez Navarrete, P. A. (2020). Evaluación del programa de </w:t>
-      </w:r>
-      <w:r>
-        <w:rPr>
-          <w:rFonts w:ascii="Arial" w:eastAsia="Arial" w:hAnsi="Arial"/>
-          <w:sz w:val="24"/>
-        </w:rPr>
-        <w:t>Atención Farmacéutica</w:t>
-      </w:r>
-      <w:r>
-        <w:rPr>
-          <w:rFonts w:ascii="Arial" w:eastAsia="Arial" w:hAnsi="Arial"/>
-          <w:sz w:val="24"/>
-        </w:rPr>
-        <w:t xml:space="preserve"> del CESFAM Villa Nonguén [Memoria de título, Universidad de Concepción].</w:t>
+        <w:t>COSADES. (s.f.). Historia y desarrollo institucional del CESFAM Villa Nonguén. Corporación de Salud y Desarrollo Social. https://www.cosades.cl</w:t>
       </w:r>
     </w:p>
     <w:p>
@@ -5542,17 +5059,9 @@
         <w:spacing w:after="120" w:line="360" w:lineRule="auto"/>
         <w:ind w:left="720" w:hanging="720"/>
         <w:jc w:val="both"/>
-        <w:rPr>
-          <w:lang w:val="en-US"/>
-        </w:rPr>
-      </w:pPr>
-      <w:r>
-        <w:rPr>
-          <w:rFonts w:ascii="Arial" w:eastAsia="Arial" w:hAnsi="Arial"/>
-          <w:sz w:val="24"/>
-          <w:lang w:val="en-US"/>
-        </w:rPr>
-        <w:t>Forrey, R. A., Pedersen, C. A., &amp; Schneider, P. J. (2007). Interrater agreement with a standard scheme for classifying medication errors. American Journal of Health-System Pharmacy, 64(2), 175-181.</w:t>
+      </w:pPr>
+      <w:r>
+        <w:t>Cutler, D. M., &amp; Everett, W. (2010). Thinking outside the pillbox: Medication adherence as a priority for health care reform. New England Journal of Medicine, 362(17), 1553-1555.</w:t>
       </w:r>
     </w:p>
     <w:p>
@@ -5560,17 +5069,13 @@
         <w:spacing w:after="120" w:line="360" w:lineRule="auto"/>
         <w:ind w:left="720" w:hanging="720"/>
         <w:jc w:val="both"/>
-        <w:rPr>
-          <w:lang w:val="en-US"/>
-        </w:rPr>
-      </w:pPr>
-      <w:r>
-        <w:rPr>
-          <w:rFonts w:ascii="Arial" w:eastAsia="Arial" w:hAnsi="Arial"/>
-          <w:sz w:val="24"/>
-          <w:lang w:val="en-US"/>
-        </w:rPr>
-        <w:t>Haynes, R. B., Taylor, D. W., &amp; Sackett, D. L. (1979). Compliance in health care. Johns Hopkins University Press.</w:t>
+      </w:pPr>
+      <w:r>
+        <w:rPr>
+          <w:rFonts w:ascii="Arial" w:eastAsia="Arial" w:hAnsi="Arial"/>
+          <w:sz w:val="24"/>
+        </w:rPr>
+        <w:t>Delgado, O., Anoz, L., Serrano, A., &amp; Nicolás, J. (2007). Conciliación farmacoterapéutica como garantía de continuidad asistencial. Sociedad Española de Farmacia Hospitalaria.</w:t>
       </w:r>
     </w:p>
     <w:p>
@@ -5584,6 +5089,101 @@
           <w:rFonts w:ascii="Arial" w:eastAsia="Arial" w:hAnsi="Arial"/>
           <w:sz w:val="24"/>
         </w:rPr>
+        <w:t xml:space="preserve">Diario Concepción. (2017). La historia del Cesfam que rompió paradigmas de la salud </w:t>
+      </w:r>
+      <w:r>
+        <w:rPr>
+          <w:rFonts w:ascii="Arial" w:eastAsia="Arial" w:hAnsi="Arial"/>
+          <w:sz w:val="24"/>
+        </w:rPr>
+        <w:t>pública. https://www.diarioconcepcion.cl/ciudad/2017/03/11/la-historia-del-cesfam-que-rompio-paradigmas-de-la-salud-publica-2.html</w:t>
+      </w:r>
+    </w:p>
+    <w:p>
+      <w:pPr>
+        <w:spacing w:after="120" w:line="360" w:lineRule="auto"/>
+        <w:ind w:left="720" w:hanging="720"/>
+        <w:jc w:val="both"/>
+      </w:pPr>
+      <w:r>
+        <w:rPr>
+          <w:rFonts w:ascii="Arial" w:eastAsia="Arial" w:hAnsi="Arial"/>
+          <w:sz w:val="24"/>
+        </w:rPr>
+        <w:t xml:space="preserve">Faúndez Navarrete, P. A. (2020). Evaluación del programa de </w:t>
+      </w:r>
+      <w:r>
+        <w:rPr>
+          <w:rFonts w:ascii="Arial" w:eastAsia="Arial" w:hAnsi="Arial"/>
+          <w:sz w:val="24"/>
+        </w:rPr>
+        <w:t>Atención Farmacéutica</w:t>
+      </w:r>
+      <w:r>
+        <w:rPr>
+          <w:rFonts w:ascii="Arial" w:eastAsia="Arial" w:hAnsi="Arial"/>
+          <w:sz w:val="24"/>
+        </w:rPr>
+        <w:t xml:space="preserve"> del CESFAM Villa Nonguén [Memoria de título, Universidad de Concepción].</w:t>
+      </w:r>
+    </w:p>
+    <w:p>
+      <w:pPr>
+        <w:spacing w:after="120" w:line="360" w:lineRule="auto"/>
+        <w:ind w:left="720" w:hanging="720"/>
+        <w:jc w:val="both"/>
+      </w:pPr>
+      <w:r>
+        <w:t>Faus Dáder, M. (2018). 20 años del Dáder. Ars Pharmaceutica, 59(2), 4-5.</w:t>
+      </w:r>
+    </w:p>
+    <w:p>
+      <w:pPr>
+        <w:spacing w:after="120" w:line="360" w:lineRule="auto"/>
+        <w:ind w:left="720" w:hanging="720"/>
+        <w:jc w:val="both"/>
+        <w:rPr>
+          <w:lang w:val="en-US"/>
+        </w:rPr>
+      </w:pPr>
+      <w:r>
+        <w:rPr>
+          <w:rFonts w:ascii="Arial" w:eastAsia="Arial" w:hAnsi="Arial"/>
+          <w:sz w:val="24"/>
+          <w:lang w:val="en-US"/>
+        </w:rPr>
+        <w:t>Forrey, R. A., Pedersen, C. A., &amp; Schneider, P. J. (2007). Interrater agreement with a standard scheme for classifying medication errors. American Journal of Health-System Pharmacy, 64(2), 175-181.</w:t>
+      </w:r>
+    </w:p>
+    <w:p>
+      <w:pPr>
+        <w:spacing w:after="120" w:line="360" w:lineRule="auto"/>
+        <w:ind w:left="720" w:hanging="720"/>
+        <w:jc w:val="both"/>
+        <w:rPr>
+          <w:lang w:val="en-US"/>
+        </w:rPr>
+      </w:pPr>
+      <w:r>
+        <w:rPr>
+          <w:rFonts w:ascii="Arial" w:eastAsia="Arial" w:hAnsi="Arial"/>
+          <w:sz w:val="24"/>
+          <w:lang w:val="en-US"/>
+        </w:rPr>
+        <w:t>Haynes, R. B., Taylor, D. W., &amp; Sackett, D. L. (1979). Compliance in health care. Johns Hopkins University Press.</w:t>
+      </w:r>
+    </w:p>
+    <w:p>
+      <w:pPr>
+        <w:spacing w:after="120" w:line="360" w:lineRule="auto"/>
+        <w:ind w:left="720" w:hanging="720"/>
+        <w:jc w:val="both"/>
+      </w:pPr>
+      <w:r>
+        <w:rPr>
+          <w:rFonts w:ascii="Arial" w:eastAsia="Arial" w:hAnsi="Arial"/>
+          <w:sz w:val="24"/>
+        </w:rPr>
         <w:lastRenderedPageBreak/>
         <w:t xml:space="preserve">Juárez Giménez, J. C., &amp; Morillo Verdugo, R. (Eds.). (2026). Adaptación del modelo de </w:t>
       </w:r>
@@ -5600,6 +5200,26 @@
           <w:sz w:val="24"/>
         </w:rPr>
         <w:t xml:space="preserve"> CMO al paciente con coagulopatías congénitas. Sociedad Española de Farmacia Hospitalaria.</w:t>
+      </w:r>
+    </w:p>
+    <w:p>
+      <w:pPr>
+        <w:spacing w:after="120" w:line="360" w:lineRule="auto"/>
+        <w:ind w:left="720" w:hanging="720"/>
+        <w:jc w:val="both"/>
+      </w:pPr>
+      <w:r>
+        <w:t>Kolandaivelu, K., Leiden, B. B., O'Gara, P. T., &amp; Bhatt, D. L. (2014). Nonadherence to cardiovascular medications. European Heart Journal, 35(46), 3267-3276.</w:t>
+      </w:r>
+    </w:p>
+    <w:p>
+      <w:pPr>
+        <w:spacing w:after="120" w:line="360" w:lineRule="auto"/>
+        <w:ind w:left="720" w:hanging="720"/>
+        <w:jc w:val="both"/>
+      </w:pPr>
+      <w:r>
+        <w:t>Maher, R. L., Hanlon, J., &amp; Hajjar, E. R. (2014). Clinical consequences of polypharmacy in elderly. Expert Opinion on Drug Safety, 13(1), 57-65.</w:t>
       </w:r>
     </w:p>
     <w:p>

</xml_diff>

<commit_message>
2.2: desarrolla la metodologia del Objetivo 1 (como se identifican las brechas)
- Reescribe el 2.2 como metodologia con tres parrafos: enfoque de comparacion
  (practica real vs normativa y Modelo CMO), fuentes y forma de obtener la
  informacion (observacion directa, revision de documentos/registros y ficha
  clinica, conversaciones con el equipo y evaluacion previa), y el marco de
  analisis por pilares del CMO (Tabla 1). Sin resultados.
- Marca el apartado como (Objetivo 1). Mantiene la redaccion del autor.
</commit_message>
<xml_diff>
--- a/Tesis AVANCE 1 - Rev DJP.docx
+++ b/Tesis AVANCE 1 - Rev DJP.docx
@@ -4042,37 +4042,10 @@
       </w:pPr>
       <w:bookmarkStart w:id="34" w:name="_Toc234959473"/>
       <w:bookmarkStart w:id="35" w:name="_Toc234430363"/>
-      <w:r>
-        <w:t>2.</w:t>
-      </w:r>
-      <w:r>
-        <w:t>2 Diagnóstico de las brechas del programa</w:t>
-      </w:r>
       <w:bookmarkEnd w:id="34"/>
-      <w:r>
-        <w:t xml:space="preserve"> </w:t>
-      </w:r>
       <w:bookmarkEnd w:id="35"/>
       <w:r>
-        <w:rPr>
-          <w:rStyle w:val="Refdecomentario"/>
-          <w:sz w:val="24"/>
-          <w:szCs w:val="26"/>
-        </w:rPr>
-      </w:r>
-      <w:r>
-        <w:rPr>
-          <w:rStyle w:val="Refdecomentario"/>
-          <w:sz w:val="24"/>
-          <w:szCs w:val="26"/>
-        </w:rPr>
-      </w:r>
-      <w:r>
-        <w:rPr>
-          <w:rStyle w:val="Refdecomentario"/>
-          <w:sz w:val="24"/>
-          <w:szCs w:val="26"/>
-        </w:rPr>
+        <w:t>2.2 Diagnóstico de las brechas del programa (Objetivo 1)</w:t>
       </w:r>
     </w:p>
     <w:p>
@@ -4081,7 +4054,25 @@
         <w:jc w:val="both"/>
       </w:pPr>
       <w:r>
-        <w:t>Se describió cómo se realizaba la visita domiciliaria en el CESFAM al inicio del internado y se comparó esa práctica con lo que plantean la Orientación Técnica del Programa de Salud Cardiovascular y del Fondo de Farmacia (Ministerio de Salud de Chile, 2017b, 2018b, 2020), la Guía de Atención Farmacéutica y Seguimiento Farmacoterapéutico en APS (Ministerio de Salud de Chile, 2018a) y los tres pilares del Modelo CMO. La comparación se apoyó, además, en la evaluación previa del mismo programa (Faúndez Navarrete, 2020) y en la información entregada por el equipo de salud del centro. La Tabla 1 resume los aspectos evaluados en cada pilar del Modelo CMO y las referencias utilizadas para la comparación.</w:t>
+        <w:t>Para responder al primer objetivo, las brechas del programa se identificaron comparando el funcionamiento real de la visita domiciliaria en el CESFAM con lo que plantean la normativa vigente y el Modelo CMO. Durante el internado se observó de manera directa cómo se organizaba y ejecutaba la visita, desde la derivación del paciente hasta el registro de la atención, y esa práctica se contrastó con la Orientación Técnica del Programa de Salud Cardiovascular y del Fondo de Farmacia (Ministerio de Salud de Chile, 2017b, 2018b, 2020), con la Guía de Atención Farmacéutica y Seguimiento Farmacoterapéutico en APS (Ministerio de Salud de Chile, 2018a) y con los tres pilares del Modelo CMO.</w:t>
+      </w:r>
+    </w:p>
+    <w:p>
+      <w:pPr>
+        <w:spacing w:after="120" w:line="360" w:lineRule="auto"/>
+        <w:jc w:val="both"/>
+      </w:pPr>
+      <w:r>
+        <w:t>La información se obtuvo de tres fuentes que se complementaron entre sí. La primera fue la observación directa del trabajo del Químico Farmacéutico durante los cuatro meses del internado, tanto en las visitas domiciliarias como en el box y en la farmacia. La segunda fue la revisión de los documentos y registros con que trabaja el equipo, como las hojas de apoyo que se utilizan en la visita, la ficha clínica electrónica del establecimiento (SINET Sur) y el flujo de derivaciones al programa. La tercera fueron las conversaciones con los profesionales del equipo de salud y la evaluación previa del mismo programa (Faúndez Navarrete, 2020), que entregó antecedentes sobre su funcionamiento.</w:t>
+      </w:r>
+    </w:p>
+    <w:p>
+      <w:pPr>
+        <w:spacing w:after="120" w:line="360" w:lineRule="auto"/>
+        <w:jc w:val="both"/>
+      </w:pPr>
+      <w:r>
+        <w:t>El análisis se ordenó según los tres pilares del Modelo CMO. Para cada pilar se definió qué aspecto del programa se evaluaría y con qué referencia se compararía, de modo de reconocer en qué puntos la práctica actual se aleja de lo esperado. La Tabla 1 resume estos aspectos y las referencias utilizadas para la comparación, y sirvió de guía para identificar las brechas que el protocolo busca cerrar.</w:t>
       </w:r>
     </w:p>
     <w:p>

</xml_diff>